<commit_message>
docs(barrier): how a rating is derived; regenerate report
Adds a "How a rating is derived" section, switches the report command to
export + script, drops the fixed copy-pasted-URL note, regenerates the
sources appendix from the registry, and rebuilds the Word report. The
report script now computes its source counts and shows manual reasons.

Co-Authored-By: Claude Opus 5.5 <noreply@anthropic.com>
Claude-Session: https://claude.ai/code/session_011c64i8dJvK17G4EiSpMNHy
</commit_message>
<xml_diff>
--- a/docs/transition_barrier/Transition_Barrier_Assessment_Report.docx
+++ b/docs/transition_barrier/Transition_Barrier_Assessment_Report.docx
@@ -116,7 +116,7 @@
           <w:sz w:val="20"/>
           <w:szCs w:val="20"/>
         </w:rPr>
-        <w:t xml:space="preserve">86 verified sources</w:t>
+        <w:t xml:space="preserve">89 verified sources</w:t>
       </w:r>
     </w:p>
     <w:p>
@@ -1928,7 +1928,7 @@
                 <w:sz w:val="17"/>
                 <w:szCs w:val="17"/>
               </w:rPr>
-              <w:t xml:space="preserve">Renewable LCOE at or below new-build fossil LCOE without subsidy</w:t>
+              <w:t xml:space="preserve">Renewable LCOE &lt;= New-build fossil LCOE</w:t>
             </w:r>
           </w:p>
         </w:tc>
@@ -1953,7 +1953,7 @@
                 <w:sz w:val="17"/>
                 <w:szCs w:val="17"/>
               </w:rPr>
-              <w:t xml:space="preserve">Renewable LCOE within 10-30% of new-build fossil LCOE, or below only with subsidy</w:t>
+              <w:t xml:space="preserve">Renewable-to-fossil LCOE ratio &lt;= 1.3 or Subsidised renewable LCOE &lt;= New-build fossil LCOE</w:t>
             </w:r>
           </w:p>
         </w:tc>
@@ -1978,7 +1978,7 @@
                 <w:sz w:val="17"/>
                 <w:szCs w:val="17"/>
               </w:rPr>
-              <w:t xml:space="preserve">Renewable LCOE more than 30% above new-build fossil LCOE</w:t>
+              <w:t xml:space="preserve">Otherwise (neither H nor M holds)</w:t>
             </w:r>
           </w:p>
         </w:tc>
@@ -2119,7 +2119,7 @@
                 <w:sz w:val="17"/>
                 <w:szCs w:val="17"/>
               </w:rPr>
-              <w:t xml:space="preserve">Storage-to-renewables ratio and grid flexibility sufficient to avoid material curtailment (region-specific benchmark, informed by IEA grid integration studies)</w:t>
+              <w:t xml:space="preserve">Wind and solar curtailment rate &lt;= 5% and Storage share of variable renewable capacity &gt;= [open: Non-negligible storage share]</w:t>
             </w:r>
           </w:p>
         </w:tc>
@@ -2144,7 +2144,7 @@
                 <w:sz w:val="17"/>
                 <w:szCs w:val="17"/>
               </w:rPr>
-              <w:t xml:space="preserve">Storage deployment underway but curtailment or grid congestion already material</w:t>
+              <w:t xml:space="preserve">Storage share of variable renewable capacity &gt;= [open: Non-negligible storage share]</w:t>
             </w:r>
           </w:p>
         </w:tc>
@@ -2169,7 +2169,7 @@
                 <w:sz w:val="17"/>
                 <w:szCs w:val="17"/>
               </w:rPr>
-              <w:t xml:space="preserve">Storage capacity negligible relative to variable renewable penetration</w:t>
+              <w:t xml:space="preserve">Otherwise (neither H nor M holds)</w:t>
             </w:r>
           </w:p>
         </w:tc>
@@ -2310,7 +2310,7 @@
                 <w:sz w:val="17"/>
                 <w:szCs w:val="17"/>
               </w:rPr>
-              <w:t xml:space="preserve">Effective carbon price exceeds USD 60/tCO2 or binding 100% clean generation mandate with penalty</w:t>
+              <w:t xml:space="preserve">(Effective carbon price on power &gt; 60 USD/tCO2 and Carbon price coverage = region_wide) or Clean generation mandate = binding_100pct_with_penalty</w:t>
             </w:r>
           </w:p>
         </w:tc>
@@ -2335,7 +2335,7 @@
                 <w:sz w:val="17"/>
                 <w:szCs w:val="17"/>
               </w:rPr>
-              <w:t xml:space="preserve">Effective carbon price USD 15-60/tCO2, or clean generation target without binding penalty</w:t>
+              <w:t xml:space="preserve">Effective carbon price on power &gt;= 15 USD/tCO2 or Clean generation mandate = other_target</w:t>
             </w:r>
           </w:p>
         </w:tc>
@@ -2360,7 +2360,7 @@
                 <w:sz w:val="17"/>
                 <w:szCs w:val="17"/>
               </w:rPr>
-              <w:t xml:space="preserve">No material carbon price or clean generation mandate</w:t>
+              <w:t xml:space="preserve">Otherwise (neither H nor M holds)</w:t>
             </w:r>
           </w:p>
         </w:tc>
@@ -2501,7 +2501,7 @@
                 <w:sz w:val="17"/>
                 <w:szCs w:val="17"/>
               </w:rPr>
-              <w:t xml:space="preserve">Legally binding target with permitting reform reducing connection queue below 3 years</w:t>
+              <w:t xml:space="preserve">Renewable target status = binding and Grid connection time &lt; 3 years</w:t>
             </w:r>
           </w:p>
         </w:tc>
@@ -2526,7 +2526,7 @@
                 <w:sz w:val="17"/>
                 <w:szCs w:val="17"/>
               </w:rPr>
-              <w:t xml:space="preserve">Target exists (binding or aspirational) but connection queue exceeds 3 years</w:t>
+              <w:t xml:space="preserve">Renewable target status in binding, aspirational_or_sub_regional and Grid connection time &lt;= 7 years</w:t>
             </w:r>
           </w:p>
         </w:tc>
@@ -2551,7 +2551,7 @@
                 <w:sz w:val="17"/>
                 <w:szCs w:val="17"/>
               </w:rPr>
-              <w:t xml:space="preserve">No binding target, or connection queue exceeds 7 years</w:t>
+              <w:t xml:space="preserve">Otherwise (neither H nor M holds)</w:t>
             </w:r>
           </w:p>
         </w:tc>
@@ -2692,7 +2692,7 @@
                 <w:sz w:val="17"/>
                 <w:szCs w:val="17"/>
               </w:rPr>
-              <w:t xml:space="preserve">PPA market established and growing; multi-year forward contracting standard practice</w:t>
+              <w:t xml:space="preserve">PPA volume as share of additions &gt;= [open: PPA share of an established market] and PPA volume signed &gt;= PPA volume signed, prior year</w:t>
             </w:r>
           </w:p>
         </w:tc>
@@ -2717,7 +2717,7 @@
                 <w:sz w:val="17"/>
                 <w:szCs w:val="17"/>
               </w:rPr>
-              <w:t xml:space="preserve">PPA market exists but thin or concentrated in few counterparties</w:t>
+              <w:t xml:space="preserve">PPA volume as share of additions &gt;= [open: PPA share above negligible]</w:t>
             </w:r>
           </w:p>
         </w:tc>
@@ -2742,7 +2742,7 @@
                 <w:sz w:val="17"/>
                 <w:szCs w:val="17"/>
               </w:rPr>
-              <w:t xml:space="preserve">PPA market negligible; renewable generation sold predominantly on spot/merchant basis</w:t>
+              <w:t xml:space="preserve">Otherwise (neither H nor M holds)</w:t>
             </w:r>
           </w:p>
         </w:tc>
@@ -3120,7 +3120,7 @@
                 <w:sz w:val="17"/>
                 <w:szCs w:val="17"/>
               </w:rPr>
-              <w:t xml:space="preserve">Green hydrogen cost at or below breakeven (typically cited ~USD 1.5-2.0/kg range, region-specific)</w:t>
+              <w:t xml:space="preserve">Renewable hydrogen supply present is Yes and Renewable hydrogen cost &lt;= DRI-H2 breakeven hydrogen cost</w:t>
             </w:r>
           </w:p>
         </w:tc>
@@ -3145,7 +3145,7 @@
                 <w:sz w:val="17"/>
                 <w:szCs w:val="17"/>
               </w:rPr>
-              <w:t xml:space="preserve">Green hydrogen cost within 2x of breakeven</w:t>
+              <w:t xml:space="preserve">Renewable hydrogen supply present is Yes and Hydrogen cost to breakeven &lt;= 2</w:t>
             </w:r>
           </w:p>
         </w:tc>
@@ -3170,7 +3170,7 @@
                 <w:sz w:val="17"/>
                 <w:szCs w:val="17"/>
               </w:rPr>
-              <w:t xml:space="preserve">Green hydrogen cost more than 2x breakeven, or no green hydrogen supply chain present</w:t>
+              <w:t xml:space="preserve">Otherwise (neither H nor M holds)</w:t>
             </w:r>
           </w:p>
         </w:tc>
@@ -3311,7 +3311,7 @@
                 <w:sz w:val="17"/>
                 <w:szCs w:val="17"/>
               </w:rPr>
-              <w:t xml:space="preserve">Scrap availability exceeds 50% of production capacity, supporting EAF as viable low-carbon route without new technology</w:t>
+              <w:t xml:space="preserve">Scrap availability as share of capacity &gt; 50%</w:t>
             </w:r>
           </w:p>
         </w:tc>
@@ -3336,7 +3336,7 @@
                 <w:sz w:val="17"/>
                 <w:szCs w:val="17"/>
               </w:rPr>
-              <w:t xml:space="preserve">Scrap availability 25-50% of production capacity</w:t>
+              <w:t xml:space="preserve">Scrap availability as share of capacity &gt;= 25%</w:t>
             </w:r>
           </w:p>
         </w:tc>
@@ -3361,7 +3361,7 @@
                 <w:sz w:val="17"/>
                 <w:szCs w:val="17"/>
               </w:rPr>
-              <w:t xml:space="preserve">Scrap availability below 25% of production capacity</w:t>
+              <w:t xml:space="preserve">Otherwise (neither H nor M holds)</w:t>
             </w:r>
           </w:p>
         </w:tc>
@@ -3502,7 +3502,7 @@
                 <w:sz w:val="17"/>
                 <w:szCs w:val="17"/>
               </w:rPr>
-              <w:t xml:space="preserve">Effective carbon price (net of free allocation) exceeds USD 50/tCO2 with border levy protecting domestic producers from unpriced imports</w:t>
+              <w:t xml:space="preserve">Carbon price applies to steel is Yes and Carbon price on steel &gt; 50 USD/tCO2 and Border carbon levy in force is Yes and Free allocation phase-out legislated is Yes</w:t>
             </w:r>
           </w:p>
         </w:tc>
@@ -3527,7 +3527,7 @@
                 <w:sz w:val="17"/>
                 <w:szCs w:val="17"/>
               </w:rPr>
-              <w:t xml:space="preserve">Carbon price applies but free allocation still material, or no border levy protecting against unpriced competition</w:t>
+              <w:t xml:space="preserve">Carbon price applies to steel is Yes and Carbon price on steel &gt;= 33.92 USD/tCO2</w:t>
             </w:r>
           </w:p>
         </w:tc>
@@ -3552,7 +3552,7 @@
                 <w:sz w:val="17"/>
                 <w:szCs w:val="17"/>
               </w:rPr>
-              <w:t xml:space="preserve">No material carbon price on steel production</w:t>
+              <w:t xml:space="preserve">Otherwise (neither H nor M holds)</w:t>
             </w:r>
           </w:p>
         </w:tc>
@@ -3693,7 +3693,7 @@
                 <w:sz w:val="17"/>
                 <w:szCs w:val="17"/>
               </w:rPr>
-              <w:t xml:space="preserve">Binding mandate in force covering material share of public procurement or construction</w:t>
+              <w:t xml:space="preserve">Low-carbon steel procurement rule = binding and Share of steel demand covered &gt;= [open: Material share of construction demand]</w:t>
             </w:r>
           </w:p>
         </w:tc>
@@ -3718,7 +3718,7 @@
                 <w:sz w:val="17"/>
                 <w:szCs w:val="17"/>
               </w:rPr>
-              <w:t xml:space="preserve">Voluntary standard or pilot mandate exists</w:t>
+              <w:t xml:space="preserve">Low-carbon steel procurement rule in binding, voluntary_or_pilot</w:t>
             </w:r>
           </w:p>
         </w:tc>
@@ -3743,7 +3743,7 @@
                 <w:sz w:val="17"/>
                 <w:szCs w:val="17"/>
               </w:rPr>
-              <w:t xml:space="preserve">No mandate or standard exists</w:t>
+              <w:t xml:space="preserve">Otherwise (neither H nor M holds)</w:t>
             </w:r>
           </w:p>
         </w:tc>
@@ -3884,7 +3884,7 @@
                 <w:sz w:val="17"/>
                 <w:szCs w:val="17"/>
               </w:rPr>
-              <w:t xml:space="preserve">Documented offtake contracts (e.g. automotive OEM commitments) cover a material share of announced low-carbon capacity at a disclosed premium</w:t>
+              <w:t xml:space="preserve">Green steel premium disclosed is Yes and Share of announced capacity under offtake &gt;= [open: Material offtake share]</w:t>
             </w:r>
           </w:p>
         </w:tc>
@@ -3909,7 +3909,7 @@
                 <w:sz w:val="17"/>
                 <w:szCs w:val="17"/>
               </w:rPr>
-              <w:t xml:space="preserve">Premium exists and some pilot offtake agreements signed, but limited volume</w:t>
+              <w:t xml:space="preserve">Green steel premium disclosed is Yes and Offtake agreements signed is Yes</w:t>
             </w:r>
           </w:p>
         </w:tc>
@@ -3934,7 +3934,7 @@
                 <w:sz w:val="17"/>
                 <w:szCs w:val="17"/>
               </w:rPr>
-              <w:t xml:space="preserve">No documented premium recovery mechanism; no material offtake contracts identified</w:t>
+              <w:t xml:space="preserve">Otherwise (neither H nor M holds)</w:t>
             </w:r>
           </w:p>
         </w:tc>
@@ -4312,7 +4312,7 @@
                 <w:sz w:val="17"/>
                 <w:szCs w:val="17"/>
               </w:rPr>
-              <w:t xml:space="preserve">At least one full-scale (&gt;0.3 Mtpa) operational facility in the region with a track record</w:t>
+              <w:t xml:space="preserve">Largest operating cement CCS plant &gt;= 0.4 Mtpa CO2 and Operating track record is Yes</w:t>
             </w:r>
           </w:p>
         </w:tc>
@@ -4337,7 +4337,7 @@
                 <w:sz w:val="17"/>
                 <w:szCs w:val="17"/>
               </w:rPr>
-              <w:t xml:space="preserve">Facility under construction or in final investment decision (FID) stage</w:t>
+              <w:t xml:space="preserve">Largest cement CCS plant at FID or in construction &gt;= 0.4 Mtpa CO2 or Largest operating cement CCS plant &gt;= 0.4 Mtpa CO2</w:t>
             </w:r>
           </w:p>
         </w:tc>
@@ -4362,7 +4362,7 @@
                 <w:sz w:val="17"/>
                 <w:szCs w:val="17"/>
               </w:rPr>
-              <w:t xml:space="preserve">No full-scale facility operational, under construction, or FID-approved in the region</w:t>
+              <w:t xml:space="preserve">Otherwise (neither H nor M holds)</w:t>
             </w:r>
           </w:p>
         </w:tc>
@@ -4503,7 +4503,7 @@
                 <w:sz w:val="17"/>
                 <w:szCs w:val="17"/>
               </w:rPr>
-              <w:t xml:space="preserve">Regional clinker ratio below 0.65 with active SCM substitution programmes</w:t>
+              <w:t xml:space="preserve">Clinker-to-cement ratio &lt; 0.65 t/t and Active SCM substitution programme is Yes</w:t>
             </w:r>
           </w:p>
         </w:tc>
@@ -4528,7 +4528,7 @@
                 <w:sz w:val="17"/>
                 <w:szCs w:val="17"/>
               </w:rPr>
-              <w:t xml:space="preserve">Clinker ratio 0.65-0.80</w:t>
+              <w:t xml:space="preserve">Clinker-to-cement ratio &lt;= 0.8 t/t</w:t>
             </w:r>
           </w:p>
         </w:tc>
@@ -4553,7 +4553,7 @@
                 <w:sz w:val="17"/>
                 <w:szCs w:val="17"/>
               </w:rPr>
-              <w:t xml:space="preserve">Clinker ratio above 0.80 with limited SCM availability</w:t>
+              <w:t xml:space="preserve">Otherwise (neither H nor M holds)</w:t>
             </w:r>
           </w:p>
         </w:tc>
@@ -4694,7 +4694,7 @@
                 <w:sz w:val="17"/>
                 <w:szCs w:val="17"/>
               </w:rPr>
-              <w:t xml:space="preserve">Effective net carbon price exceeds USD 50/tCO2 with border levy in force</w:t>
+              <w:t xml:space="preserve">Carbon price applies to cement is Yes and Carbon price on cement &gt; 50 USD/tCO2 and Border carbon levy in force is Yes and Free allocation phase-out legislated is Yes</w:t>
             </w:r>
           </w:p>
         </w:tc>
@@ -4719,7 +4719,7 @@
                 <w:sz w:val="17"/>
                 <w:szCs w:val="17"/>
               </w:rPr>
-              <w:t xml:space="preserve">Carbon price applies but free allocation still material or no border levy</w:t>
+              <w:t xml:space="preserve">Carbon price applies to cement is Yes and Carbon price on cement &gt;= 33.92 USD/tCO2</w:t>
             </w:r>
           </w:p>
         </w:tc>
@@ -4744,7 +4744,7 @@
                 <w:sz w:val="17"/>
                 <w:szCs w:val="17"/>
               </w:rPr>
-              <w:t xml:space="preserve">No material carbon price on cement production</w:t>
+              <w:t xml:space="preserve">Otherwise (neither H nor M holds)</w:t>
             </w:r>
           </w:p>
         </w:tc>
@@ -4885,7 +4885,7 @@
                 <w:sz w:val="17"/>
                 <w:szCs w:val="17"/>
               </w:rPr>
-              <w:t xml:space="preserve">Dedicated public funding scheme active with disbursed grants to cement CCS projects</w:t>
+              <w:t xml:space="preserve">Public CCS funding scheme is Yes and Funds disbursed to cement CCS is Yes</w:t>
             </w:r>
           </w:p>
         </w:tc>
@@ -4910,7 +4910,7 @@
                 <w:sz w:val="17"/>
                 <w:szCs w:val="17"/>
               </w:rPr>
-              <w:t xml:space="preserve">Funding scheme exists but no disbursement to cement sector yet, or funding limited/competitive</w:t>
+              <w:t xml:space="preserve">Public CCS funding scheme is Yes</w:t>
             </w:r>
           </w:p>
         </w:tc>
@@ -4935,7 +4935,7 @@
                 <w:sz w:val="17"/>
                 <w:szCs w:val="17"/>
               </w:rPr>
-              <w:t xml:space="preserve">No public funding mechanism identified for industrial CCS</w:t>
+              <w:t xml:space="preserve">Otherwise (neither H nor M holds)</w:t>
             </w:r>
           </w:p>
         </w:tc>
@@ -5076,7 +5076,7 @@
                 <w:sz w:val="17"/>
                 <w:szCs w:val="17"/>
               </w:rPr>
-              <w:t xml:space="preserve">Green public procurement rules or embodied-carbon building codes create binding demand covering a material share of low-carbon capacity</w:t>
+              <w:t xml:space="preserve">Low-carbon cement procurement rule = binding and Binding demand as share of low-carbon capacity &gt;= [open: Material share of low-carbon capacity]</w:t>
             </w:r>
           </w:p>
         </w:tc>
@@ -5101,7 +5101,7 @@
                 <w:sz w:val="17"/>
                 <w:szCs w:val="17"/>
               </w:rPr>
-              <w:t xml:space="preserve">Voluntary standards or pilot procurement commitments exist</w:t>
+              <w:t xml:space="preserve">Low-carbon cement procurement rule in binding, voluntary_or_pilot</w:t>
             </w:r>
           </w:p>
         </w:tc>
@@ -5126,7 +5126,7 @@
                 <w:sz w:val="17"/>
                 <w:szCs w:val="17"/>
               </w:rPr>
-              <w:t xml:space="preserve">No recoverable premium mechanism identified</w:t>
+              <w:t xml:space="preserve">Otherwise (neither H nor M holds)</w:t>
             </w:r>
           </w:p>
         </w:tc>
@@ -5504,7 +5504,7 @@
                 <w:sz w:val="17"/>
                 <w:szCs w:val="17"/>
               </w:rPr>
-              <w:t xml:space="preserve">Low-carbon hydrogen cost within 20% of grey hydrogen cost, or carbon price closes the gap</w:t>
+              <w:t xml:space="preserve">Low-carbon hydrogen supply present is Yes and (Low-carbon to grey hydrogen cost &lt;= 1.2 or Low-carbon hydrogen cost &lt;= Grey hydrogen cost with carbon price)</w:t>
             </w:r>
           </w:p>
         </w:tc>
@@ -5529,7 +5529,7 @@
                 <w:sz w:val="17"/>
                 <w:szCs w:val="17"/>
               </w:rPr>
-              <w:t xml:space="preserve">Low-carbon hydrogen cost 20-100% above grey hydrogen cost</w:t>
+              <w:t xml:space="preserve">Low-carbon hydrogen supply present is Yes and Low-carbon to grey hydrogen cost &lt;= 2</w:t>
             </w:r>
           </w:p>
         </w:tc>
@@ -5554,7 +5554,7 @@
                 <w:sz w:val="17"/>
                 <w:szCs w:val="17"/>
               </w:rPr>
-              <w:t xml:space="preserve">Low-carbon hydrogen more than 2x grey hydrogen cost, or no low-carbon hydrogen supply chain present</w:t>
+              <w:t xml:space="preserve">Otherwise (neither H nor M holds)</w:t>
             </w:r>
           </w:p>
         </w:tc>
@@ -5695,7 +5695,7 @@
                 <w:sz w:val="17"/>
                 <w:szCs w:val="17"/>
               </w:rPr>
-              <w:t xml:space="preserve">TRL 7+ with commercial-scale pilot operating or announced FID</w:t>
+              <w:t xml:space="preserve">Electric cracking readiness in the region &gt;= 7 TRL and Commercial-scale electric cracker operating or at FID is Yes</w:t>
             </w:r>
           </w:p>
         </w:tc>
@@ -5720,7 +5720,7 @@
                 <w:sz w:val="17"/>
                 <w:szCs w:val="17"/>
               </w:rPr>
-              <w:t xml:space="preserve">TRL 5-6, demonstration scale only</w:t>
+              <w:t xml:space="preserve">Electric cracking readiness in the region &gt;= 5 TRL</w:t>
             </w:r>
           </w:p>
         </w:tc>
@@ -5745,7 +5745,7 @@
                 <w:sz w:val="17"/>
                 <w:szCs w:val="17"/>
               </w:rPr>
-              <w:t xml:space="preserve">TRL below 5, lab/concept stage only</w:t>
+              <w:t xml:space="preserve">Otherwise (neither H nor M holds)</w:t>
             </w:r>
           </w:p>
         </w:tc>
@@ -5886,7 +5886,7 @@
                 <w:sz w:val="17"/>
                 <w:szCs w:val="17"/>
               </w:rPr>
-              <w:t xml:space="preserve">Effective net carbon price exceeds USD 50/tCO2 with border levy protection in force</w:t>
+              <w:t xml:space="preserve">Carbon price applies to chemicals is Yes and Carbon price on chemicals &gt; 50 USD/tCO2 and Border carbon levy in force for chemicals is Yes and Free allocation phase-out legislated for chemicals is Yes</w:t>
             </w:r>
           </w:p>
         </w:tc>
@@ -5911,7 +5911,7 @@
                 <w:sz w:val="17"/>
                 <w:szCs w:val="17"/>
               </w:rPr>
-              <w:t xml:space="preserve">Carbon price applies but free allocation material or no border levy</w:t>
+              <w:t xml:space="preserve">Carbon price applies to chemicals is Yes and Carbon price on chemicals &gt;= 33.92 USD/tCO2</w:t>
             </w:r>
           </w:p>
         </w:tc>
@@ -5936,7 +5936,7 @@
                 <w:sz w:val="17"/>
                 <w:szCs w:val="17"/>
               </w:rPr>
-              <w:t xml:space="preserve">No material carbon price on chemicals production</w:t>
+              <w:t xml:space="preserve">Otherwise (neither H nor M holds)</w:t>
             </w:r>
           </w:p>
         </w:tc>
@@ -6077,7 +6077,7 @@
                 <w:sz w:val="17"/>
                 <w:szCs w:val="17"/>
               </w:rPr>
-              <w:t xml:space="preserve">Material signed offtake volume from shipping or industrial buyers at disclosed premium</w:t>
+              <w:t xml:space="preserve">Binding green ammonia or methanol offtake signed is Yes and Offtake premium disclosed is Yes and Signed green ammonia and methanol offtake &gt;= [open: Material offtake volume]</w:t>
             </w:r>
           </w:p>
         </w:tc>
@@ -6102,7 +6102,7 @@
                 <w:sz w:val="17"/>
                 <w:szCs w:val="17"/>
               </w:rPr>
-              <w:t xml:space="preserve">Pilot-scale offtake agreements signed, limited volume</w:t>
+              <w:t xml:space="preserve">Binding green ammonia or methanol offtake signed is Yes</w:t>
             </w:r>
           </w:p>
         </w:tc>
@@ -6127,7 +6127,7 @@
                 <w:sz w:val="17"/>
                 <w:szCs w:val="17"/>
               </w:rPr>
-              <w:t xml:space="preserve">No material offtake agreements identified</w:t>
+              <w:t xml:space="preserve">Otherwise (neither H nor M holds)</w:t>
             </w:r>
           </w:p>
         </w:tc>
@@ -6505,7 +6505,7 @@
                 <w:sz w:val="17"/>
                 <w:szCs w:val="17"/>
               </w:rPr>
-              <w:t xml:space="preserve">Battery-electric equipment commercially deployed at scale (multiple operating mines)</w:t>
+              <w:t xml:space="preserve">Battery-electric equipment in production at more than one mine is Yes and Battery-electric share of equipment orders &gt;= [open: At-scale battery-electric order share]</w:t>
             </w:r>
           </w:p>
         </w:tc>
@@ -6530,7 +6530,7 @@
                 <w:sz w:val="17"/>
                 <w:szCs w:val="17"/>
               </w:rPr>
-              <w:t xml:space="preserve">Pilot deployments underway, limited scale</w:t>
+              <w:t xml:space="preserve">Battery-electric equipment at an operating mine is Yes</w:t>
             </w:r>
           </w:p>
         </w:tc>
@@ -6555,7 +6555,7 @@
                 <w:sz w:val="17"/>
                 <w:szCs w:val="17"/>
               </w:rPr>
-              <w:t xml:space="preserve">Battery-electric equipment not yet deployed at operating mines in the region</w:t>
+              <w:t xml:space="preserve">Otherwise (neither H nor M holds)</w:t>
             </w:r>
           </w:p>
         </w:tc>
@@ -6696,7 +6696,7 @@
                 <w:sz w:val="17"/>
                 <w:szCs w:val="17"/>
               </w:rPr>
-              <w:t xml:space="preserve">Statutory fast-track permitting in force with maximum timeline below 30 months</w:t>
+              <w:t xml:space="preserve">Fast-track permitting for strategic minerals projects = statutory and Statutory maximum permitting time &lt; 30 months</w:t>
             </w:r>
           </w:p>
         </w:tc>
@@ -6721,7 +6721,7 @@
                 <w:sz w:val="17"/>
                 <w:szCs w:val="17"/>
               </w:rPr>
-              <w:t xml:space="preserve">Fast-track process exists but timeline exceeds 30 months or is discretionary</w:t>
+              <w:t xml:space="preserve">Fast-track permitting for strategic minerals projects in statutory, discretionary or Standard permitting time &lt;= 60 months</w:t>
             </w:r>
           </w:p>
         </w:tc>
@@ -6746,7 +6746,7 @@
                 <w:sz w:val="17"/>
                 <w:szCs w:val="17"/>
               </w:rPr>
-              <w:t xml:space="preserve">No fast-track permitting regime; standard permitting exceeds 5 years</w:t>
+              <w:t xml:space="preserve">Otherwise (neither H nor M holds)</w:t>
             </w:r>
           </w:p>
         </w:tc>
@@ -6887,7 +6887,7 @@
                 <w:sz w:val="17"/>
                 <w:szCs w:val="17"/>
               </w:rPr>
-              <w:t xml:space="preserve">Binding domestic/allied content requirement in force tied to material subsidy value</w:t>
+              <w:t xml:space="preserve">Domestic or allied content requirement = binding and Required domestic or allied content &gt;= [open: Low content threshold] and Subsidy tied to the requirement &gt;= [open: Material subsidy value]</w:t>
             </w:r>
           </w:p>
         </w:tc>
@@ -6912,7 +6912,7 @@
                 <w:sz w:val="17"/>
                 <w:szCs w:val="17"/>
               </w:rPr>
-              <w:t xml:space="preserve">Requirement exists but threshold low or enforcement unclear</w:t>
+              <w:t xml:space="preserve">Domestic or allied content requirement in binding, other</w:t>
             </w:r>
           </w:p>
         </w:tc>
@@ -6937,7 +6937,7 @@
                 <w:sz w:val="17"/>
                 <w:szCs w:val="17"/>
               </w:rPr>
-              <w:t xml:space="preserve">No domestic content requirement policy identified</w:t>
+              <w:t xml:space="preserve">Otherwise (neither H nor M holds)</w:t>
             </w:r>
           </w:p>
         </w:tc>
@@ -7078,7 +7078,7 @@
                 <w:sz w:val="17"/>
                 <w:szCs w:val="17"/>
               </w:rPr>
-              <w:t xml:space="preserve">Signed offtake agreements and committed expansion capacity cover a material share of the identified regional supply gap</w:t>
+              <w:t xml:space="preserve">No projected lithium supply gap is Yes or Share of lithium supply gap covered &gt;= [open: Material share of the supply gap]</w:t>
             </w:r>
           </w:p>
         </w:tc>
@@ -7103,7 +7103,7 @@
                 <w:sz w:val="17"/>
                 <w:szCs w:val="17"/>
               </w:rPr>
-              <w:t xml:space="preserve">Some offtake agreements signed but gap remains largely uncovered</w:t>
+              <w:t xml:space="preserve">Share of lithium supply gap covered &gt;= [open: Minimal share of the supply gap]</w:t>
             </w:r>
           </w:p>
         </w:tc>
@@ -7128,7 +7128,7 @@
                 <w:sz w:val="17"/>
                 <w:szCs w:val="17"/>
               </w:rPr>
-              <w:t xml:space="preserve">Minimal offtake activity relative to the scale of the demand gap</w:t>
+              <w:t xml:space="preserve">Otherwise (neither H nor M holds)</w:t>
             </w:r>
           </w:p>
         </w:tc>
@@ -7506,7 +7506,7 @@
                 <w:sz w:val="17"/>
                 <w:szCs w:val="17"/>
               </w:rPr>
-              <w:t xml:space="preserve">SAF capacity exceeds 5% of regional jet fuel demand with credible near-term expansion pipeline</w:t>
+              <w:t xml:space="preserve">SAF capacity share of jet fuel demand &gt; 5% and SAF expansion at FID or under construction is Yes</w:t>
             </w:r>
           </w:p>
         </w:tc>
@@ -7531,7 +7531,7 @@
                 <w:sz w:val="17"/>
                 <w:szCs w:val="17"/>
               </w:rPr>
-              <w:t xml:space="preserve">SAF capacity between 1-5% of demand</w:t>
+              <w:t xml:space="preserve">SAF capacity share of jet fuel demand &gt;= 1%</w:t>
             </w:r>
           </w:p>
         </w:tc>
@@ -7556,7 +7556,7 @@
                 <w:sz w:val="17"/>
                 <w:szCs w:val="17"/>
               </w:rPr>
-              <w:t xml:space="preserve">SAF capacity below 1% of regional jet fuel demand</w:t>
+              <w:t xml:space="preserve">Otherwise (neither H nor M holds)</w:t>
             </w:r>
           </w:p>
         </w:tc>
@@ -7697,7 +7697,7 @@
                 <w:sz w:val="17"/>
                 <w:szCs w:val="17"/>
               </w:rPr>
-              <w:t xml:space="preserve">Binding blending mandate in force with escalating schedule and penalties for non-compliance</w:t>
+              <w:t xml:space="preserve">SAF blending mandate = in_force and Mandated share rises by law is Yes and Penalties for missing the mandate is Yes</w:t>
             </w:r>
           </w:p>
         </w:tc>
@@ -7722,7 +7722,7 @@
                 <w:sz w:val="17"/>
                 <w:szCs w:val="17"/>
               </w:rPr>
-              <w:t xml:space="preserve">Mandate announced but not yet in force, or voluntary target only</w:t>
+              <w:t xml:space="preserve">SAF blending mandate in in_force, announced_or_voluntary</w:t>
             </w:r>
           </w:p>
         </w:tc>
@@ -7747,7 +7747,7 @@
                 <w:sz w:val="17"/>
                 <w:szCs w:val="17"/>
               </w:rPr>
-              <w:t xml:space="preserve">No blending mandate or target identified</w:t>
+              <w:t xml:space="preserve">Otherwise (neither H nor M holds)</w:t>
             </w:r>
           </w:p>
         </w:tc>
@@ -7888,7 +7888,7 @@
                 <w:sz w:val="17"/>
                 <w:szCs w:val="17"/>
               </w:rPr>
-              <w:t xml:space="preserve">Premium substantially offset by mandate compliance value or tax credit, with material offtake agreements in place</w:t>
+              <w:t xml:space="preserve">Premium offset mechanism in force is Yes and SAF offtake signed is Yes and Share of SAF premium offset &gt;= [open: Substantial offset share] and SAF offtake share of jet fuel demand &gt;= [open: Material offtake share]</w:t>
             </w:r>
           </w:p>
         </w:tc>
@@ -7913,7 +7913,7 @@
                 <w:sz w:val="17"/>
                 <w:szCs w:val="17"/>
               </w:rPr>
-              <w:t xml:space="preserve">Premium partially offset; limited offtake agreements</w:t>
+              <w:t xml:space="preserve">Premium offset mechanism in force is Yes or SAF offtake signed is Yes</w:t>
             </w:r>
           </w:p>
         </w:tc>
@@ -7938,7 +7938,7 @@
                 <w:sz w:val="17"/>
                 <w:szCs w:val="17"/>
               </w:rPr>
-              <w:t xml:space="preserve">Full premium borne by airline/passenger with no offset mechanism or offtake coverage</w:t>
+              <w:t xml:space="preserve">Otherwise (neither H nor M holds)</w:t>
             </w:r>
           </w:p>
         </w:tc>
@@ -8316,7 +8316,7 @@
                 <w:sz w:val="17"/>
                 <w:szCs w:val="17"/>
               </w:rPr>
-              <w:t xml:space="preserve">Alternative-fuel-capable vessels exceed 30% of new orders in the relevant vessel class</w:t>
+              <w:t xml:space="preserve">Alternative-fuel-capable share of new orders &gt; 30%</w:t>
             </w:r>
           </w:p>
         </w:tc>
@@ -8341,7 +8341,7 @@
                 <w:sz w:val="17"/>
                 <w:szCs w:val="17"/>
               </w:rPr>
-              <w:t xml:space="preserve">Alternative-fuel-capable vessels 10-30% of new orders</w:t>
+              <w:t xml:space="preserve">Alternative-fuel-capable share of new orders &gt;= 10%</w:t>
             </w:r>
           </w:p>
         </w:tc>
@@ -8366,7 +8366,7 @@
                 <w:sz w:val="17"/>
                 <w:szCs w:val="17"/>
               </w:rPr>
-              <w:t xml:space="preserve">Alternative-fuel-capable vessels below 10% of new orders</w:t>
+              <w:t xml:space="preserve">Otherwise (neither H nor M holds)</w:t>
             </w:r>
           </w:p>
         </w:tc>
@@ -8507,7 +8507,7 @@
                 <w:sz w:val="17"/>
                 <w:szCs w:val="17"/>
               </w:rPr>
-              <w:t xml:space="preserve">Both a carbon price and a binding fuel intensity mandate apply to shipping in this region</w:t>
+              <w:t xml:space="preserve">Carbon price applies to shipping is Yes and Binding fuel GHG intensity mandate applies is Yes</w:t>
             </w:r>
           </w:p>
         </w:tc>
@@ -8532,7 +8532,7 @@
                 <w:sz w:val="17"/>
                 <w:szCs w:val="17"/>
               </w:rPr>
-              <w:t xml:space="preserve">One of the two mechanisms applies</w:t>
+              <w:t xml:space="preserve">Carbon price applies to shipping is Yes or Binding fuel GHG intensity mandate applies is Yes</w:t>
             </w:r>
           </w:p>
         </w:tc>
@@ -8557,7 +8557,7 @@
                 <w:sz w:val="17"/>
                 <w:szCs w:val="17"/>
               </w:rPr>
-              <w:t xml:space="preserve">Neither mechanism applies; shipping decarbonisation remains voluntary</w:t>
+              <w:t xml:space="preserve">Otherwise (neither H nor M holds)</w:t>
             </w:r>
           </w:p>
         </w:tc>
@@ -8698,7 +8698,7 @@
                 <w:sz w:val="17"/>
                 <w:szCs w:val="17"/>
               </w:rPr>
-              <w:t xml:space="preserve">Multiple active green corridors with committed cargo volumes and disclosed premium mechanism</w:t>
+              <w:t xml:space="preserve">Corridors with committed cargo and a premium mechanism &gt; 1 corridors</w:t>
             </w:r>
           </w:p>
         </w:tc>
@@ -8723,7 +8723,7 @@
                 <w:sz w:val="17"/>
                 <w:szCs w:val="17"/>
               </w:rPr>
-              <w:t xml:space="preserve">Green corridors announced but limited committed volume</w:t>
+              <w:t xml:space="preserve">Corridor with signed cargo commitment is Yes</w:t>
             </w:r>
           </w:p>
         </w:tc>
@@ -8748,7 +8748,7 @@
                 <w:sz w:val="17"/>
                 <w:szCs w:val="17"/>
               </w:rPr>
-              <w:t xml:space="preserve">No active green corridor commitments in the region's main trade routes</w:t>
+              <w:t xml:space="preserve">Otherwise (neither H nor M holds)</w:t>
             </w:r>
           </w:p>
         </w:tc>
@@ -9126,7 +9126,7 @@
                 <w:sz w:val="17"/>
                 <w:szCs w:val="17"/>
               </w:rPr>
-              <w:t xml:space="preserve">TCO parity or advantage achieved for at least regional/depot-based duty cycles</w:t>
+              <w:t xml:space="preserve">Zero-emission truck TCO, regional &lt;= Diesel truck TCO, regional</w:t>
             </w:r>
           </w:p>
         </w:tc>
@@ -9151,7 +9151,7 @@
                 <w:sz w:val="17"/>
                 <w:szCs w:val="17"/>
               </w:rPr>
-              <w:t xml:space="preserve">TCO within 20% of parity for depot-based cycles; long-haul not yet competitive</w:t>
+              <w:t xml:space="preserve">TCO ratio, regional &lt;= 1.2 or TCO ratio, long-haul &lt;= 1.2</w:t>
             </w:r>
           </w:p>
         </w:tc>
@@ -9176,7 +9176,7 @@
                 <w:sz w:val="17"/>
                 <w:szCs w:val="17"/>
               </w:rPr>
-              <w:t xml:space="preserve">TCO more than 20% above diesel for all duty cycles</w:t>
+              <w:t xml:space="preserve">Otherwise (neither H nor M holds)</w:t>
             </w:r>
           </w:p>
         </w:tc>
@@ -9317,7 +9317,7 @@
                 <w:sz w:val="17"/>
                 <w:szCs w:val="17"/>
               </w:rPr>
-              <w:t xml:space="preserve">Binding standard/mandate in force with penalties, requiring material ZEV share within the assessment horizon</w:t>
+              <w:t xml:space="preserve">Heavy truck CO2 standard or ZEV mandate = in_force and Penalties for missing the standard is Yes and Required ZEV share of new heavy truck sales in 2030 &gt;= 30%</w:t>
             </w:r>
           </w:p>
         </w:tc>
@@ -9342,7 +9342,7 @@
                 <w:sz w:val="17"/>
                 <w:szCs w:val="17"/>
               </w:rPr>
-              <w:t xml:space="preserve">Standard announced but not yet binding, or binding with limited near-term stringency</w:t>
+              <w:t xml:space="preserve">Heavy truck CO2 standard or ZEV mandate in in_force, announced</w:t>
             </w:r>
           </w:p>
         </w:tc>
@@ -9367,7 +9367,7 @@
                 <w:sz w:val="17"/>
                 <w:szCs w:val="17"/>
               </w:rPr>
-              <w:t xml:space="preserve">No binding CO2 standard or ZEV mandate for heavy trucks</w:t>
+              <w:t xml:space="preserve">Otherwise (neither H nor M holds)</w:t>
             </w:r>
           </w:p>
         </w:tc>
@@ -9508,7 +9508,7 @@
                 <w:sz w:val="17"/>
                 <w:szCs w:val="17"/>
               </w:rPr>
-              <w:t xml:space="preserve">Infrastructure density sufficient for unconstrained long-haul operation on primary corridors</w:t>
+              <w:t xml:space="preserve">Heavy-duty charging and refuelling density on primary freight corridors &gt;= 3.33 points per 100 km</w:t>
             </w:r>
           </w:p>
         </w:tc>
@@ -9533,7 +9533,7 @@
                 <w:sz w:val="17"/>
                 <w:szCs w:val="17"/>
               </w:rPr>
-              <w:t xml:space="preserve">Infrastructure present but limited to depot/regional use, gaps on long-haul corridors</w:t>
+              <w:t xml:space="preserve">Heavy-duty charging and refuelling density on primary freight corridors &gt;= [open: Density above minimal]</w:t>
             </w:r>
           </w:p>
         </w:tc>
@@ -9558,7 +9558,7 @@
                 <w:sz w:val="17"/>
                 <w:szCs w:val="17"/>
               </w:rPr>
-              <w:t xml:space="preserve">Minimal public infrastructure; operation restricted to depot-based captive fleets</w:t>
+              <w:t xml:space="preserve">Otherwise (neither H nor M holds)</w:t>
             </w:r>
           </w:p>
         </w:tc>
@@ -9936,7 +9936,7 @@
                 <w:sz w:val="17"/>
                 <w:szCs w:val="17"/>
               </w:rPr>
-              <w:t xml:space="preserve">LDAR and flaring reduction technology deployed across a majority of regional production</w:t>
+              <w:t xml:space="preserve">Production covered by LDAR and flaring reduction &gt; 50%</w:t>
             </w:r>
           </w:p>
         </w:tc>
@@ -9961,7 +9961,7 @@
                 <w:sz w:val="17"/>
                 <w:szCs w:val="17"/>
               </w:rPr>
-              <w:t xml:space="preserve">Deployed at major operators but not sector-wide</w:t>
+              <w:t xml:space="preserve">Deployed at the region's major operators is Yes</w:t>
             </w:r>
           </w:p>
         </w:tc>
@@ -9986,7 +9986,7 @@
                 <w:sz w:val="17"/>
                 <w:szCs w:val="17"/>
               </w:rPr>
-              <w:t xml:space="preserve">Minimal deployment; routine flaring and unmonitored leakage remain common</w:t>
+              <w:t xml:space="preserve">Otherwise (neither H nor M holds)</w:t>
             </w:r>
           </w:p>
         </w:tc>
@@ -10127,7 +10127,7 @@
                 <w:sz w:val="17"/>
                 <w:szCs w:val="17"/>
               </w:rPr>
-              <w:t xml:space="preserve">Binding methane limit and/or fee in force with enforcement mechanism</w:t>
+              <w:t xml:space="preserve">Binding methane limit or fee = in_force and Enforcement mechanism is Yes</w:t>
             </w:r>
           </w:p>
         </w:tc>
@@ -10152,7 +10152,7 @@
                 <w:sz w:val="17"/>
                 <w:szCs w:val="17"/>
               </w:rPr>
-              <w:t xml:space="preserve">Regulation announced or in phase-in, not yet fully enforced</w:t>
+              <w:t xml:space="preserve">Binding methane limit or fee in in_force, phase_in</w:t>
             </w:r>
           </w:p>
         </w:tc>
@@ -10177,7 +10177,7 @@
                 <w:sz w:val="17"/>
                 <w:szCs w:val="17"/>
               </w:rPr>
-              <w:t xml:space="preserve">No binding methane regulation identified</w:t>
+              <w:t xml:space="preserve">Otherwise (neither H nor M holds)</w:t>
             </w:r>
           </w:p>
         </w:tc>
@@ -10318,7 +10318,7 @@
                 <w:sz w:val="17"/>
                 <w:szCs w:val="17"/>
               </w:rPr>
-              <w:t xml:space="preserve">Demand trajectory stable or growing under stated policies (lower stranding risk near-term, i.e. more 'feasible' to continue operating economically)</w:t>
+              <w:t xml:space="preserve">Oil and gas demand change to 2035 (stated policies) &gt;= [open: Largest decline still stable]</w:t>
             </w:r>
           </w:p>
         </w:tc>
@@ -10343,7 +10343,7 @@
                 <w:sz w:val="17"/>
                 <w:szCs w:val="17"/>
               </w:rPr>
-              <w:t xml:space="preserve">Demand trajectory flat to moderate decline</w:t>
+              <w:t xml:space="preserve">Oil and gas demand change to 2035 (stated policies) &gt;= [open: Decline short of structural]</w:t>
             </w:r>
           </w:p>
         </w:tc>
@@ -10368,7 +10368,7 @@
                 <w:sz w:val="17"/>
                 <w:szCs w:val="17"/>
               </w:rPr>
-              <w:t xml:space="preserve">Demand trajectory in structural decline under regional policy settings</w:t>
+              <w:t xml:space="preserve">Otherwise (neither H nor M holds)</w:t>
             </w:r>
           </w:p>
         </w:tc>
@@ -15347,7 +15347,7 @@
           <w:sz w:val="20"/>
           <w:szCs w:val="20"/>
         </w:rPr>
-        <w:t xml:space="preserve">The 86 sources</w:t>
+        <w:t xml:space="preserve">The 89 sources</w:t>
       </w:r>
     </w:p>
     <w:p>
@@ -15360,7 +15360,7 @@
           <w:sz w:val="20"/>
           <w:szCs w:val="20"/>
         </w:rPr>
-        <w:t xml:space="preserve">Grouped by access pattern — how the source can actually be retrieved, which determines whether re-verification can be automated. Only the 15 legal/regulatory sources are automated today; the other 71 require manual verification.</w:t>
+        <w:t xml:space="preserve">Grouped by access pattern — how the source can actually be retrieved, which determines whether re-verification can be automated. Only the 15 legal/regulatory sources are automated today; the other 74 require manual verification. A source marked Manual cannot be fetched as a document; the reason is given.</w:t>
       </w:r>
     </w:p>
     <w:p>
@@ -15572,7 +15572,7 @@
             <w:pPr>
               <w:spacing w:after="0"/>
             </w:pPr>
-            <w:hyperlink w:history="1" r:id="rIdmkoq6qla--rhjhaw_x8_m">
+            <w:hyperlink w:history="1" r:id="rId3tuy8yazniisfw-lzsw67">
               <w:r>
                 <w:rPr>
                   <w:rFonts w:ascii="Calibri" w:cs="Calibri" w:eastAsia="Calibri" w:hAnsi="Calibri"/>
@@ -15678,7 +15678,7 @@
                 <w:sz w:val="17"/>
                 <w:szCs w:val="17"/>
               </w:rPr>
-              <w:t xml:space="preserve">Article 3 for TEN-T road network charging point power/distance requirements; Article 6 for hydrogen refuelling</w:t>
+              <w:t xml:space="preserve">Article 4 for heavy-duty charging along the TEN-T road network (pool power and distance requirements, e.g. Article 4(1)(c)); Article 3 covers light-duty vehicles; Article 6 for hydrogen refuelling</w:t>
             </w:r>
           </w:p>
         </w:tc>
@@ -15698,7 +15698,7 @@
             <w:pPr>
               <w:spacing w:after="0"/>
             </w:pPr>
-            <w:hyperlink w:history="1" r:id="rIdgdkdnvjhikrjy4k_jchwa">
+            <w:hyperlink w:history="1" r:id="rIdikufqyzhudfbji1wv_sft">
               <w:r>
                 <w:rPr>
                   <w:rFonts w:ascii="Calibri" w:cs="Calibri" w:eastAsia="Calibri" w:hAnsi="Calibri"/>
@@ -15824,7 +15824,7 @@
             <w:pPr>
               <w:spacing w:after="0"/>
             </w:pPr>
-            <w:hyperlink w:history="1" r:id="rIdasvc9g7a2bn-oht3nq-gr">
+            <w:hyperlink w:history="1" r:id="rIdutznhbqoygehhy4nzauit">
               <w:r>
                 <w:rPr>
                   <w:rFonts w:ascii="Calibri" w:cs="Calibri" w:eastAsia="Calibri" w:hAnsi="Calibri"/>
@@ -15950,7 +15950,7 @@
             <w:pPr>
               <w:spacing w:after="0"/>
             </w:pPr>
-            <w:hyperlink w:history="1" r:id="rIdd4wnspj6zocpjoxvvvgnc">
+            <w:hyperlink w:history="1" r:id="rIdkh6q3ljblxyh5f8eafrw2">
               <w:r>
                 <w:rPr>
                   <w:rFonts w:ascii="Calibri" w:cs="Calibri" w:eastAsia="Calibri" w:hAnsi="Calibri"/>
@@ -16076,7 +16076,7 @@
             <w:pPr>
               <w:spacing w:after="0"/>
             </w:pPr>
-            <w:hyperlink w:history="1" r:id="rIdnzio96-y_rsgafngn4wks">
+            <w:hyperlink w:history="1" r:id="rIdpr_v7evxvchecc3ylv_qd">
               <w:r>
                 <w:rPr>
                   <w:rFonts w:ascii="Calibri" w:cs="Calibri" w:eastAsia="Calibri" w:hAnsi="Calibri"/>
@@ -16202,7 +16202,7 @@
             <w:pPr>
               <w:spacing w:after="0"/>
             </w:pPr>
-            <w:hyperlink w:history="1" r:id="rIdkkg0b8eoscji9ebw6cvyx">
+            <w:hyperlink w:history="1" r:id="rIdlvprrl5lrvoh-iqhvsdev">
               <w:r>
                 <w:rPr>
                   <w:rFonts w:ascii="Calibri" w:cs="Calibri" w:eastAsia="Calibri" w:hAnsi="Calibri"/>
@@ -16308,7 +16308,7 @@
                 <w:sz w:val="17"/>
                 <w:szCs w:val="17"/>
               </w:rPr>
-              <w:t xml:space="preserve">Article 3 for 2030 benchmarks (10% extraction / 40% processing / 25% recycling); Chapter III for Strategic Projects fast-track permitting (Article 12: 27-month target for extraction projects)</w:t>
+              <w:t xml:space="preserve">Article 5(1) for the 2030 benchmarks (10% extraction / 40% processing / 25% recycling); Chapter III for Strategic Projects; Article 11 for permit-granting: 11(1)(a) 27 months for extraction projects, 11(3) excludes the environmental impact assessment step, 11(4) allows an extension of at most six months</w:t>
             </w:r>
           </w:p>
         </w:tc>
@@ -16328,7 +16328,7 @@
             <w:pPr>
               <w:spacing w:after="0"/>
             </w:pPr>
-            <w:hyperlink w:history="1" r:id="rIdm-h_7vf7imhszrwgedmts">
+            <w:hyperlink w:history="1" r:id="rIdoefaggxfczd3sbix3rcux">
               <w:r>
                 <w:rPr>
                   <w:rFonts w:ascii="Calibri" w:cs="Calibri" w:eastAsia="Calibri" w:hAnsi="Calibri"/>
@@ -16434,7 +16434,7 @@
                 <w:sz w:val="17"/>
                 <w:szCs w:val="17"/>
               </w:rPr>
-              <w:t xml:space="preserve">Article 3 for 2030 benchmarks (10% extraction / 40% processing / 25% recycling); Chapter III for Strategic Projects fast-track permitting (Article 12: 27-month target for extraction projects)</w:t>
+              <w:t xml:space="preserve">Article 5(1) for the 2030 benchmarks (10% extraction / 40% processing / 25% recycling); Chapter III for Strategic Projects; Article 11 for permit-granting: 11(1)(a) 27 months for extraction projects, 11(3) excludes the environmental impact assessment step, 11(4) allows an extension of at most six months</w:t>
             </w:r>
           </w:p>
         </w:tc>
@@ -16454,7 +16454,7 @@
             <w:pPr>
               <w:spacing w:after="0"/>
             </w:pPr>
-            <w:hyperlink w:history="1" r:id="rIdynvgzkjntqvihydqpfuf_">
+            <w:hyperlink w:history="1" r:id="rIdwpq1qq16bx8rrz9auiyqy">
               <w:r>
                 <w:rPr>
                   <w:rFonts w:ascii="Calibri" w:cs="Calibri" w:eastAsia="Calibri" w:hAnsi="Calibri"/>
@@ -16580,7 +16580,7 @@
             <w:pPr>
               <w:spacing w:after="0"/>
             </w:pPr>
-            <w:hyperlink w:history="1" r:id="rIddx7znxujzpmkt1il4y_r8">
+            <w:hyperlink w:history="1" r:id="rId00olo48gxos8qai9k5gai">
               <w:r>
                 <w:rPr>
                   <w:rFonts w:ascii="Calibri" w:cs="Calibri" w:eastAsia="Calibri" w:hAnsi="Calibri"/>
@@ -16706,7 +16706,7 @@
             <w:pPr>
               <w:spacing w:after="0"/>
             </w:pPr>
-            <w:hyperlink w:history="1" r:id="rIduujbbpynijl9bucotawik">
+            <w:hyperlink w:history="1" r:id="rIdwg7yki1gbj7-36-fc5apu">
               <w:r>
                 <w:rPr>
                   <w:rFonts w:ascii="Calibri" w:cs="Calibri" w:eastAsia="Calibri" w:hAnsi="Calibri"/>
@@ -16832,7 +16832,7 @@
             <w:pPr>
               <w:spacing w:after="0"/>
             </w:pPr>
-            <w:hyperlink w:history="1" r:id="rIdpp2nxz1swf9tu_onct5eh">
+            <w:hyperlink w:history="1" r:id="rIdebpt4e3eildeiydqtw7jh">
               <w:r>
                 <w:rPr>
                   <w:rFonts w:ascii="Calibri" w:cs="Calibri" w:eastAsia="Calibri" w:hAnsi="Calibri"/>
@@ -16958,7 +16958,7 @@
             <w:pPr>
               <w:spacing w:after="0"/>
             </w:pPr>
-            <w:hyperlink w:history="1" r:id="rIdlahjt0w542fplu3g_pgw4">
+            <w:hyperlink w:history="1" r:id="rIdn6oqlqhra2pspbio1z21l">
               <w:r>
                 <w:rPr>
                   <w:rFonts w:ascii="Calibri" w:cs="Calibri" w:eastAsia="Calibri" w:hAnsi="Calibri"/>
@@ -17084,7 +17084,7 @@
             <w:pPr>
               <w:spacing w:after="0"/>
             </w:pPr>
-            <w:hyperlink w:history="1" r:id="rIdvrlvveydjn358wg3k_xth">
+            <w:hyperlink w:history="1" r:id="rIdrasg_kmzzmtb7pwy7upbw">
               <w:r>
                 <w:rPr>
                   <w:rFonts w:ascii="Calibri" w:cs="Calibri" w:eastAsia="Calibri" w:hAnsi="Calibri"/>
@@ -17210,7 +17210,7 @@
             <w:pPr>
               <w:spacing w:after="0"/>
             </w:pPr>
-            <w:hyperlink w:history="1" r:id="rIdi0n_9fw3dnn04vez0hulj">
+            <w:hyperlink w:history="1" r:id="rIdy1kybwyrcwbzcrgiopt1j">
               <w:r>
                 <w:rPr>
                   <w:rFonts w:ascii="Calibri" w:cs="Calibri" w:eastAsia="Calibri" w:hAnsi="Calibri"/>
@@ -17336,7 +17336,7 @@
             <w:pPr>
               <w:spacing w:after="0"/>
             </w:pPr>
-            <w:hyperlink w:history="1" r:id="rIdueiqceeleokvkutec7in4">
+            <w:hyperlink w:history="1" r:id="rIdzaiucmbltawoliu5_44po">
               <w:r>
                 <w:rPr>
                   <w:rFonts w:ascii="Calibri" w:cs="Calibri" w:eastAsia="Calibri" w:hAnsi="Calibri"/>
@@ -17442,7 +17442,7 @@
                 <w:sz w:val="17"/>
                 <w:szCs w:val="17"/>
               </w:rPr>
-              <w:t xml:space="preserve">Article 3 for the binding 2030 EU-wide renewable target (42.5% headline, with 45% indicative); REPowerEU permitting acceleration provisions</w:t>
+              <w:t xml:space="preserve">Directive (EU) 2023/2413 Article 1(2) replaces Article 3(1) of Directive (EU) 2018/2001: binding 2030 EU-wide renewable target of at least 42.5%, endeavour to reach 45%; permitting acceleration in the inserted Articles 15c (renewables acceleration areas), 16a and 16b (permit-granting inside and outside those areas)</w:t>
             </w:r>
           </w:p>
         </w:tc>
@@ -17657,7 +17657,7 @@
             <w:pPr>
               <w:spacing w:after="0"/>
             </w:pPr>
-            <w:hyperlink w:history="1" r:id="rIdqclbpdjplfuangfvhssss">
+            <w:hyperlink w:history="1" r:id="rIdzm0mlgcq1vplrrrf2alcf">
               <w:r>
                 <w:rPr>
                   <w:rFonts w:ascii="Calibri" w:cs="Calibri" w:eastAsia="Calibri" w:hAnsi="Calibri"/>
@@ -17763,7 +17763,7 @@
                 <w:sz w:val="17"/>
                 <w:szCs w:val="17"/>
               </w:rPr>
-              <w:t xml:space="preserve">Daily CEA closing price; ICAP page gives narrative context on scope and allocation method</w:t>
+              <w:t xml:space="preserve">Manual: Dashboard: daily CEA prices are shown on the exchange's website, which returned HTTP 420 to automated requests. Daily CEA closing price; ICAP page gives narrative context on scope and allocation method</w:t>
             </w:r>
           </w:p>
         </w:tc>
@@ -17783,7 +17783,7 @@
             <w:pPr>
               <w:spacing w:after="0"/>
             </w:pPr>
-            <w:hyperlink w:history="1" r:id="rIdfxrxtvwyijwubj-ezgz63">
+            <w:hyperlink w:history="1" r:id="rIdd5pkpjxmgln8okfxultnc">
               <w:r>
                 <w:rPr>
                   <w:rFonts w:ascii="Calibri" w:cs="Calibri" w:eastAsia="Calibri" w:hAnsi="Calibri"/>
@@ -17889,7 +17889,7 @@
                 <w:sz w:val="17"/>
                 <w:szCs w:val="17"/>
               </w:rPr>
-              <w:t xml:space="preserve">Daily EUA auction and spot price</w:t>
+              <w:t xml:space="preserve">Manual: Dashboard: daily prices are shown in EEX's market-data pages, not a fetchable document. Daily EUA auction and spot price</w:t>
             </w:r>
           </w:p>
         </w:tc>
@@ -17909,7 +17909,7 @@
             <w:pPr>
               <w:spacing w:after="0"/>
             </w:pPr>
-            <w:hyperlink w:history="1" r:id="rIdke-s822k_m5paljeddth4">
+            <w:hyperlink w:history="1" r:id="rIdksa3uuanjgf8zqmdggphz">
               <w:r>
                 <w:rPr>
                   <w:rFonts w:ascii="Calibri" w:cs="Calibri" w:eastAsia="Calibri" w:hAnsi="Calibri"/>
@@ -18015,7 +18015,7 @@
                 <w:sz w:val="17"/>
                 <w:szCs w:val="17"/>
               </w:rPr>
-              <w:t xml:space="preserve">Downloadable in CSV/XLSX; gives projected carbon prices, policy phase-out dates, and macro-financial impacts under Orderly/Disorderly/Hot House World scenario families — used here to source the carbon price trajectory that the H/M/L threshold in this criterion's rubric is benchmarked against.</w:t>
+              <w:t xml:space="preserve">Manual: Dashboard: scenario data are downloaded from the NGFS / IIASA scenario portal; ngfs.net returns 403 to automated requests. Downloadable in CSV/XLSX; gives projected carbon prices, policy phase-out dates, and macro-financial impacts under Orderly/Disorderly/Hot House World scenario families — used here to source the carbon price trajectory that the H/M/L threshold in this criterion's rubric is benchmarked against.</w:t>
             </w:r>
           </w:p>
         </w:tc>
@@ -18035,7 +18035,7 @@
             <w:pPr>
               <w:spacing w:after="0"/>
             </w:pPr>
-            <w:hyperlink w:history="1" r:id="rIdpa0xjqnu20b_sgqv8fvu2">
+            <w:hyperlink w:history="1" r:id="rIdp-fntjr4ea5k_pr6d9yjv">
               <w:r>
                 <w:rPr>
                   <w:rFonts w:ascii="Calibri" w:cs="Calibri" w:eastAsia="Calibri" w:hAnsi="Calibri"/>
@@ -18141,7 +18141,7 @@
                 <w:sz w:val="17"/>
                 <w:szCs w:val="17"/>
               </w:rPr>
-              <w:t xml:space="preserve">Public charging and alternative fuel infrastructure station locator and counts, filterable by vehicle class</w:t>
+              <w:t xml:space="preserve">Manual: Dashboard: station counts come from the AFDC station locator, an interactive tool. Public charging and alternative fuel infrastructure station locator and counts, filterable by vehicle class</w:t>
             </w:r>
           </w:p>
         </w:tc>
@@ -18161,7 +18161,7 @@
             <w:pPr>
               <w:spacing w:after="0"/>
             </w:pPr>
-            <w:hyperlink w:history="1" r:id="rIdnb0mbow5-kg-f3gkppy9j">
+            <w:hyperlink w:history="1" r:id="rIdzstcp-3fanrmxboovaw4i">
               <w:r>
                 <w:rPr>
                   <w:rFonts w:ascii="Calibri" w:cs="Calibri" w:eastAsia="Calibri" w:hAnsi="Calibri"/>
@@ -18287,7 +18287,7 @@
             <w:pPr>
               <w:spacing w:after="0"/>
             </w:pPr>
-            <w:hyperlink w:history="1" r:id="rIdthlgntarf8l56avkcnr9f">
+            <w:hyperlink w:history="1" r:id="rId9hpt0mp900ljikt5wozkc">
               <w:r>
                 <w:rPr>
                   <w:rFonts w:ascii="Calibri" w:cs="Calibri" w:eastAsia="Calibri" w:hAnsi="Calibri"/>
@@ -18393,7 +18393,7 @@
                 <w:sz w:val="17"/>
                 <w:szCs w:val="17"/>
               </w:rPr>
-              <w:t xml:space="preserve">Interactive dashboard; filter by jurisdiction and instrument type (ETS / carbon tax); underlying annual report is 'State and Trends of Carbon Pricing'</w:t>
+              <w:t xml:space="preserve">Manual: Dashboard: interactive dashboard, which returns 403 to automated requests; the annual State and Trends of Carbon Pricing report holds the same figures. Interactive dashboard; filter by jurisdiction and instrument type (ETS / carbon tax); underlying annual report is 'State and Trends of Carbon Pricing'</w:t>
             </w:r>
           </w:p>
         </w:tc>
@@ -18410,7 +18410,7 @@
           <w:sz w:val="20"/>
           <w:szCs w:val="20"/>
         </w:rPr>
-        <w:t xml:space="preserve">Industry tracker / database (10)</w:t>
+        <w:t xml:space="preserve">Industry tracker / database (11)</w:t>
       </w:r>
     </w:p>
     <w:p>
@@ -18608,7 +18608,7 @@
             <w:pPr>
               <w:spacing w:after="0"/>
             </w:pPr>
-            <w:hyperlink w:history="1" r:id="rIdj819sxjtjgnf2mqdc6o1i">
+            <w:hyperlink w:history="1" r:id="rIdqgge_nenaaew6prufngiw">
               <w:r>
                 <w:rPr>
                   <w:rFonts w:ascii="Calibri" w:cs="Calibri" w:eastAsia="Calibri" w:hAnsi="Calibri"/>
@@ -18714,7 +18714,7 @@
                 <w:sz w:val="17"/>
                 <w:szCs w:val="17"/>
               </w:rPr>
-              <w:t xml:space="preserve">Monthly public charging infrastructure statistics</w:t>
+              <w:t xml:space="preserve">Manual: evcipa.org.cn returned 503; monthly statistics are posted as news items with no stable document URL. Monthly public charging infrastructure statistics</w:t>
             </w:r>
           </w:p>
         </w:tc>
@@ -18734,7 +18734,7 @@
             <w:pPr>
               <w:spacing w:after="0"/>
             </w:pPr>
-            <w:hyperlink w:history="1" r:id="rIdate1wwoxmgp5vbjxl_ubg">
+            <w:hyperlink w:history="1" r:id="rIdggxyoxr9dnwu1wi_7lu3f">
               <w:r>
                 <w:rPr>
                   <w:rFonts w:ascii="Calibri" w:cs="Calibri" w:eastAsia="Calibri" w:hAnsi="Calibri"/>
@@ -18840,7 +18840,7 @@
                 <w:sz w:val="17"/>
                 <w:szCs w:val="17"/>
               </w:rPr>
-              <w:t xml:space="preserve">Subscription database; new-build order book filterable by fuel type and propulsion</w:t>
+              <w:t xml:space="preserve">Manual: Subscription: the World Fleet Register needs a paid Clarksons Research account. Subscription database; new-build order book filterable by fuel type and propulsion</w:t>
             </w:r>
           </w:p>
         </w:tc>
@@ -18860,7 +18860,7 @@
             <w:pPr>
               <w:spacing w:after="0"/>
             </w:pPr>
-            <w:hyperlink w:history="1" r:id="rIdwbfafyippmvqisdgl3n17">
+            <w:hyperlink w:history="1" r:id="rIdodpyiyoyku1lx_qsek4xi">
               <w:r>
                 <w:rPr>
                   <w:rFonts w:ascii="Calibri" w:cs="Calibri" w:eastAsia="Calibri" w:hAnsi="Calibri"/>
@@ -18966,7 +18966,7 @@
                 <w:sz w:val="17"/>
                 <w:szCs w:val="17"/>
               </w:rPr>
-              <w:t xml:space="preserve">Free public dashboard tracking alternative-fuel vessel orders and bunkering infrastructure by fuel type</w:t>
+              <w:t xml:space="preserve">Manual: Dashboard: the order book is read in DNV's interactive web app, not a fetchable document. Free public dashboard tracking alternative-fuel vessel orders and bunkering infrastructure by fuel type</w:t>
             </w:r>
           </w:p>
         </w:tc>
@@ -18986,7 +18986,7 @@
             <w:pPr>
               <w:spacing w:after="0"/>
             </w:pPr>
-            <w:hyperlink w:history="1" r:id="rIdauqgdmdempy76phxeu9sh">
+            <w:hyperlink w:history="1" r:id="rIdjxefvoarduvvaxuiyrlnp">
               <w:r>
                 <w:rPr>
                   <w:rFonts w:ascii="Calibri" w:cs="Calibri" w:eastAsia="Calibri" w:hAnsi="Calibri"/>
@@ -19092,7 +19092,7 @@
                 <w:sz w:val="17"/>
                 <w:szCs w:val="17"/>
               </w:rPr>
-              <w:t xml:space="preserve">Member company demand commitments by sector</w:t>
+              <w:t xml:space="preserve">Manual: Dashboard: the commitments list is drawn by a script on the page, with no fetchable document. Member company demand commitments by sector</w:t>
             </w:r>
           </w:p>
         </w:tc>
@@ -19112,7 +19112,7 @@
             <w:pPr>
               <w:spacing w:after="0"/>
             </w:pPr>
-            <w:hyperlink w:history="1" r:id="rIdq00ulppm7epodxujnyvhb">
+            <w:hyperlink w:history="1" r:id="rId01yarsccxu5g8hwsvxvdw">
               <w:r>
                 <w:rPr>
                   <w:rFonts w:ascii="Calibri" w:cs="Calibri" w:eastAsia="Calibri" w:hAnsi="Calibri"/>
@@ -19218,7 +19218,7 @@
                 <w:sz w:val="17"/>
                 <w:szCs w:val="17"/>
               </w:rPr>
-              <w:t xml:space="preserve">List of announced and active green shipping corridor initiatives with participants and status</w:t>
+              <w:t xml:space="preserve">Annual Progress Report on Green Shipping Corridors 2025 (Global Maritime Forum / Getting to Zero Coalition): announced and active corridor initiatives with participants and maturity stage</w:t>
             </w:r>
           </w:p>
         </w:tc>
@@ -19238,7 +19238,7 @@
             <w:pPr>
               <w:spacing w:after="0"/>
             </w:pPr>
-            <w:hyperlink w:history="1" r:id="rIduu5u5pg13u4vugb4xhuki">
+            <w:hyperlink w:history="1" r:id="rIdzuaxm1wnercgvurghft41">
               <w:r>
                 <w:rPr>
                   <w:rFonts w:ascii="Calibri" w:cs="Calibri" w:eastAsia="Calibri" w:hAnsi="Calibri"/>
@@ -19344,7 +19344,7 @@
                 <w:sz w:val="17"/>
                 <w:szCs w:val="17"/>
               </w:rPr>
-              <w:t xml:space="preserve">Filterable database of CCS/CCUS facilities by status (operational/construction/planned), sector, and region</w:t>
+              <w:t xml:space="preserve">Manual: Dashboard: facility data are read in the Global CCS Institute's interactive CO2RE database. Filterable database of CCS/CCUS facilities by status (operational/construction/planned), sector, and region</w:t>
             </w:r>
           </w:p>
         </w:tc>
@@ -19364,7 +19364,7 @@
             <w:pPr>
               <w:spacing w:after="0"/>
             </w:pPr>
-            <w:hyperlink w:history="1" r:id="rIdhgvzsfwonroo8t9h1uldp">
+            <w:hyperlink w:history="1" r:id="rIdxz4lrqmeu7e1zj7qmkd90">
               <w:r>
                 <w:rPr>
                   <w:rFonts w:ascii="Calibri" w:cs="Calibri" w:eastAsia="Calibri" w:hAnsi="Calibri"/>
@@ -19470,7 +19470,7 @@
                 <w:sz w:val="17"/>
                 <w:szCs w:val="17"/>
               </w:rPr>
-              <w:t xml:space="preserve">Getting the Numbers Right (GNR) database; clinker ratio and thermal/electrical intensity by region</w:t>
+              <w:t xml:space="preserve">Manual: Dashboard: GNR 2.0 data are read in GCCA's interactive GNR tool. Getting the Numbers Right (GNR) database; clinker ratio and thermal/electrical intensity by region</w:t>
             </w:r>
           </w:p>
         </w:tc>
@@ -19490,7 +19490,133 @@
             <w:pPr>
               <w:spacing w:after="0"/>
             </w:pPr>
-            <w:hyperlink w:history="1" r:id="rIdk1zgpbjf5ma5e4bzcgtn3">
+            <w:hyperlink w:history="1" r:id="rIdcncl-c-4thxuouhackibk">
+              <w:r>
+                <w:rPr>
+                  <w:rFonts w:ascii="Calibri" w:cs="Calibri" w:eastAsia="Calibri" w:hAnsi="Calibri"/>
+                  <w:color w:val="2A4FB7"/>
+                  <w:sz w:val="17"/>
+                  <w:szCs w:val="17"/>
+                  <w:u w:val="single"/>
+                </w:rPr>
+                <w:t xml:space="preserve">ICAP ETS factsheet: China National ETS</w:t>
+              </w:r>
+            </w:hyperlink>
+          </w:p>
+        </w:tc>
+        <w:tc>
+          <w:tcPr>
+            <w:tcW w:type="dxa" w:w="2600"/>
+            <w:tcMar>
+              <w:top w:type="dxa" w:w="60"/>
+              <w:left w:type="dxa" w:w="90"/>
+              <w:bottom w:type="dxa" w:w="60"/>
+              <w:right w:type="dxa" w:w="90"/>
+            </w:tcMar>
+          </w:tcPr>
+          <w:p>
+            <w:pPr>
+              <w:spacing w:after="0"/>
+            </w:pPr>
+            <w:r>
+              <w:rPr>
+                <w:rFonts w:ascii="Calibri" w:cs="Calibri" w:eastAsia="Calibri" w:hAnsi="Calibri"/>
+                <w:sz w:val="17"/>
+                <w:szCs w:val="17"/>
+              </w:rPr>
+              <w:t xml:space="preserve">International Carbon Action Partnership (ICAP)</w:t>
+            </w:r>
+          </w:p>
+        </w:tc>
+        <w:tc>
+          <w:tcPr>
+            <w:tcW w:type="dxa" w:w="1900"/>
+            <w:tcMar>
+              <w:top w:type="dxa" w:w="60"/>
+              <w:left w:type="dxa" w:w="90"/>
+              <w:bottom w:type="dxa" w:w="60"/>
+              <w:right w:type="dxa" w:w="90"/>
+            </w:tcMar>
+          </w:tcPr>
+          <w:p>
+            <w:pPr>
+              <w:spacing w:after="0"/>
+            </w:pPr>
+            <w:r>
+              <w:rPr>
+                <w:rFonts w:ascii="Calibri" w:cs="Calibri" w:eastAsia="Calibri" w:hAnsi="Calibri"/>
+                <w:sz w:val="17"/>
+                <w:szCs w:val="17"/>
+              </w:rPr>
+              <w:t xml:space="preserve">CEM-R1, PWR-R1, STL-R1</w:t>
+            </w:r>
+          </w:p>
+        </w:tc>
+        <w:tc>
+          <w:tcPr>
+            <w:tcW w:type="dxa" w:w="2100"/>
+            <w:tcMar>
+              <w:top w:type="dxa" w:w="60"/>
+              <w:left w:type="dxa" w:w="90"/>
+              <w:bottom w:type="dxa" w:w="60"/>
+              <w:right w:type="dxa" w:w="90"/>
+            </w:tcMar>
+          </w:tcPr>
+          <w:p>
+            <w:pPr>
+              <w:spacing w:after="0"/>
+            </w:pPr>
+            <w:r>
+              <w:rPr>
+                <w:rFonts w:ascii="Calibri" w:cs="Calibri" w:eastAsia="Calibri" w:hAnsi="Calibri"/>
+                <w:sz w:val="17"/>
+                <w:szCs w:val="17"/>
+              </w:rPr>
+              <w:t xml:space="preserve">annual, updated with the ICAP Status Report (spring), with news items between editions</w:t>
+            </w:r>
+          </w:p>
+        </w:tc>
+        <w:tc>
+          <w:tcPr>
+            <w:tcW w:type="dxa" w:w="5198"/>
+            <w:tcMar>
+              <w:top w:type="dxa" w:w="60"/>
+              <w:left w:type="dxa" w:w="90"/>
+              <w:bottom w:type="dxa" w:w="60"/>
+              <w:right w:type="dxa" w:w="90"/>
+            </w:tcMar>
+          </w:tcPr>
+          <w:p>
+            <w:pPr>
+              <w:spacing w:after="0"/>
+            </w:pPr>
+            <w:r>
+              <w:rPr>
+                <w:rFonts w:ascii="Calibri" w:cs="Calibri" w:eastAsia="Calibri" w:hAnsi="Calibri"/>
+                <w:sz w:val="17"/>
+                <w:szCs w:val="17"/>
+              </w:rPr>
+              <w:t xml:space="preserve">Factsheet sections on coverage (power, steel, cement and aluminium smelting after the 2025 expansion), allocation (free, output-based) and prices</w:t>
+            </w:r>
+          </w:p>
+        </w:tc>
+      </w:tr>
+      <w:tr>
+        <w:tc>
+          <w:tcPr>
+            <w:tcW w:type="dxa" w:w="3600"/>
+            <w:tcMar>
+              <w:top w:type="dxa" w:w="60"/>
+              <w:left w:type="dxa" w:w="90"/>
+              <w:bottom w:type="dxa" w:w="60"/>
+              <w:right w:type="dxa" w:w="90"/>
+            </w:tcMar>
+          </w:tcPr>
+          <w:p>
+            <w:pPr>
+              <w:spacing w:after="0"/>
+            </w:pPr>
+            <w:hyperlink w:history="1" r:id="rIdwlkahgixuxwaubfytzwh8">
               <w:r>
                 <w:rPr>
                   <w:rFonts w:ascii="Calibri" w:cs="Calibri" w:eastAsia="Calibri" w:hAnsi="Calibri"/>
@@ -19596,7 +19722,7 @@
                 <w:sz w:val="17"/>
                 <w:szCs w:val="17"/>
               </w:rPr>
-              <w:t xml:space="preserve">Filterable database of CCS/CCUS facilities by status (operational/construction/planned), sector, and region</w:t>
+              <w:t xml:space="preserve">Manual: iea.org returns 403 to automated requests; fetch the page in a browser. Downloadable list of CO2 capture, transport, storage and use projects by status (operational, construction, planned), sector, country and capacity; projects of at least 100 kt CO2 per year</w:t>
             </w:r>
           </w:p>
         </w:tc>
@@ -19616,7 +19742,7 @@
             <w:pPr>
               <w:spacing w:after="0"/>
             </w:pPr>
-            <w:hyperlink w:history="1" r:id="rIdqhoollizwdgy8joeswouu">
+            <w:hyperlink w:history="1" r:id="rIdhu6t-bvwagngcddf1hxt4">
               <w:r>
                 <w:rPr>
                   <w:rFonts w:ascii="Calibri" w:cs="Calibri" w:eastAsia="Calibri" w:hAnsi="Calibri"/>
@@ -19722,7 +19848,7 @@
                 <w:sz w:val="17"/>
                 <w:szCs w:val="17"/>
               </w:rPr>
-              <w:t xml:space="preserve">Company-level methane reporting status and gold standard reporting members</w:t>
+              <w:t xml:space="preserve">Manual: unep.org returns 403 to automated requests; fetch the report page in a browser. An Eye on Methane 2025 (UNEP IMEO, 22 October 2025): OGMP 2.0 member reporting levels (Gold Standard) and share of global oil and gas production covered</w:t>
             </w:r>
           </w:p>
         </w:tc>
@@ -19742,7 +19868,7 @@
             <w:pPr>
               <w:spacing w:after="0"/>
             </w:pPr>
-            <w:hyperlink w:history="1" r:id="rIdasqodijqb_iiiwlrlmqyi">
+            <w:hyperlink w:history="1" r:id="rIdxxxj9oqjf2c7f0rfrycwe">
               <w:r>
                 <w:rPr>
                   <w:rFonts w:ascii="Calibri" w:cs="Calibri" w:eastAsia="Calibri" w:hAnsi="Calibri"/>
@@ -19848,7 +19974,7 @@
                 <w:sz w:val="17"/>
                 <w:szCs w:val="17"/>
               </w:rPr>
-              <w:t xml:space="preserve">Subscription service; mining equipment and production tracking</w:t>
+              <w:t xml:space="preserve">Manual: Subscription: S&amp;P Global Market Intelligence is a paid service. Subscription service; mining equipment and production tracking</w:t>
             </w:r>
           </w:p>
         </w:tc>
@@ -19865,7 +19991,7 @@
           <w:sz w:val="20"/>
           <w:szCs w:val="20"/>
         </w:rPr>
-        <w:t xml:space="preserve">Periodic PDF report (27)</w:t>
+        <w:t xml:space="preserve">Periodic PDF report (29)</w:t>
       </w:r>
     </w:p>
     <w:p>
@@ -20063,7 +20189,7 @@
             <w:pPr>
               <w:spacing w:after="0"/>
             </w:pPr>
-            <w:hyperlink w:history="1" r:id="rIdzbub5-qewjp2gn0iukn6q">
+            <w:hyperlink w:history="1" r:id="rIdchzghmokwontfjnkcfqhu">
               <w:r>
                 <w:rPr>
                   <w:rFonts w:ascii="Calibri" w:cs="Calibri" w:eastAsia="Calibri" w:hAnsi="Calibri"/>
@@ -20169,7 +20295,7 @@
                 <w:sz w:val="17"/>
                 <w:szCs w:val="17"/>
               </w:rPr>
-              <w:t xml:space="preserve">Subscription service; specific report titles vary by year — verify current title via BNEF's published research index at each review cycle</w:t>
+              <w:t xml:space="preserve">Manual: Subscription: BloombergNEF research needs a paid BloombergNEF subscription. Subscription service; specific report titles vary by year — verify current title via BNEF's published research index at each review cycle</w:t>
             </w:r>
           </w:p>
         </w:tc>
@@ -20189,7 +20315,7 @@
             <w:pPr>
               <w:spacing w:after="0"/>
             </w:pPr>
-            <w:hyperlink w:history="1" r:id="rIdqxy8fkn0vtbvqjlsf428w">
+            <w:hyperlink w:history="1" r:id="rIdp8v0emlsusyhl-rlrfuaw">
               <w:r>
                 <w:rPr>
                   <w:rFonts w:ascii="Calibri" w:cs="Calibri" w:eastAsia="Calibri" w:hAnsi="Calibri"/>
@@ -20295,7 +20421,7 @@
                 <w:sz w:val="17"/>
                 <w:szCs w:val="17"/>
               </w:rPr>
-              <w:t xml:space="preserve">Subscription service; specific report titles vary by year — verify current title via BNEF's published research index at each review cycle</w:t>
+              <w:t xml:space="preserve">Manual: Subscription: BloombergNEF research needs a paid BloombergNEF subscription. Subscription service; specific report titles vary by year — verify current title via BNEF's published research index at each review cycle</w:t>
             </w:r>
           </w:p>
         </w:tc>
@@ -20315,7 +20441,7 @@
             <w:pPr>
               <w:spacing w:after="0"/>
             </w:pPr>
-            <w:hyperlink w:history="1" r:id="rId4s9oumystey6yvwfwz7p8">
+            <w:hyperlink w:history="1" r:id="rId0u-v6_ab2-xqkraudx1ed">
               <w:r>
                 <w:rPr>
                   <w:rFonts w:ascii="Calibri" w:cs="Calibri" w:eastAsia="Calibri" w:hAnsi="Calibri"/>
@@ -20421,7 +20547,7 @@
                 <w:sz w:val="17"/>
                 <w:szCs w:val="17"/>
               </w:rPr>
-              <w:t xml:space="preserve">Subscription service; specific report titles vary by year — verify current title via BNEF's published research index at each review cycle</w:t>
+              <w:t xml:space="preserve">Manual: Subscription: BloombergNEF research needs a paid BloombergNEF subscription. Subscription service; specific report titles vary by year — verify current title via BNEF's published research index at each review cycle</w:t>
             </w:r>
           </w:p>
         </w:tc>
@@ -20441,7 +20567,7 @@
             <w:pPr>
               <w:spacing w:after="0"/>
             </w:pPr>
-            <w:hyperlink w:history="1" r:id="rIdriz8yhetwtjuj85mf8kac">
+            <w:hyperlink w:history="1" r:id="rIdml9zyr5j_60tpcrdgyjc8">
               <w:r>
                 <w:rPr>
                   <w:rFonts w:ascii="Calibri" w:cs="Calibri" w:eastAsia="Calibri" w:hAnsi="Calibri"/>
@@ -20547,7 +20673,7 @@
                 <w:sz w:val="17"/>
                 <w:szCs w:val="17"/>
               </w:rPr>
-              <w:t xml:space="preserve">Subscription service; specific report titles vary by year — verify current title via BNEF's published research index at each review cycle</w:t>
+              <w:t xml:space="preserve">Manual: Subscription: BloombergNEF research needs a paid BloombergNEF subscription. Subscription service; specific report titles vary by year — verify current title via BNEF's published research index at each review cycle</w:t>
             </w:r>
           </w:p>
         </w:tc>
@@ -20567,7 +20693,7 @@
             <w:pPr>
               <w:spacing w:after="0"/>
             </w:pPr>
-            <w:hyperlink w:history="1" r:id="rIdl0vwxqpfibztpt4nvpkqs">
+            <w:hyperlink w:history="1" r:id="rIdlczy0y1tmpxefyqakkqbn">
               <w:r>
                 <w:rPr>
                   <w:rFonts w:ascii="Calibri" w:cs="Calibri" w:eastAsia="Calibri" w:hAnsi="Calibri"/>
@@ -20673,7 +20799,7 @@
                 <w:sz w:val="17"/>
                 <w:szCs w:val="17"/>
               </w:rPr>
-              <w:t xml:space="preserve">IATA SAF programme page; price tracking data typically published via IATA Economics reports and SAF fact sheets</w:t>
+              <w:t xml:space="preserve">Manual: No single document: IATA publishes SAF prices in press releases and economic reports as they come out. IATA SAF programme page; price tracking data typically published via IATA Economics reports and SAF fact sheets</w:t>
             </w:r>
           </w:p>
         </w:tc>
@@ -20693,7 +20819,7 @@
             <w:pPr>
               <w:spacing w:after="0"/>
             </w:pPr>
-            <w:hyperlink w:history="1" r:id="rIdabqkrg0vhlk56yk_j7zii">
+            <w:hyperlink w:history="1" r:id="rIdk419mj8_qykoh_7c_1kqt">
               <w:r>
                 <w:rPr>
                   <w:rFonts w:ascii="Calibri" w:cs="Calibri" w:eastAsia="Calibri" w:hAnsi="Calibri"/>
@@ -20799,7 +20925,7 @@
                 <w:sz w:val="17"/>
                 <w:szCs w:val="17"/>
               </w:rPr>
-              <w:t xml:space="preserve">Annual SAF production volume vs. global jet fuel demand; price differential data</w:t>
+              <w:t xml:space="preserve">SAF fact sheet (PDF, June 2026 edition when checked): SAF production tracker table with annual output and share of jet fuel use; cost relative to conventional jet fuel</w:t>
             </w:r>
           </w:p>
         </w:tc>
@@ -20819,7 +20945,7 @@
             <w:pPr>
               <w:spacing w:after="0"/>
             </w:pPr>
-            <w:hyperlink w:history="1" r:id="rIdbrbbezz1lm5kjnorxxdad">
+            <w:hyperlink w:history="1" r:id="rIdapnivkovsit__hewj3q9g">
               <w:r>
                 <w:rPr>
                   <w:rFonts w:ascii="Calibri" w:cs="Calibri" w:eastAsia="Calibri" w:hAnsi="Calibri"/>
@@ -20925,7 +21051,7 @@
                 <w:sz w:val="17"/>
                 <w:szCs w:val="17"/>
               </w:rPr>
-              <w:t xml:space="preserve">Search publications by 'total cost of ownership' + region; separate reports for EU, US, China</w:t>
+              <w:t xml:space="preserve">Manual: No single document: ICCT publishes a separate TCO study per region; use the latest for each region. Search publications by 'total cost of ownership' + region; separate reports for EU, US, China</w:t>
             </w:r>
           </w:p>
         </w:tc>
@@ -20945,7 +21071,7 @@
             <w:pPr>
               <w:spacing w:after="0"/>
             </w:pPr>
-            <w:hyperlink w:history="1" r:id="rId8aww-bq_-c4fyrv2m1qmn">
+            <w:hyperlink w:history="1" r:id="rIdlv4t78icbstztaogb9cnv">
               <w:r>
                 <w:rPr>
                   <w:rFonts w:ascii="Calibri" w:cs="Calibri" w:eastAsia="Calibri" w:hAnsi="Calibri"/>
@@ -21027,7 +21153,7 @@
                 <w:sz w:val="17"/>
                 <w:szCs w:val="17"/>
               </w:rPr>
-              <w:t xml:space="preserve">annual, typically published October</w:t>
+              <w:t xml:space="preserve">annual</w:t>
             </w:r>
           </w:p>
         </w:tc>
@@ -21051,7 +21177,7 @@
                 <w:sz w:val="17"/>
                 <w:szCs w:val="17"/>
               </w:rPr>
-              <w:t xml:space="preserve">Regional demand projections under STEPS, APS, and NZE scenarios, by fuel and sector</w:t>
+              <w:t xml:space="preserve">Manual: iea.org returns 403 to automated requests; fetch the page in a browser. Aviation tracking page: activity, energy demand, emissions and sustainable aviation fuel progress against the Net Zero Scenario</w:t>
             </w:r>
           </w:p>
         </w:tc>
@@ -21071,7 +21197,7 @@
             <w:pPr>
               <w:spacing w:after="0"/>
             </w:pPr>
-            <w:hyperlink w:history="1" r:id="rIdlfpnswaubtjvl7f0qs3ii">
+            <w:hyperlink w:history="1" r:id="rIdrz9t6cxij5w6agla68o_4">
               <w:r>
                 <w:rPr>
                   <w:rFonts w:ascii="Calibri" w:cs="Calibri" w:eastAsia="Calibri" w:hAnsi="Calibri"/>
@@ -21177,7 +21303,7 @@
                 <w:sz w:val="17"/>
                 <w:szCs w:val="17"/>
               </w:rPr>
-              <w:t xml:space="preserve">IEA Energy System tracking page for cement sector; technology roadmap content integrated into IEA industry tracking</w:t>
+              <w:t xml:space="preserve">Manual: iea.org returns 403 to automated requests; fetch the page in a browser. IEA Energy System tracking page for cement sector; technology roadmap content integrated into IEA industry tracking</w:t>
             </w:r>
           </w:p>
         </w:tc>
@@ -21197,7 +21323,7 @@
             <w:pPr>
               <w:spacing w:after="0"/>
             </w:pPr>
-            <w:hyperlink w:history="1" r:id="rIdvmoohhoajspud3ohc-u_r">
+            <w:hyperlink w:history="1" r:id="rIdyeqa_bk0xyr0zaenpvp50">
               <w:r>
                 <w:rPr>
                   <w:rFonts w:ascii="Calibri" w:cs="Calibri" w:eastAsia="Calibri" w:hAnsi="Calibri"/>
@@ -21303,7 +21429,7 @@
                 <w:sz w:val="17"/>
                 <w:szCs w:val="17"/>
               </w:rPr>
-              <w:t xml:space="preserve">Sub-pages: /market-review, /outlook-for-key-minerals, /executive-summary</w:t>
+              <w:t xml:space="preserve">Manual: iea.org returns 403 to automated requests; fetch the page in a browser. Sub-pages: /market-review, /outlook-for-key-minerals, /executive-summary</w:t>
             </w:r>
           </w:p>
         </w:tc>
@@ -21323,7 +21449,7 @@
             <w:pPr>
               <w:spacing w:after="0"/>
             </w:pPr>
-            <w:hyperlink w:history="1" r:id="rIdupycaccxqrekiuzsohw00">
+            <w:hyperlink w:history="1" r:id="rId1ggujetdlyiyyrxa5xa-a">
               <w:r>
                 <w:rPr>
                   <w:rFonts w:ascii="Calibri" w:cs="Calibri" w:eastAsia="Calibri" w:hAnsi="Calibri"/>
@@ -21429,7 +21555,7 @@
                 <w:sz w:val="17"/>
                 <w:szCs w:val="17"/>
               </w:rPr>
-              <w:t xml:space="preserve">Sub-pages: /market-review, /outlook-for-key-minerals, /executive-summary</w:t>
+              <w:t xml:space="preserve">Manual: iea.org returns 403 to automated requests; fetch the page in a browser. Sub-pages: /market-review, /outlook-for-key-minerals, /executive-summary</w:t>
             </w:r>
           </w:p>
         </w:tc>
@@ -21449,7 +21575,7 @@
             <w:pPr>
               <w:spacing w:after="0"/>
             </w:pPr>
-            <w:hyperlink w:history="1" r:id="rIdnlep5vuiucksnrzr7vixq">
+            <w:hyperlink w:history="1" r:id="rIdtneptcpo2t7xjtixkswh5">
               <w:r>
                 <w:rPr>
                   <w:rFonts w:ascii="Calibri" w:cs="Calibri" w:eastAsia="Calibri" w:hAnsi="Calibri"/>
@@ -21555,7 +21681,7 @@
                 <w:sz w:val="17"/>
                 <w:szCs w:val="17"/>
               </w:rPr>
-              <w:t xml:space="preserve">IEA Energy System tracking page for grid-scale storage; annual data updates within IEA Electricity report</w:t>
+              <w:t xml:space="preserve">Manual: iea.org returns 403 to automated requests; fetch the page in a browser. IEA Energy System tracking page for grid-scale storage; annual data updates within IEA Electricity report</w:t>
             </w:r>
           </w:p>
         </w:tc>
@@ -21575,7 +21701,7 @@
             <w:pPr>
               <w:spacing w:after="0"/>
             </w:pPr>
-            <w:hyperlink w:history="1" r:id="rIdlmv0bvahvvg5tv-ep-y5_">
+            <w:hyperlink w:history="1" r:id="rIddimk3ea9xohutyq4yzmt4">
               <w:r>
                 <w:rPr>
                   <w:rFonts w:ascii="Calibri" w:cs="Calibri" w:eastAsia="Calibri" w:hAnsi="Calibri"/>
@@ -21657,7 +21783,7 @@
                 <w:sz w:val="17"/>
                 <w:szCs w:val="17"/>
               </w:rPr>
-              <w:t xml:space="preserve">annual, typically published October</w:t>
+              <w:t xml:space="preserve">annual, typically published in spring (May in 2025)</w:t>
             </w:r>
           </w:p>
         </w:tc>
@@ -21681,7 +21807,7 @@
                 <w:sz w:val="17"/>
                 <w:szCs w:val="17"/>
               </w:rPr>
-              <w:t xml:space="preserve">Regional demand projections under STEPS, APS, and NZE scenarios, by fuel and sector</w:t>
+              <w:t xml:space="preserve">Manual: iea.org returns 403 to automated requests; fetch the page in a browser. Heavy-duty truck sections: electric truck sales by region and total cost of ownership of electric heavy-duty trucks in several markets</w:t>
             </w:r>
           </w:p>
         </w:tc>
@@ -21701,7 +21827,7 @@
             <w:pPr>
               <w:spacing w:after="0"/>
             </w:pPr>
-            <w:hyperlink w:history="1" r:id="rIdlp-bhy4ryd4a34tsvmdiu">
+            <w:hyperlink w:history="1" r:id="rId6ovjafm1ygdris2t6eiqp">
               <w:r>
                 <w:rPr>
                   <w:rFonts w:ascii="Calibri" w:cs="Calibri" w:eastAsia="Calibri" w:hAnsi="Calibri"/>
@@ -21807,7 +21933,7 @@
                 <w:sz w:val="17"/>
                 <w:szCs w:val="17"/>
               </w:rPr>
-              <w:t xml:space="preserve">Sub-pages: /hydrogen-production, /hydrogen-demand, /policies, /trade-and-infrastructure, /investment-finance-and-innovation</w:t>
+              <w:t xml:space="preserve">Manual: iea.org returns 403 to automated requests; fetch the page in a browser. Sub-pages: /hydrogen-production, /hydrogen-demand, /policies, /trade-and-infrastructure, /investment-finance-and-innovation</w:t>
             </w:r>
           </w:p>
         </w:tc>
@@ -21827,7 +21953,7 @@
             <w:pPr>
               <w:spacing w:after="0"/>
             </w:pPr>
-            <w:hyperlink w:history="1" r:id="rId-131dcxn9mb7ullxmgt-0">
+            <w:hyperlink w:history="1" r:id="rIdlmuasm6l7ern3tr-ad9kf">
               <w:r>
                 <w:rPr>
                   <w:rFonts w:ascii="Calibri" w:cs="Calibri" w:eastAsia="Calibri" w:hAnsi="Calibri"/>
@@ -21933,7 +22059,7 @@
                 <w:sz w:val="17"/>
                 <w:szCs w:val="17"/>
               </w:rPr>
-              <w:t xml:space="preserve">/key-findings sub-page; includes IEA Methane Abatement Model (2024) for country/segment abatement cost curves</w:t>
+              <w:t xml:space="preserve">Manual: iea.org returns 403 to automated requests; fetch the page in a browser. /key-findings sub-page; includes IEA Methane Abatement Model (2024) for country/segment abatement cost curves</w:t>
             </w:r>
           </w:p>
         </w:tc>
@@ -21953,7 +22079,7 @@
             <w:pPr>
               <w:spacing w:after="0"/>
             </w:pPr>
-            <w:hyperlink w:history="1" r:id="rIdkmxf9fybe_56_cn1zvy-5">
+            <w:hyperlink w:history="1" r:id="rId8tij5_nr7ise64f17lnqy">
               <w:r>
                 <w:rPr>
                   <w:rFonts w:ascii="Calibri" w:cs="Calibri" w:eastAsia="Calibri" w:hAnsi="Calibri"/>
@@ -22059,7 +22185,7 @@
                 <w:sz w:val="17"/>
                 <w:szCs w:val="17"/>
               </w:rPr>
-              <w:t xml:space="preserve">/executive-summary sub-page for VRE integration phase assessment by country</w:t>
+              <w:t xml:space="preserve">Manual: iea.org returns 403 to automated requests; fetch the page in a browser. /executive-summary sub-page for VRE integration phase assessment by country</w:t>
             </w:r>
           </w:p>
         </w:tc>
@@ -22079,7 +22205,7 @@
             <w:pPr>
               <w:spacing w:after="0"/>
             </w:pPr>
-            <w:hyperlink w:history="1" r:id="rIdknmhbjipdcwjjvh6230bn">
+            <w:hyperlink w:history="1" r:id="rIdj6d9hw_xlugmvro4ldxho">
               <w:r>
                 <w:rPr>
                   <w:rFonts w:ascii="Calibri" w:cs="Calibri" w:eastAsia="Calibri" w:hAnsi="Calibri"/>
@@ -22161,7 +22287,7 @@
                 <w:sz w:val="17"/>
                 <w:szCs w:val="17"/>
               </w:rPr>
-              <w:t xml:space="preserve">annual, typically published October</w:t>
+              <w:t xml:space="preserve">one-off report (October 2018)</w:t>
             </w:r>
           </w:p>
         </w:tc>
@@ -22185,7 +22311,7 @@
                 <w:sz w:val="17"/>
                 <w:szCs w:val="17"/>
               </w:rPr>
-              <w:t xml:space="preserve">Regional demand projections under STEPS, APS, and NZE scenarios, by fuel and sector</w:t>
+              <w:t xml:space="preserve">Manual: iea.org returns 403 to automated requests; fetch the page in a browser. 2018 report on primary chemicals: production routes, feedstock and energy use by region, and the Clean Technology Scenario's technology options</w:t>
             </w:r>
           </w:p>
         </w:tc>
@@ -22205,7 +22331,7 @@
             <w:pPr>
               <w:spacing w:after="0"/>
             </w:pPr>
-            <w:hyperlink w:history="1" r:id="rIdrc17apki0xnzcjuf9rqys">
+            <w:hyperlink w:history="1" r:id="rIdkjfdqtdtdt6g0bz00034f">
               <w:r>
                 <w:rPr>
                   <w:rFonts w:ascii="Calibri" w:cs="Calibri" w:eastAsia="Calibri" w:hAnsi="Calibri"/>
@@ -22311,7 +22437,7 @@
                 <w:sz w:val="17"/>
                 <w:szCs w:val="17"/>
               </w:rPr>
-              <w:t xml:space="preserve">Annual global and regional energy investment tracking by technology and sector</w:t>
+              <w:t xml:space="preserve">Manual: iea.org returns 403 to automated requests; fetch the page in a browser. Annual global and regional energy investment tracking by technology and sector</w:t>
             </w:r>
           </w:p>
         </w:tc>
@@ -22331,7 +22457,7 @@
             <w:pPr>
               <w:spacing w:after="0"/>
             </w:pPr>
-            <w:hyperlink w:history="1" r:id="rIdjsamhpxgyj_tknsp1i-gy">
+            <w:hyperlink w:history="1" r:id="rIdoeqfskazzkgdgxrevognv">
               <w:r>
                 <w:rPr>
                   <w:rFonts w:ascii="Calibri" w:cs="Calibri" w:eastAsia="Calibri" w:hAnsi="Calibri"/>
@@ -22437,7 +22563,7 @@
                 <w:sz w:val="17"/>
                 <w:szCs w:val="17"/>
               </w:rPr>
-              <w:t xml:space="preserve">Regional demand projections under STEPS, APS, and NZE scenarios, by fuel and sector</w:t>
+              <w:t xml:space="preserve">Manual: iea.org returns 403 to automated requests; fetch the page in a browser. Regional demand projections under STEPS, APS, and NZE scenarios, by fuel and sector</w:t>
             </w:r>
           </w:p>
         </w:tc>
@@ -22457,7 +22583,133 @@
             <w:pPr>
               <w:spacing w:after="0"/>
             </w:pPr>
-            <w:hyperlink w:history="1" r:id="rIdfcpvqeue30t0v9awzi5xa">
+            <w:hyperlink w:history="1" r:id="rId-x5tynw9_tqnwgtk1w0z_">
+              <w:r>
+                <w:rPr>
+                  <w:rFonts w:ascii="Calibri" w:cs="Calibri" w:eastAsia="Calibri" w:hAnsi="Calibri"/>
+                  <w:color w:val="2A4FB7"/>
+                  <w:sz w:val="17"/>
+                  <w:szCs w:val="17"/>
+                  <w:u w:val="single"/>
+                </w:rPr>
+                <w:t xml:space="preserve">IEEFA: China's emissions trading system (ETS) reforms: On track, but needs robust enforcement</w:t>
+              </w:r>
+            </w:hyperlink>
+          </w:p>
+        </w:tc>
+        <w:tc>
+          <w:tcPr>
+            <w:tcW w:type="dxa" w:w="2600"/>
+            <w:tcMar>
+              <w:top w:type="dxa" w:w="60"/>
+              <w:left w:type="dxa" w:w="90"/>
+              <w:bottom w:type="dxa" w:w="60"/>
+              <w:right w:type="dxa" w:w="90"/>
+            </w:tcMar>
+          </w:tcPr>
+          <w:p>
+            <w:pPr>
+              <w:spacing w:after="0"/>
+            </w:pPr>
+            <w:r>
+              <w:rPr>
+                <w:rFonts w:ascii="Calibri" w:cs="Calibri" w:eastAsia="Calibri" w:hAnsi="Calibri"/>
+                <w:sz w:val="17"/>
+                <w:szCs w:val="17"/>
+              </w:rPr>
+              <w:t xml:space="preserve">Institute for Energy Economics and Financial Analysis (IEEFA)</w:t>
+            </w:r>
+          </w:p>
+        </w:tc>
+        <w:tc>
+          <w:tcPr>
+            <w:tcW w:type="dxa" w:w="1900"/>
+            <w:tcMar>
+              <w:top w:type="dxa" w:w="60"/>
+              <w:left w:type="dxa" w:w="90"/>
+              <w:bottom w:type="dxa" w:w="60"/>
+              <w:right w:type="dxa" w:w="90"/>
+            </w:tcMar>
+          </w:tcPr>
+          <w:p>
+            <w:pPr>
+              <w:spacing w:after="0"/>
+            </w:pPr>
+            <w:r>
+              <w:rPr>
+                <w:rFonts w:ascii="Calibri" w:cs="Calibri" w:eastAsia="Calibri" w:hAnsi="Calibri"/>
+                <w:sz w:val="17"/>
+                <w:szCs w:val="17"/>
+              </w:rPr>
+              <w:t xml:space="preserve">CEM-R1, STL-R1</w:t>
+            </w:r>
+          </w:p>
+        </w:tc>
+        <w:tc>
+          <w:tcPr>
+            <w:tcW w:type="dxa" w:w="2100"/>
+            <w:tcMar>
+              <w:top w:type="dxa" w:w="60"/>
+              <w:left w:type="dxa" w:w="90"/>
+              <w:bottom w:type="dxa" w:w="60"/>
+              <w:right w:type="dxa" w:w="90"/>
+            </w:tcMar>
+          </w:tcPr>
+          <w:p>
+            <w:pPr>
+              <w:spacing w:after="0"/>
+            </w:pPr>
+            <w:r>
+              <w:rPr>
+                <w:rFonts w:ascii="Calibri" w:cs="Calibri" w:eastAsia="Calibri" w:hAnsi="Calibri"/>
+                <w:sz w:val="17"/>
+                <w:szCs w:val="17"/>
+              </w:rPr>
+              <w:t xml:space="preserve">one-off report (3 November 2025)</w:t>
+            </w:r>
+          </w:p>
+        </w:tc>
+        <w:tc>
+          <w:tcPr>
+            <w:tcW w:type="dxa" w:w="5198"/>
+            <w:tcMar>
+              <w:top w:type="dxa" w:w="60"/>
+              <w:left w:type="dxa" w:w="90"/>
+              <w:bottom w:type="dxa" w:w="60"/>
+              <w:right w:type="dxa" w:w="90"/>
+            </w:tcMar>
+          </w:tcPr>
+          <w:p>
+            <w:pPr>
+              <w:spacing w:after="0"/>
+            </w:pPr>
+            <w:r>
+              <w:rPr>
+                <w:rFonts w:ascii="Calibri" w:cs="Calibri" w:eastAsia="Calibri" w:hAnsi="Calibri"/>
+                <w:sz w:val="17"/>
+                <w:szCs w:val="17"/>
+              </w:rPr>
+              <w:t xml:space="preserve">Manual: ieefa.org report pages return 403 to automated requests; fetch the page in a browser. Analysis of the national ETS after the 2025 sector expansion: free allocation, the expected move to absolute caps by 2027, and auctions and a fixed cap reduction rate as missing enforcement tools</w:t>
+            </w:r>
+          </w:p>
+        </w:tc>
+      </w:tr>
+      <w:tr>
+        <w:tc>
+          <w:tcPr>
+            <w:tcW w:type="dxa" w:w="3600"/>
+            <w:tcMar>
+              <w:top w:type="dxa" w:w="60"/>
+              <w:left w:type="dxa" w:w="90"/>
+              <w:bottom w:type="dxa" w:w="60"/>
+              <w:right w:type="dxa" w:w="90"/>
+            </w:tcMar>
+          </w:tcPr>
+          <w:p>
+            <w:pPr>
+              <w:spacing w:after="0"/>
+            </w:pPr>
+            <w:hyperlink w:history="1" r:id="rId7s8licmbzutw5grkbuucf">
               <w:r>
                 <w:rPr>
                   <w:rFonts w:ascii="Calibri" w:cs="Calibri" w:eastAsia="Calibri" w:hAnsi="Calibri"/>
@@ -22583,7 +22835,7 @@
             <w:pPr>
               <w:spacing w:after="0"/>
             </w:pPr>
-            <w:hyperlink w:history="1" r:id="rId48aqcjwpmfukpaomgmwwv">
+            <w:hyperlink w:history="1" r:id="rIdv0lr_e-a_skb15ayv6z5n">
               <w:r>
                 <w:rPr>
                   <w:rFonts w:ascii="Calibri" w:cs="Calibri" w:eastAsia="Calibri" w:hAnsi="Calibri"/>
@@ -22709,7 +22961,7 @@
             <w:pPr>
               <w:spacing w:after="0"/>
             </w:pPr>
-            <w:hyperlink w:history="1" r:id="rId5oplgxopvwb2dejgcicyj">
+            <w:hyperlink w:history="1" r:id="rIdy6_uxylfd5qcnxqtpe27c">
               <w:r>
                 <w:rPr>
                   <w:rFonts w:ascii="Calibri" w:cs="Calibri" w:eastAsia="Calibri" w:hAnsi="Calibri"/>
@@ -22815,7 +23067,7 @@
                 <w:sz w:val="17"/>
                 <w:szCs w:val="17"/>
               </w:rPr>
-              <w:t xml:space="preserve">Sector-specific transition strategy reports; check publications page for the current version per sector</w:t>
+              <w:t xml:space="preserve">Manual: Dashboard: the project list is read in MPP's interactive tracker, not a fetchable document. MPP Global Project Tracker: announced, FID and operational near-zero steel plants, updated quarterly</w:t>
             </w:r>
           </w:p>
         </w:tc>
@@ -22835,7 +23087,7 @@
             <w:pPr>
               <w:spacing w:after="0"/>
             </w:pPr>
-            <w:hyperlink w:history="1" r:id="rIdr7wjc_nfrp8r5742m7zlj">
+            <w:hyperlink w:history="1" r:id="rId4j1edmcl-mhhqdxev20j6">
               <w:r>
                 <w:rPr>
                   <w:rFonts w:ascii="Calibri" w:cs="Calibri" w:eastAsia="Calibri" w:hAnsi="Calibri"/>
@@ -22941,7 +23193,7 @@
                 <w:sz w:val="17"/>
                 <w:szCs w:val="17"/>
               </w:rPr>
-              <w:t xml:space="preserve">Sector-specific transition strategy reports; check publications page for the current version per sector</w:t>
+              <w:t xml:space="preserve">Making Net-Zero Steel Possible (MPP steel transition strategy, September 2022): technology cost comparison of hydrogen DRI-EAF against BF-BOF and the hydrogen cost assumptions</w:t>
             </w:r>
           </w:p>
         </w:tc>
@@ -22961,7 +23213,7 @@
             <w:pPr>
               <w:spacing w:after="0"/>
             </w:pPr>
-            <w:hyperlink w:history="1" r:id="rIdg30gz0k_sqd-gyegm6l9x">
+            <w:hyperlink w:history="1" r:id="rId3w7_yhpydt0j_jtqtvvo8">
               <w:r>
                 <w:rPr>
                   <w:rFonts w:ascii="Calibri" w:cs="Calibri" w:eastAsia="Calibri" w:hAnsi="Calibri"/>
@@ -23087,7 +23339,7 @@
             <w:pPr>
               <w:spacing w:after="0"/>
             </w:pPr>
-            <w:hyperlink w:history="1" r:id="rIdfhq4hs-wyygm5t8i54_l2">
+            <w:hyperlink w:history="1" r:id="rIdg0vxl9gqxav3dtgdeq29q">
               <w:r>
                 <w:rPr>
                   <w:rFonts w:ascii="Calibri" w:cs="Calibri" w:eastAsia="Calibri" w:hAnsi="Calibri"/>
@@ -23193,7 +23445,7 @@
                 <w:sz w:val="17"/>
                 <w:szCs w:val="17"/>
               </w:rPr>
-              <w:t xml:space="preserve">Semi-annual OECD Steel Committee market monitoring report</w:t>
+              <w:t xml:space="preserve">Manual: oecd.org returns 403 to automated requests; the semi-annual report is listed on this topic page. Semi-annual OECD Steel Committee market monitoring report</w:t>
             </w:r>
           </w:p>
         </w:tc>
@@ -23213,7 +23465,7 @@
             <w:pPr>
               <w:spacing w:after="0"/>
             </w:pPr>
-            <w:hyperlink w:history="1" r:id="rIdqc0sb18swiums2m-8qm8g">
+            <w:hyperlink w:history="1" r:id="rIdfqprbp7abhllruj0srytf">
               <w:r>
                 <w:rPr>
                   <w:rFonts w:ascii="Calibri" w:cs="Calibri" w:eastAsia="Calibri" w:hAnsi="Calibri"/>
@@ -23319,7 +23571,7 @@
                 <w:sz w:val="17"/>
                 <w:szCs w:val="17"/>
               </w:rPr>
-              <w:t xml:space="preserve">Annual report on corporate renewable procurement volumes by RE100 member companies</w:t>
+              <w:t xml:space="preserve">2024 RE100 annual disclosure report (May 2025): section 4.1 procurement type mix, including recognised PPA volumes by company and market</w:t>
             </w:r>
           </w:p>
         </w:tc>
@@ -23339,7 +23591,133 @@
             <w:pPr>
               <w:spacing w:after="0"/>
             </w:pPr>
-            <w:hyperlink w:history="1" r:id="rIdrwrncbiufum5dzm87txcu">
+            <w:hyperlink w:history="1" r:id="rIdquwwecxxcenhiuw9pymr3">
+              <w:r>
+                <w:rPr>
+                  <w:rFonts w:ascii="Calibri" w:cs="Calibri" w:eastAsia="Calibri" w:hAnsi="Calibri"/>
+                  <w:color w:val="2A4FB7"/>
+                  <w:sz w:val="17"/>
+                  <w:szCs w:val="17"/>
+                  <w:u w:val="single"/>
+                </w:rPr>
+                <w:t xml:space="preserve">Transition Asia: Steel Enters China's National Emissions Trading Scheme</w:t>
+              </w:r>
+            </w:hyperlink>
+          </w:p>
+        </w:tc>
+        <w:tc>
+          <w:tcPr>
+            <w:tcW w:type="dxa" w:w="2600"/>
+            <w:tcMar>
+              <w:top w:type="dxa" w:w="60"/>
+              <w:left w:type="dxa" w:w="90"/>
+              <w:bottom w:type="dxa" w:w="60"/>
+              <w:right w:type="dxa" w:w="90"/>
+            </w:tcMar>
+          </w:tcPr>
+          <w:p>
+            <w:pPr>
+              <w:spacing w:after="0"/>
+            </w:pPr>
+            <w:r>
+              <w:rPr>
+                <w:rFonts w:ascii="Calibri" w:cs="Calibri" w:eastAsia="Calibri" w:hAnsi="Calibri"/>
+                <w:sz w:val="17"/>
+                <w:szCs w:val="17"/>
+              </w:rPr>
+              <w:t xml:space="preserve">Transition Asia</w:t>
+            </w:r>
+          </w:p>
+        </w:tc>
+        <w:tc>
+          <w:tcPr>
+            <w:tcW w:type="dxa" w:w="1900"/>
+            <w:tcMar>
+              <w:top w:type="dxa" w:w="60"/>
+              <w:left w:type="dxa" w:w="90"/>
+              <w:bottom w:type="dxa" w:w="60"/>
+              <w:right w:type="dxa" w:w="90"/>
+            </w:tcMar>
+          </w:tcPr>
+          <w:p>
+            <w:pPr>
+              <w:spacing w:after="0"/>
+            </w:pPr>
+            <w:r>
+              <w:rPr>
+                <w:rFonts w:ascii="Calibri" w:cs="Calibri" w:eastAsia="Calibri" w:hAnsi="Calibri"/>
+                <w:sz w:val="17"/>
+                <w:szCs w:val="17"/>
+              </w:rPr>
+              <w:t xml:space="preserve">STL-R1</w:t>
+            </w:r>
+          </w:p>
+        </w:tc>
+        <w:tc>
+          <w:tcPr>
+            <w:tcW w:type="dxa" w:w="2100"/>
+            <w:tcMar>
+              <w:top w:type="dxa" w:w="60"/>
+              <w:left w:type="dxa" w:w="90"/>
+              <w:bottom w:type="dxa" w:w="60"/>
+              <w:right w:type="dxa" w:w="90"/>
+            </w:tcMar>
+          </w:tcPr>
+          <w:p>
+            <w:pPr>
+              <w:spacing w:after="0"/>
+            </w:pPr>
+            <w:r>
+              <w:rPr>
+                <w:rFonts w:ascii="Calibri" w:cs="Calibri" w:eastAsia="Calibri" w:hAnsi="Calibri"/>
+                <w:sz w:val="17"/>
+                <w:szCs w:val="17"/>
+              </w:rPr>
+              <w:t xml:space="preserve">one-off brief (March 2025)</w:t>
+            </w:r>
+          </w:p>
+        </w:tc>
+        <w:tc>
+          <w:tcPr>
+            <w:tcW w:type="dxa" w:w="5198"/>
+            <w:tcMar>
+              <w:top w:type="dxa" w:w="60"/>
+              <w:left w:type="dxa" w:w="90"/>
+              <w:bottom w:type="dxa" w:w="60"/>
+              <w:right w:type="dxa" w:w="90"/>
+            </w:tcMar>
+          </w:tcPr>
+          <w:p>
+            <w:pPr>
+              <w:spacing w:after="0"/>
+            </w:pPr>
+            <w:r>
+              <w:rPr>
+                <w:rFonts w:ascii="Calibri" w:cs="Calibri" w:eastAsia="Calibri" w:hAnsi="Calibri"/>
+                <w:sz w:val="17"/>
+                <w:szCs w:val="17"/>
+              </w:rPr>
+              <w:t xml:space="preserve">Page 2: the carbon price for a zero green-steel premium at current green hydrogen prices is 890 yuan/t CO2 (about USD 124), 220 yuan/t at China's 2030 hydrogen target of USD 2.4/kg; the evidence text dates this brief September 2025, but the figure is in this March 2025 brief</w:t>
+            </w:r>
+          </w:p>
+        </w:tc>
+      </w:tr>
+      <w:tr>
+        <w:tc>
+          <w:tcPr>
+            <w:tcW w:type="dxa" w:w="3600"/>
+            <w:tcMar>
+              <w:top w:type="dxa" w:w="60"/>
+              <w:left w:type="dxa" w:w="90"/>
+              <w:bottom w:type="dxa" w:w="60"/>
+              <w:right w:type="dxa" w:w="90"/>
+            </w:tcMar>
+          </w:tcPr>
+          <w:p>
+            <w:pPr>
+              <w:spacing w:after="0"/>
+            </w:pPr>
+            <w:hyperlink w:history="1" r:id="rIde2t87kanfutnoltooij4l">
               <w:r>
                 <w:rPr>
                   <w:rFonts w:ascii="Calibri" w:cs="Calibri" w:eastAsia="Calibri" w:hAnsi="Calibri"/>
@@ -23445,7 +23823,7 @@
                 <w:sz w:val="17"/>
                 <w:szCs w:val="17"/>
               </w:rPr>
-              <w:t xml:space="preserve">Annual production, EAF vs. BF-BOF share, and scrap consumption data by country</w:t>
+              <w:t xml:space="preserve">World Steel in Figures 2026 (worldsteel's free summary of the yearbook data, finalised 8 June 2026): crude steel production by process (EAF share) by country and ferrous scrap trade; scrap consumption is not in the free booklet</w:t>
             </w:r>
           </w:p>
         </w:tc>
@@ -23660,7 +24038,7 @@
             <w:pPr>
               <w:spacing w:after="0"/>
             </w:pPr>
-            <w:hyperlink w:history="1" r:id="rIdgg0uzbq8sgc0redl8l8qs">
+            <w:hyperlink w:history="1" r:id="rIdilzs3ix28kukd_bughlio">
               <w:r>
                 <w:rPr>
                   <w:rFonts w:ascii="Calibri" w:cs="Calibri" w:eastAsia="Calibri" w:hAnsi="Calibri"/>
@@ -23786,7 +24164,7 @@
             <w:pPr>
               <w:spacing w:after="0"/>
             </w:pPr>
-            <w:hyperlink w:history="1" r:id="rIdb5-b4iwc0bbn7yooezjzg">
+            <w:hyperlink w:history="1" r:id="rIdyrzmamkrsarxkh3lzmvxn">
               <w:r>
                 <w:rPr>
                   <w:rFonts w:ascii="Calibri" w:cs="Calibri" w:eastAsia="Calibri" w:hAnsi="Calibri"/>
@@ -23892,7 +24270,7 @@
                 <w:sz w:val="17"/>
                 <w:szCs w:val="17"/>
               </w:rPr>
-              <w:t xml:space="preserve">November 2025 MEE allocation plan for steel/cement/aluminium sectors confirms 2024-2025 free allocation basis and 2027 target for absolute cap transition</w:t>
+              <w:t xml:space="preserve">Manual: No single document: NDRC funding runs through several programmes, and no rating has yet been checked against one. NDRC central-budget investment programmes for industrial energy saving and carbon reduction; no single programme document identified yet</w:t>
             </w:r>
           </w:p>
         </w:tc>
@@ -23912,7 +24290,7 @@
             <w:pPr>
               <w:spacing w:after="0"/>
             </w:pPr>
-            <w:hyperlink w:history="1" r:id="rIdmatqg-xbavnuztreosijx">
+            <w:hyperlink w:history="1" r:id="rIdj_6kburz-dzunblwn5mc5">
               <w:r>
                 <w:rPr>
                   <w:rFonts w:ascii="Calibri" w:cs="Calibri" w:eastAsia="Calibri" w:hAnsi="Calibri"/>
@@ -24018,7 +24396,7 @@
                 <w:sz w:val="17"/>
                 <w:szCs w:val="17"/>
               </w:rPr>
-              <w:t xml:space="preserve">Ministry of Ecology and Environment official site; methane action plan published in Chinese, search for '甲烷排放控制行动方案'</w:t>
+              <w:t xml:space="preserve">甲烷排放控制行动方案 (MEE and 10 other departments, November 2023): oil and gas tasks 4-6 (venting control, leak detection and repair, reducing routine flaring) and the aim of zero routine flaring in onshore oil and gas production</w:t>
             </w:r>
           </w:p>
         </w:tc>
@@ -24038,7 +24416,7 @@
             <w:pPr>
               <w:spacing w:after="0"/>
             </w:pPr>
-            <w:hyperlink w:history="1" r:id="rIdryopmdiesdjzoopiybvuv">
+            <w:hyperlink w:history="1" r:id="rIdni0kygqg44au3ikf9khrs">
               <w:r>
                 <w:rPr>
                   <w:rFonts w:ascii="Calibri" w:cs="Calibri" w:eastAsia="Calibri" w:hAnsi="Calibri"/>
@@ -24144,7 +24522,7 @@
                 <w:sz w:val="17"/>
                 <w:szCs w:val="17"/>
               </w:rPr>
-              <w:t xml:space="preserve">Official ministry site; mining licence and approval procedures published in Chinese only — requires translation for non-Chinese-speaking researchers</w:t>
+              <w:t xml:space="preserve">Manual: mnr.gov.cn did not respond to requests from outside China, and approval procedures are spread over several MNR notices in Chinese, with no single document. Official ministry site; mining licence and approval procedures published in Chinese only — requires translation for non-Chinese-speaking researchers</w:t>
             </w:r>
           </w:p>
         </w:tc>
@@ -24164,7 +24542,7 @@
             <w:pPr>
               <w:spacing w:after="0"/>
             </w:pPr>
-            <w:hyperlink w:history="1" r:id="rIdztusuw4h14eb-80p58uba">
+            <w:hyperlink w:history="1" r:id="rId8gkgnic6fplc9sttyhkic">
               <w:r>
                 <w:rPr>
                   <w:rFonts w:ascii="Calibri" w:cs="Calibri" w:eastAsia="Calibri" w:hAnsi="Calibri"/>
@@ -24222,7 +24600,7 @@
                 <w:sz w:val="17"/>
                 <w:szCs w:val="17"/>
               </w:rPr>
-              <w:t xml:space="preserve">STL-R1</w:t>
+              <w:t xml:space="preserve">CEM-R1, STL-R1</w:t>
             </w:r>
           </w:p>
         </w:tc>
@@ -24270,7 +24648,7 @@
                 <w:sz w:val="17"/>
                 <w:szCs w:val="17"/>
               </w:rPr>
-              <w:t xml:space="preserve">November 2025 MEE allocation plan for steel/cement/aluminium sectors confirms 2024-2025 free allocation basis and 2027 target for absolute cap transition</w:t>
+              <w:t xml:space="preserve">MEE allocation plan for steel, cement and aluminium smelting, 2024 and 2025 (issued 18 November 2025), section 三 (配额计算方法): 2024 allowances equal verified 2024 emissions; 2025 allowances by sector emission-intensity balance values. The 2024-2026 start-up stage and the deepening stage from 2027 are in the MEE work plan of 26 March 2025 (mee.gov.cn W020250326367625819894.pdf).</w:t>
             </w:r>
           </w:p>
         </w:tc>
@@ -24290,7 +24668,7 @@
             <w:pPr>
               <w:spacing w:after="0"/>
             </w:pPr>
-            <w:hyperlink w:history="1" r:id="rIdfwyopeouqz2m7cata7pb1">
+            <w:hyperlink w:history="1" r:id="rIdxbd-s1da57tz6psdi2psp">
               <w:r>
                 <w:rPr>
                   <w:rFonts w:ascii="Calibri" w:cs="Calibri" w:eastAsia="Calibri" w:hAnsi="Calibri"/>
@@ -24396,7 +24774,7 @@
                 <w:sz w:val="17"/>
                 <w:szCs w:val="17"/>
               </w:rPr>
-              <w:t xml:space="preserve">Annual and quarterly capacity addition statistics; 14th Five-Year Plan renewable targets (exceeded 1,200 GW wind+solar target in 2024, six years ahead of the original 2030 goal)</w:t>
+              <w:t xml:space="preserve">14th Five-Year Plan for Renewable Energy (NDRC, NEA and seven other bodies, 2021, published June 2022): 2025 targets (专栏 1) and the goal of more than 1,200 GW wind plus solar by 2030; NEA's annual and quarterly capacity statistics are released as separate news items on nea.gov.cn</w:t>
             </w:r>
           </w:p>
         </w:tc>
@@ -24416,7 +24794,7 @@
             <w:pPr>
               <w:spacing w:after="0"/>
             </w:pPr>
-            <w:hyperlink w:history="1" r:id="rId9ahxpvsmspafpg9qvyd9k">
+            <w:hyperlink w:history="1" r:id="rIdrjmolqtnmdfucd2kh_baj">
               <w:r>
                 <w:rPr>
                   <w:rFonts w:ascii="Calibri" w:cs="Calibri" w:eastAsia="Calibri" w:hAnsi="Calibri"/>
@@ -24522,7 +24900,7 @@
                 <w:sz w:val="17"/>
                 <w:szCs w:val="17"/>
               </w:rPr>
-              <w:t xml:space="preserve">NEV credit requirements and commercial vehicle sales share targets</w:t>
+              <w:t xml:space="preserve">MIIT decision amending the dual-credit measures (乘用车企业平均燃料消耗量与新能源汽车积分并行管理办法), in force 1 January 2021: NEV credit ratios by year. The measures cover passenger cars (乘用车) only; no commercial-vehicle NEV credit requirement is in this text</w:t>
             </w:r>
           </w:p>
         </w:tc>
@@ -24542,7 +24920,7 @@
             <w:pPr>
               <w:spacing w:after="0"/>
             </w:pPr>
-            <w:hyperlink w:history="1" r:id="rId6jxmzum3otgg89gyyohqn">
+            <w:hyperlink w:history="1" r:id="rId7xx3fy9r1kivhqw-hbdbu">
               <w:r>
                 <w:rPr>
                   <w:rFonts w:ascii="Calibri" w:cs="Calibri" w:eastAsia="Calibri" w:hAnsi="Calibri"/>
@@ -24648,7 +25026,7 @@
                 <w:sz w:val="17"/>
                 <w:szCs w:val="17"/>
               </w:rPr>
-              <w:t xml:space="preserve">Sector-specific GPP criteria documents, incl. construction/buildings and infrastructure</w:t>
+              <w:t xml:space="preserve">EU GPP criteria for office building design, construction and management (SWD(2016) 180): voluntary criteria, incl. life-cycle assessment (criterion 10.1) and declared embodied CO2 of the main building elements (criterion 8.2); other sector criteria on the GPP criteria page</w:t>
             </w:r>
           </w:p>
         </w:tc>
@@ -24668,7 +25046,7 @@
             <w:pPr>
               <w:spacing w:after="0"/>
             </w:pPr>
-            <w:hyperlink w:history="1" r:id="rIdf_ie1o82ooxcch1pv5w30">
+            <w:hyperlink w:history="1" r:id="rIdjog2vqawwhkmckjfmnj8r">
               <w:r>
                 <w:rPr>
                   <w:rFonts w:ascii="Calibri" w:cs="Calibri" w:eastAsia="Calibri" w:hAnsi="Calibri"/>
@@ -24774,7 +25152,7 @@
                 <w:sz w:val="17"/>
                 <w:szCs w:val="17"/>
               </w:rPr>
-              <w:t xml:space="preserve">Sector-specific GPP criteria documents, incl. construction/buildings and infrastructure</w:t>
+              <w:t xml:space="preserve">EU GPP criteria for office building design, construction and management (SWD(2016) 180): voluntary criteria, incl. life-cycle assessment (criterion 10.1) and declared embodied CO2 of the main building elements (criterion 8.2); other sector criteria on the GPP criteria page</w:t>
             </w:r>
           </w:p>
         </w:tc>
@@ -24794,7 +25172,7 @@
             <w:pPr>
               <w:spacing w:after="0"/>
             </w:pPr>
-            <w:hyperlink w:history="1" r:id="rId3jnqmuvual1qabreazvj1">
+            <w:hyperlink w:history="1" r:id="rIdcjx-yh_gmwxz9ahuipytz">
               <w:r>
                 <w:rPr>
                   <w:rFonts w:ascii="Calibri" w:cs="Calibri" w:eastAsia="Calibri" w:hAnsi="Calibri"/>
@@ -24900,7 +25278,7 @@
                 <w:sz w:val="17"/>
                 <w:szCs w:val="17"/>
               </w:rPr>
-              <w:t xml:space="preserve">Award decisions by call round, searchable by sector and project</w:t>
+              <w:t xml:space="preserve">Manual: Dashboard: awarded projects are listed in CINEA's interactive project portfolio dashboard. Award decisions by call round, searchable by sector and project</w:t>
             </w:r>
           </w:p>
         </w:tc>
@@ -24920,7 +25298,7 @@
             <w:pPr>
               <w:spacing w:after="0"/>
             </w:pPr>
-            <w:hyperlink w:history="1" r:id="rIddhc0kzpijg2tvx5egcl2o">
+            <w:hyperlink w:history="1" r:id="rIdahrk-oqwunxcauinp6m9b">
               <w:r>
                 <w:rPr>
                   <w:rFonts w:ascii="Calibri" w:cs="Calibri" w:eastAsia="Calibri" w:hAnsi="Calibri"/>
@@ -25026,7 +25404,7 @@
                 <w:sz w:val="17"/>
                 <w:szCs w:val="17"/>
               </w:rPr>
-              <w:t xml:space="preserve">State participation list (voluntary pilot phase 2021-2026, first obligatory phase from 2027); China participation status</w:t>
+              <w:t xml:space="preserve">Manual: icao.int returns 403 to automated requests; the CORSIA State pairs document is reissued each year. State participation list (voluntary pilot phase 2021-2026, first obligatory phase from 2027); China participation status</w:t>
             </w:r>
           </w:p>
         </w:tc>
@@ -25046,7 +25424,7 @@
             <w:pPr>
               <w:spacing w:after="0"/>
             </w:pPr>
-            <w:hyperlink w:history="1" r:id="rIducdaahg1r_juca7ddnq3h">
+            <w:hyperlink w:history="1" r:id="rIdb8-iku_8ofaa5azakeb9l">
               <w:r>
                 <w:rPr>
                   <w:rFonts w:ascii="Calibri" w:cs="Calibri" w:eastAsia="Calibri" w:hAnsi="Calibri"/>
@@ -25172,7 +25550,7 @@
             <w:pPr>
               <w:spacing w:after="0"/>
             </w:pPr>
-            <w:hyperlink w:history="1" r:id="rIdzxuhbztqpqpxidxgpaelh">
+            <w:hyperlink w:history="1" r:id="rIdmxrboelxamnkrs5d0g4wv">
               <w:r>
                 <w:rPr>
                   <w:rFonts w:ascii="Calibri" w:cs="Calibri" w:eastAsia="Calibri" w:hAnsi="Calibri"/>
@@ -25298,7 +25676,7 @@
             <w:pPr>
               <w:spacing w:after="0"/>
             </w:pPr>
-            <w:hyperlink w:history="1" r:id="rIdvrhhjku6m63ysxm5bcc2n">
+            <w:hyperlink w:history="1" r:id="rId4k3efwg-dljkogeoiyezs">
               <w:r>
                 <w:rPr>
                   <w:rFonts w:ascii="Calibri" w:cs="Calibri" w:eastAsia="Calibri" w:hAnsi="Calibri"/>
@@ -25404,7 +25782,7 @@
                 <w:sz w:val="17"/>
                 <w:szCs w:val="17"/>
               </w:rPr>
-              <w:t xml:space="preserve">No single global register — International Code Council (US) as a starting reference point; verify per-jurisdiction embodied carbon requirements via national standards bodies named in the criteria</w:t>
+              <w:t xml:space="preserve">Manual: No single register: building codes and their embodied-carbon rules vary by jurisdiction. No single global register — International Code Council (US) as a starting reference point; verify per-jurisdiction embodied carbon requirements via national standards bodies named in the criteria</w:t>
             </w:r>
           </w:p>
         </w:tc>
@@ -25424,7 +25802,7 @@
             <w:pPr>
               <w:spacing w:after="0"/>
             </w:pPr>
-            <w:hyperlink w:history="1" r:id="rIdcg0-4np-u_m2uhb77hgci">
+            <w:hyperlink w:history="1" r:id="rIdmlqn3_amh5q8-bvpbcl1n">
               <w:r>
                 <w:rPr>
                   <w:rFonts w:ascii="Calibri" w:cs="Calibri" w:eastAsia="Calibri" w:hAnsi="Calibri"/>
@@ -25550,7 +25928,7 @@
             <w:pPr>
               <w:spacing w:after="0"/>
             </w:pPr>
-            <w:hyperlink w:history="1" r:id="rIdnit1uzz76igozugekvwax">
+            <w:hyperlink w:history="1" r:id="rIdopdoeaijqgdfatsrz3jtd">
               <w:r>
                 <w:rPr>
                   <w:rFonts w:ascii="Calibri" w:cs="Calibri" w:eastAsia="Calibri" w:hAnsi="Calibri"/>
@@ -25656,7 +26034,7 @@
                 <w:sz w:val="17"/>
                 <w:szCs w:val="17"/>
               </w:rPr>
-              <w:t xml:space="preserve">Final rule and implementation status; subject to ongoing litigation and potential reconsideration under the current administration</w:t>
+              <w:t xml:space="preserve">Final rule, 89 FR 29440 (22 April 2024): CO2 standards for heavy-duty vehicles, model years 2027-2032. Repealed with all vehicle GHG standards by 91 FR 7686 (18 February 2026, effective 20 April 2026, FR doc 2026-03157)</w:t>
             </w:r>
           </w:p>
         </w:tc>
@@ -25676,7 +26054,7 @@
             <w:pPr>
               <w:spacing w:after="0"/>
             </w:pPr>
-            <w:hyperlink w:history="1" r:id="rId-v00am4eykolvvsyehqu4">
+            <w:hyperlink w:history="1" r:id="rIdj7k-yhtjz8dmldngsyozq">
               <w:r>
                 <w:rPr>
                   <w:rFonts w:ascii="Calibri" w:cs="Calibri" w:eastAsia="Calibri" w:hAnsi="Calibri"/>
@@ -25782,7 +26160,7 @@
                 <w:sz w:val="17"/>
                 <w:szCs w:val="17"/>
               </w:rPr>
-              <w:t xml:space="preserve">Congressional Review Act joint resolution (H.J.Res.35, P.L. 119-2, signed 14 March 2025) nullified the 2024 WEC implementing rule; EPA barred from collecting the charge until 2034; underlying statutory obligation remains but is currently unenforceable</w:t>
+              <w:t xml:space="preserve">EPA notice (90 FR 21225, 19 May 2025) removing the 2024 WEC implementing rule after the Congressional Review Act joint resolution (H.J.Res.35, P.L. 119-2, signed 14 March 2025) nullified it. The charge itself is delayed by P.L. 119-21 section 60012(b), which replaces 'calendar year 2024' with 'calendar year 2034' in Clean Air Act section 136(g); the underlying statutory obligation remains.</w:t>
             </w:r>
           </w:p>
         </w:tc>
@@ -25802,7 +26180,7 @@
             <w:pPr>
               <w:spacing w:after="0"/>
             </w:pPr>
-            <w:hyperlink w:history="1" r:id="rId01r_53smm8b7caklosce1">
+            <w:hyperlink w:history="1" r:id="rIdkowvurxifxqiuokpkugui">
               <w:r>
                 <w:rPr>
                   <w:rFonts w:ascii="Calibri" w:cs="Calibri" w:eastAsia="Calibri" w:hAnsi="Calibri"/>
@@ -25908,7 +26286,7 @@
                 <w:sz w:val="17"/>
                 <w:szCs w:val="17"/>
               </w:rPr>
-              <w:t xml:space="preserve">Low-embodied-carbon material procurement standards for federal construction contracts</w:t>
+              <w:t xml:space="preserve">Biden-era progress report on the Federal Buy Clean Initiative (low-embodied-carbon material purchases by GSA, FHWA and EPA); EO 14057, which set up Buy Clean, was rescinded in January 2025</w:t>
             </w:r>
           </w:p>
         </w:tc>
@@ -25928,7 +26306,7 @@
             <w:pPr>
               <w:spacing w:after="0"/>
             </w:pPr>
-            <w:hyperlink w:history="1" r:id="rIdithsukjpdgstqcyjf4plm">
+            <w:hyperlink w:history="1" r:id="rIdg2jn12saiggec5vi80zyz">
               <w:r>
                 <w:rPr>
                   <w:rFonts w:ascii="Calibri" w:cs="Calibri" w:eastAsia="Calibri" w:hAnsi="Calibri"/>
@@ -26034,7 +26412,7 @@
                 <w:sz w:val="17"/>
                 <w:szCs w:val="17"/>
               </w:rPr>
-              <w:t xml:space="preserve">Track federal permitting reform legislation via Congress.gov; also monitor Federal Permitting Improvement Steering Council dashboard</w:t>
+              <w:t xml:space="preserve">Manual: congress.gov returns 403 to automated requests, and the tracker spans several bills and the Permitting Council dashboard. Track federal permitting reform legislation via Congress.gov; also monitor Federal Permitting Improvement Steering Council dashboard</w:t>
             </w:r>
           </w:p>
         </w:tc>
@@ -26054,7 +26432,7 @@
             <w:pPr>
               <w:spacing w:after="0"/>
             </w:pPr>
-            <w:hyperlink w:history="1" r:id="rIdxkyizcr-ll62fu8ic2vwn">
+            <w:hyperlink w:history="1" r:id="rIdakkf9pg8gvqoynlentdew">
               <w:r>
                 <w:rPr>
                   <w:rFonts w:ascii="Calibri" w:cs="Calibri" w:eastAsia="Calibri" w:hAnsi="Calibri"/>
@@ -26180,7 +26558,7 @@
             <w:pPr>
               <w:spacing w:after="0"/>
             </w:pPr>
-            <w:hyperlink w:history="1" r:id="rIdkwudoklsujiupskp0kdnf">
+            <w:hyperlink w:history="1" r:id="rIduirswryd429mfdyl362_p">
               <w:r>
                 <w:rPr>
                   <w:rFonts w:ascii="Calibri" w:cs="Calibri" w:eastAsia="Calibri" w:hAnsi="Calibri"/>
@@ -26286,7 +26664,7 @@
                 <w:sz w:val="17"/>
                 <w:szCs w:val="17"/>
               </w:rPr>
-              <w:t xml:space="preserve">Low-embodied-carbon material procurement standards for federal construction contracts</w:t>
+              <w:t xml:space="preserve">SAF Grand Challenge Roadmap (DOE, September 2022): the goals of 3 billion gallons of SAF per year by 2030 and 35 billion by 2050, a volume goal rather than a blending mandate. The IRA section 40B SAF credit is Treasury/IRS guidance and is not in this document.</w:t>
             </w:r>
           </w:p>
         </w:tc>
@@ -26603,7 +26981,7 @@
                 <w:sz w:val="17"/>
                 <w:szCs w:val="17"/>
               </w:rPr>
-              <w:t xml:space="preserve">No single URL — retrieve from the specific company's investor relations page (annual report, capital markets day materials, or sustainability report). Identify relevant companies via sector leaders named in Mission Possible Partnership / BloombergNEF sector trackers, then search each company's IR site directly. This is the source type flagged in the Automation Pipeline Design Document (Section 5.6) as requiring discovery-and-triage rather than single-URL retrieval.</w:t>
+              <w:t xml:space="preserve">Manual: Company disclosure: no single URL; which companies matter depends on who is assessed. No single URL — retrieve from the specific company's investor relations page (annual report, capital markets day materials, or sustainability report). Identify relevant companies via sector leaders named in Mission Possible Partnership / BloombergNEF sector trackers, then search each company's IR site directly. This is the source type flagged in the Automation Pipeline Design Document (Section 5.6) as requiring discovery-and-triage rather than single-URL retrieval.</w:t>
             </w:r>
           </w:p>
         </w:tc>
@@ -26725,7 +27103,7 @@
                 <w:sz w:val="17"/>
                 <w:szCs w:val="17"/>
               </w:rPr>
-              <w:t xml:space="preserve">No single URL — retrieve from the specific company's investor relations page (annual report, capital markets day materials, or sustainability report). Identify relevant companies via sector leaders named in Mission Possible Partnership / BloombergNEF sector trackers, then search each company's IR site directly. This is the source type flagged in the Automation Pipeline Design Document (Section 5.6) as requiring discovery-and-triage rather than single-URL retrieval.</w:t>
+              <w:t xml:space="preserve">Manual: Company disclosure: no single URL; which companies matter depends on who is assessed. No single URL — retrieve from the specific company's investor relations page (annual report, capital markets day materials, or sustainability report). Identify relevant companies via sector leaders named in Mission Possible Partnership / BloombergNEF sector trackers, then search each company's IR site directly. This is the source type flagged in the Automation Pipeline Design Document (Section 5.6) as requiring discovery-and-triage rather than single-URL retrieval.</w:t>
             </w:r>
           </w:p>
         </w:tc>
@@ -26847,7 +27225,7 @@
                 <w:sz w:val="17"/>
                 <w:szCs w:val="17"/>
               </w:rPr>
-              <w:t xml:space="preserve">No single URL — retrieve from the specific company's investor relations page (annual report, capital markets day materials, or sustainability report). Identify relevant companies via sector leaders named in Mission Possible Partnership / BloombergNEF sector trackers, then search each company's IR site directly. This is the source type flagged in the Automation Pipeline Design Document (Section 5.6) as requiring discovery-and-triage rather than single-URL retrieval.</w:t>
+              <w:t xml:space="preserve">Manual: Company disclosure: no single URL; which companies matter depends on who is assessed. No single URL — retrieve from the specific company's investor relations page (annual report, capital markets day materials, or sustainability report). Identify relevant companies via sector leaders named in Mission Possible Partnership / BloombergNEF sector trackers, then search each company's IR site directly. This is the source type flagged in the Automation Pipeline Design Document (Section 5.6) as requiring discovery-and-triage rather than single-URL retrieval.</w:t>
             </w:r>
           </w:p>
         </w:tc>
@@ -26969,7 +27347,7 @@
                 <w:sz w:val="17"/>
                 <w:szCs w:val="17"/>
               </w:rPr>
-              <w:t xml:space="preserve">No single URL — retrieve from the specific company's investor relations page (annual report, capital markets day materials, or sustainability report). Identify relevant companies via sector leaders named in Mission Possible Partnership / BloombergNEF sector trackers, then search each company's IR site directly. This is the source type flagged in the Automation Pipeline Design Document (Section 5.6) as requiring discovery-and-triage rather than single-URL retrieval.</w:t>
+              <w:t xml:space="preserve">Manual: Company disclosure: no single URL; which companies matter depends on who is assessed. No single URL — retrieve from the specific company's investor relations page (annual report, capital markets day materials, or sustainability report). Identify relevant companies via sector leaders named in Mission Possible Partnership / BloombergNEF sector trackers, then search each company's IR site directly. This is the source type flagged in the Automation Pipeline Design Document (Section 5.6) as requiring discovery-and-triage rather than single-URL retrieval.</w:t>
             </w:r>
           </w:p>
         </w:tc>
@@ -27091,7 +27469,7 @@
                 <w:sz w:val="17"/>
                 <w:szCs w:val="17"/>
               </w:rPr>
-              <w:t xml:space="preserve">No single URL — retrieve from the specific company's investor relations page (annual report, capital markets day materials, or sustainability report). Identify relevant companies via sector leaders named in Mission Possible Partnership / BloombergNEF sector trackers, then search each company's IR site directly. This is the source type flagged in the Automation Pipeline Design Document (Section 5.6) as requiring discovery-and-triage rather than single-URL retrieval.</w:t>
+              <w:t xml:space="preserve">Manual: Company disclosure: no single URL; which companies matter depends on who is assessed. No single URL — retrieve from the specific company's investor relations page (annual report, capital markets day materials, or sustainability report). Identify relevant companies via sector leaders named in Mission Possible Partnership / BloombergNEF sector trackers, then search each company's IR site directly. This is the source type flagged in the Automation Pipeline Design Document (Section 5.6) as requiring discovery-and-triage rather than single-URL retrieval.</w:t>
             </w:r>
           </w:p>
         </w:tc>
@@ -27213,7 +27591,7 @@
                 <w:sz w:val="17"/>
                 <w:szCs w:val="17"/>
               </w:rPr>
-              <w:t xml:space="preserve">No single URL — retrieve from the specific company's investor relations page (annual report, capital markets day materials, or sustainability report). Identify relevant companies via sector leaders named in Mission Possible Partnership / BloombergNEF sector trackers, then search each company's IR site directly. This is the source type flagged in the Automation Pipeline Design Document (Section 5.6) as requiring discovery-and-triage rather than single-URL retrieval.</w:t>
+              <w:t xml:space="preserve">Manual: Company disclosure: no single URL; which companies matter depends on who is assessed. No single URL — retrieve from the specific company's investor relations page (annual report, capital markets day materials, or sustainability report). Identify relevant companies via sector leaders named in Mission Possible Partnership / BloombergNEF sector trackers, then search each company's IR site directly. This is the source type flagged in the Automation Pipeline Design Document (Section 5.6) as requiring discovery-and-triage rather than single-URL retrieval.</w:t>
             </w:r>
           </w:p>
         </w:tc>
@@ -27335,7 +27713,7 @@
                 <w:sz w:val="17"/>
                 <w:szCs w:val="17"/>
               </w:rPr>
-              <w:t xml:space="preserve">No single URL — retrieve from the specific company's investor relations page (annual report, capital markets day materials, or sustainability report). Identify relevant companies via sector leaders named in Mission Possible Partnership / BloombergNEF sector trackers, then search each company's IR site directly. This is the source type flagged in the Automation Pipeline Design Document (Section 5.6) as requiring discovery-and-triage rather than single-URL retrieval.</w:t>
+              <w:t xml:space="preserve">Manual: Company disclosure: no single URL; which companies matter depends on who is assessed. No single URL — retrieve from the specific company's investor relations page (annual report, capital markets day materials, or sustainability report). Identify relevant companies via sector leaders named in Mission Possible Partnership / BloombergNEF sector trackers, then search each company's IR site directly. This is the source type flagged in the Automation Pipeline Design Document (Section 5.6) as requiring discovery-and-triage rather than single-URL retrieval.</w:t>
             </w:r>
           </w:p>
         </w:tc>
@@ -27391,28 +27769,7 @@
           <w:sz w:val="20"/>
           <w:szCs w:val="20"/>
         </w:rPr>
-        <w:t xml:space="preserve">Two source URLs look copy-pasted from a neighbouring entry and have been left as-is rather than guessed at: US_SAF_Grand_Challenge_IRA_40B_tax_credit points at sustainability.gov/buyclean (the Buy Clean entry's URL), and IEA_CCUS_Projects_Database points at co2re.co (the Global CCS Institute's URL). Both need a human to re-source.</w:t>
-      </w:r>
-    </w:p>
-    <w:p>
-      <w:pPr>
-        <w:spacing w:after="100"/>
-      </w:pPr>
-      <w:r>
-        <w:rPr>
-          <w:rFonts w:ascii="Calibri" w:cs="Calibri" w:eastAsia="Calibri" w:hAnsi="Calibri"/>
-          <w:sz w:val="20"/>
-          <w:szCs w:val="20"/>
-        </w:rPr>
-        <w:t xml:space="preserve">•  </w:t>
-      </w:r>
-      <w:r>
-        <w:rPr>
-          <w:rFonts w:ascii="Calibri" w:cs="Calibri" w:eastAsia="Calibri" w:hAnsi="Calibri"/>
-          <w:sz w:val="20"/>
-          <w:szCs w:val="20"/>
-        </w:rPr>
-        <w:t xml:space="preserve">95 criterion-source links dedupe to 86 registry entries. The registry keeps per-criterion duplicates for company disclosures rather than sharing one key.</w:t>
+        <w:t xml:space="preserve">102 criterion-source links dedupe to 89 registry entries. The registry keeps per-criterion duplicates for company disclosures rather than sharing one key.</w:t>
       </w:r>
     </w:p>
     <w:p>
@@ -27475,7 +27832,7 @@
           <w:sz w:val="20"/>
           <w:szCs w:val="20"/>
         </w:rPr>
-        <w:t xml:space="preserve">7 of 95 source entries carry no URL. These are the company_disclosure entries, which correctly record a retrieval methodology instead.</w:t>
+        <w:t xml:space="preserve">7 of 102 source entries carry no URL. These are the company_disclosure entries, which correctly record a retrieval methodology instead.</w:t>
       </w:r>
     </w:p>
     <w:sectPr>
@@ -27486,10 +27843,6 @@
     </w:sectPr>
   </w:body>
 </w:document>
-</file>
-
-<file path=word/comments.xml><?xml version="1.0" encoding="utf-8"?>
-<w:comments xmlns:cx="http://schemas.microsoft.com/office/drawing/2014/chartex" xmlns:cx1="http://schemas.microsoft.com/office/drawing/2015/9/8/chartex" xmlns:cx2="http://schemas.microsoft.com/office/drawing/2015/10/21/chartex" xmlns:cx3="http://schemas.microsoft.com/office/drawing/2016/5/9/chartex" xmlns:cx4="http://schemas.microsoft.com/office/drawing/2016/5/10/chartex" xmlns:cx5="http://schemas.microsoft.com/office/drawing/2016/5/11/chartex" xmlns:cx6="http://schemas.microsoft.com/office/drawing/2016/5/12/chartex" xmlns:cx7="http://schemas.microsoft.com/office/drawing/2016/5/13/chartex" xmlns:cx8="http://schemas.microsoft.com/office/drawing/2016/5/14/chartex" xmlns:mc="http://schemas.openxmlformats.org/markup-compatibility/2006" xmlns:aink="http://schemas.microsoft.com/office/drawing/2016/ink" xmlns:am3d="http://schemas.microsoft.com/office/drawing/2017/model3d" xmlns:o="urn:schemas-microsoft-com:office:office" xmlns:r="http://schemas.openxmlformats.org/officeDocument/2006/relationships" xmlns:m="http://schemas.openxmlformats.org/officeDocument/2006/math" xmlns:v="urn:schemas-microsoft-com:vml" xmlns:wp14="http://schemas.microsoft.com/office/word/2010/wordprocessingDrawing" xmlns:wp="http://schemas.openxmlformats.org/drawingml/2006/wordprocessingDrawing" xmlns:w10="urn:schemas-microsoft-com:office:word" xmlns:w="http://schemas.openxmlformats.org/wordprocessingml/2006/main" xmlns:w14="http://schemas.microsoft.com/office/word/2010/wordml" xmlns:w15="http://schemas.microsoft.com/office/word/2012/wordml" xmlns:w16cex="http://schemas.microsoft.com/office/word/2018/wordml/cex" xmlns:w16cid="http://schemas.microsoft.com/office/word/2016/wordml/cid" xmlns:w16="http://schemas.microsoft.com/office/word/2018/wordml" xmlns:w16sdtdh="http://schemas.microsoft.com/office/word/2020/wordml/sdtdatahash" xmlns:w16se="http://schemas.microsoft.com/office/word/2015/wordml/symex" xmlns:wpg="http://schemas.microsoft.com/office/word/2010/wordprocessingGroup" xmlns:wpi="http://schemas.microsoft.com/office/word/2010/wordprocessingInk" xmlns:wne="http://schemas.microsoft.com/office/word/2006/wordml" xmlns:wps="http://schemas.microsoft.com/office/word/2010/wordprocessingShape"/>
 </file>
 
 <file path=word/endnotes.xml><?xml version="1.0" encoding="utf-8"?>
@@ -27570,7 +27923,7 @@
 <w:numbering xmlns:wpc="http://schemas.microsoft.com/office/word/2010/wordprocessingCanvas" xmlns:mc="http://schemas.openxmlformats.org/markup-compatibility/2006" xmlns:o="urn:schemas-microsoft-com:office:office" xmlns:r="http://schemas.openxmlformats.org/officeDocument/2006/relationships" xmlns:m="http://schemas.openxmlformats.org/officeDocument/2006/math" xmlns:v="urn:schemas-microsoft-com:vml" xmlns:wp14="http://schemas.microsoft.com/office/word/2010/wordprocessingDrawing" xmlns:wp="http://schemas.openxmlformats.org/drawingml/2006/wordprocessingDrawing" xmlns:w10="urn:schemas-microsoft-com:office:word" xmlns:w="http://schemas.openxmlformats.org/wordprocessingml/2006/main" xmlns:w14="http://schemas.microsoft.com/office/word/2010/wordml" xmlns:w15="http://schemas.microsoft.com/office/word/2012/wordml" xmlns:wpg="http://schemas.microsoft.com/office/word/2010/wordprocessingGroup" xmlns:wpi="http://schemas.microsoft.com/office/word/2010/wordprocessingInk" xmlns:wne="http://schemas.microsoft.com/office/word/2006/wordml" xmlns:wps="http://schemas.microsoft.com/office/word/2010/wordprocessingShape" mc:Ignorable="w14 w15 wp14">
   <w:abstractNum w:abstractNumId="1" w15:restartNumberingAfterBreak="0">
     <w:multiLevelType w:val="hybridMultilevel"/>
-    <w:lvl w:ilvl="0" w15:tentative="1">
+    <w:lvl w:ilvl="0" w:tentative="1">
       <w:start w:val="1"/>
       <w:numFmt w:val="bullet"/>
       <w:lvlText w:val="●"/>
@@ -27579,7 +27932,7 @@
         <w:ind w:left="720" w:hanging="360"/>
       </w:pPr>
     </w:lvl>
-    <w:lvl w:ilvl="1" w15:tentative="1">
+    <w:lvl w:ilvl="1" w:tentative="1">
       <w:start w:val="1"/>
       <w:numFmt w:val="bullet"/>
       <w:lvlText w:val="○"/>
@@ -27588,7 +27941,7 @@
         <w:ind w:left="1440" w:hanging="360"/>
       </w:pPr>
     </w:lvl>
-    <w:lvl w:ilvl="2" w15:tentative="1">
+    <w:lvl w:ilvl="2" w:tentative="1">
       <w:start w:val="1"/>
       <w:numFmt w:val="bullet"/>
       <w:lvlText w:val="■"/>
@@ -27597,7 +27950,7 @@
         <w:ind w:left="2160" w:hanging="360"/>
       </w:pPr>
     </w:lvl>
-    <w:lvl w:ilvl="3" w15:tentative="1">
+    <w:lvl w:ilvl="3" w:tentative="1">
       <w:start w:val="1"/>
       <w:numFmt w:val="bullet"/>
       <w:lvlText w:val="●"/>
@@ -27606,7 +27959,7 @@
         <w:ind w:left="2880" w:hanging="360"/>
       </w:pPr>
     </w:lvl>
-    <w:lvl w:ilvl="4" w15:tentative="1">
+    <w:lvl w:ilvl="4" w:tentative="1">
       <w:start w:val="1"/>
       <w:numFmt w:val="bullet"/>
       <w:lvlText w:val="○"/>
@@ -27615,7 +27968,7 @@
         <w:ind w:left="3600" w:hanging="360"/>
       </w:pPr>
     </w:lvl>
-    <w:lvl w:ilvl="5" w15:tentative="1">
+    <w:lvl w:ilvl="5" w:tentative="1">
       <w:start w:val="1"/>
       <w:numFmt w:val="bullet"/>
       <w:lvlText w:val="■"/>
@@ -27624,7 +27977,7 @@
         <w:ind w:left="4320" w:hanging="360"/>
       </w:pPr>
     </w:lvl>
-    <w:lvl w:ilvl="6" w15:tentative="1">
+    <w:lvl w:ilvl="6" w:tentative="1">
       <w:start w:val="1"/>
       <w:numFmt w:val="bullet"/>
       <w:lvlText w:val="●"/>
@@ -27633,7 +27986,7 @@
         <w:ind w:left="5040" w:hanging="360"/>
       </w:pPr>
     </w:lvl>
-    <w:lvl w:ilvl="7" w15:tentative="1">
+    <w:lvl w:ilvl="7" w:tentative="1">
       <w:start w:val="1"/>
       <w:numFmt w:val="bullet"/>
       <w:lvlText w:val="●"/>
@@ -27642,7 +27995,7 @@
         <w:ind w:left="5760" w:hanging="360"/>
       </w:pPr>
     </w:lvl>
-    <w:lvl w:ilvl="8" w15:tentative="1">
+    <w:lvl w:ilvl="8" w:tentative="1">
       <w:start w:val="1"/>
       <w:numFmt w:val="bullet"/>
       <w:lvlText w:val="●"/>
@@ -27667,6 +28020,25 @@
     <w:rPrDefault/>
     <w:pPrDefault/>
   </w:docDefaults>
+  <w:style w:type="paragraph" w:styleId="Normal" w:default="1">
+    <w:name w:val="Normal"/>
+    <w:qFormat/>
+  </w:style>
+  <w:style w:type="table" w:styleId="TableNormal" w:default="true">
+    <w:name w:val="Normal Table"/>
+    <w:uiPriority w:val="99"/>
+    <w:semiHidden/>
+    <w:unhideWhenUsed/>
+    <w:tblPr>
+      <w:tblInd w:type="dxa" w:w="0"/>
+      <w:tblCellMar>
+        <w:top w:type="dxa" w:w="0"/>
+        <w:left w:type="dxa" w:w="108"/>
+        <w:bottom w:type="dxa" w:w="0"/>
+        <w:right w:type="dxa" w:w="108"/>
+      </w:tblCellMar>
+    </w:tblPr>
+  </w:style>
   <w:style w:type="paragraph" w:styleId="Title">
     <w:name w:val="Title"/>
     <w:basedOn w:val="Normal"/>
@@ -27851,4 +28223,294 @@
     </w:rPr>
   </w:style>
 </w:styles>
+</file>
+
+<file path=word/theme/theme1.xml><?xml version="1.0" encoding="utf-8"?>
+<a:theme xmlns:a="http://schemas.openxmlformats.org/drawingml/2006/main" name="Office Theme">
+  <a:themeElements>
+    <a:clrScheme name="Office">
+      <a:dk1>
+        <a:sysClr val="windowText" lastClr="000000"/>
+      </a:dk1>
+      <a:lt1>
+        <a:sysClr val="window" lastClr="FFFFFF"/>
+      </a:lt1>
+      <a:dk2>
+        <a:srgbClr val="44546A"/>
+      </a:dk2>
+      <a:lt2>
+        <a:srgbClr val="E7E6E6"/>
+      </a:lt2>
+      <a:accent1>
+        <a:srgbClr val="4472C4"/>
+      </a:accent1>
+      <a:accent2>
+        <a:srgbClr val="ED7D31"/>
+      </a:accent2>
+      <a:accent3>
+        <a:srgbClr val="A5A5A5"/>
+      </a:accent3>
+      <a:accent4>
+        <a:srgbClr val="FFC000"/>
+      </a:accent4>
+      <a:accent5>
+        <a:srgbClr val="5B9BD5"/>
+      </a:accent5>
+      <a:accent6>
+        <a:srgbClr val="70AD47"/>
+      </a:accent6>
+      <a:hlink>
+        <a:srgbClr val="0563C1"/>
+      </a:hlink>
+      <a:folHlink>
+        <a:srgbClr val="954F72"/>
+      </a:folHlink>
+    </a:clrScheme>
+    <a:fontScheme name="Office">
+      <a:majorFont>
+        <a:latin typeface="Calibri Light" panose="020F0302020204030204"/>
+        <a:ea typeface=""/>
+        <a:cs typeface=""/>
+        <a:font script="Jpan" typeface="游ゴシック Light"/>
+        <a:font script="Hang" typeface="맑은 고딕"/>
+        <a:font script="Hans" typeface="等线 Light"/>
+        <a:font script="Hant" typeface="新細明體"/>
+        <a:font script="Arab" typeface="Times New Roman"/>
+        <a:font script="Hebr" typeface="Times New Roman"/>
+        <a:font script="Thai" typeface="Angsana New"/>
+        <a:font script="Ethi" typeface="Nyala"/>
+        <a:font script="Beng" typeface="Vrinda"/>
+        <a:font script="Gujr" typeface="Shruti"/>
+        <a:font script="Khmr" typeface="MoolBoran"/>
+        <a:font script="Knda" typeface="Tunga"/>
+        <a:font script="Guru" typeface="Raavi"/>
+        <a:font script="Cans" typeface="Euphemia"/>
+        <a:font script="Cher" typeface="Plantagenet Cherokee"/>
+        <a:font script="Yiii" typeface="Microsoft Yi Baiti"/>
+        <a:font script="Tibt" typeface="Microsoft Himalaya"/>
+        <a:font script="Thaa" typeface="MV Boli"/>
+        <a:font script="Deva" typeface="Mangal"/>
+        <a:font script="Telu" typeface="Gautami"/>
+        <a:font script="Taml" typeface="Latha"/>
+        <a:font script="Syrc" typeface="Estrangelo Edessa"/>
+        <a:font script="Orya" typeface="Kalinga"/>
+        <a:font script="Mlym" typeface="Kartika"/>
+        <a:font script="Laoo" typeface="DokChampa"/>
+        <a:font script="Sinh" typeface="Iskoola Pota"/>
+        <a:font script="Mong" typeface="Mongolian Baiti"/>
+        <a:font script="Viet" typeface="Times New Roman"/>
+        <a:font script="Uigh" typeface="Microsoft Uighur"/>
+        <a:font script="Geor" typeface="Sylfaen"/>
+        <a:font script="Armn" typeface="Arial"/>
+        <a:font script="Bugi" typeface="Leelawadee UI"/>
+        <a:font script="Bopo" typeface="Microsoft JhengHei"/>
+        <a:font script="Java" typeface="Javanese Text"/>
+        <a:font script="Lisu" typeface="Segoe UI"/>
+        <a:font script="Mymr" typeface="Myanmar Text"/>
+        <a:font script="Nkoo" typeface="Ebrima"/>
+        <a:font script="Olck" typeface="Nirmala UI"/>
+        <a:font script="Osma" typeface="Ebrima"/>
+        <a:font script="Phag" typeface="Phagspa"/>
+        <a:font script="Syrn" typeface="Estrangelo Edessa"/>
+        <a:font script="Syrj" typeface="Estrangelo Edessa"/>
+        <a:font script="Syre" typeface="Estrangelo Edessa"/>
+        <a:font script="Sora" typeface="Nirmala UI"/>
+        <a:font script="Tale" typeface="Microsoft Tai Le"/>
+        <a:font script="Talu" typeface="Microsoft New Tai Lue"/>
+        <a:font script="Tfng" typeface="Ebrima"/>
+      </a:majorFont>
+      <a:minorFont>
+        <a:latin typeface="Calibri" panose="020F0502020204030204"/>
+        <a:ea typeface=""/>
+        <a:cs typeface=""/>
+        <a:font script="Jpan" typeface="游明朝"/>
+        <a:font script="Hang" typeface="맑은 고딕"/>
+        <a:font script="Hans" typeface="等线"/>
+        <a:font script="Hant" typeface="新細明體"/>
+        <a:font script="Arab" typeface="Arial"/>
+        <a:font script="Hebr" typeface="Arial"/>
+        <a:font script="Thai" typeface="Cordia New"/>
+        <a:font script="Ethi" typeface="Nyala"/>
+        <a:font script="Beng" typeface="Vrinda"/>
+        <a:font script="Gujr" typeface="Shruti"/>
+        <a:font script="Khmr" typeface="DaunPenh"/>
+        <a:font script="Knda" typeface="Tunga"/>
+        <a:font script="Guru" typeface="Raavi"/>
+        <a:font script="Cans" typeface="Euphemia"/>
+        <a:font script="Cher" typeface="Plantagenet Cherokee"/>
+        <a:font script="Yiii" typeface="Microsoft Yi Baiti"/>
+        <a:font script="Tibt" typeface="Microsoft Himalaya"/>
+        <a:font script="Thaa" typeface="MV Boli"/>
+        <a:font script="Deva" typeface="Mangal"/>
+        <a:font script="Telu" typeface="Gautami"/>
+        <a:font script="Taml" typeface="Latha"/>
+        <a:font script="Syrc" typeface="Estrangelo Edessa"/>
+        <a:font script="Orya" typeface="Kalinga"/>
+        <a:font script="Mlym" typeface="Kartika"/>
+        <a:font script="Laoo" typeface="DokChampa"/>
+        <a:font script="Sinh" typeface="Iskoola Pota"/>
+        <a:font script="Mong" typeface="Mongolian Baiti"/>
+        <a:font script="Viet" typeface="Arial"/>
+        <a:font script="Uigh" typeface="Microsoft Uighur"/>
+        <a:font script="Geor" typeface="Sylfaen"/>
+        <a:font script="Armn" typeface="Arial"/>
+        <a:font script="Bugi" typeface="Leelawadee UI"/>
+        <a:font script="Bopo" typeface="Microsoft JhengHei"/>
+        <a:font script="Java" typeface="Javanese Text"/>
+        <a:font script="Lisu" typeface="Segoe UI"/>
+        <a:font script="Mymr" typeface="Myanmar Text"/>
+        <a:font script="Nkoo" typeface="Ebrima"/>
+        <a:font script="Olck" typeface="Nirmala UI"/>
+        <a:font script="Osma" typeface="Ebrima"/>
+        <a:font script="Phag" typeface="Phagspa"/>
+        <a:font script="Syrn" typeface="Estrangelo Edessa"/>
+        <a:font script="Syrj" typeface="Estrangelo Edessa"/>
+        <a:font script="Syre" typeface="Estrangelo Edessa"/>
+        <a:font script="Sora" typeface="Nirmala UI"/>
+        <a:font script="Tale" typeface="Microsoft Tai Le"/>
+        <a:font script="Talu" typeface="Microsoft New Tai Lue"/>
+        <a:font script="Tfng" typeface="Ebrima"/>
+      </a:minorFont>
+    </a:fontScheme>
+    <a:fmtScheme name="Office">
+      <a:fillStyleLst>
+        <a:solidFill>
+          <a:schemeClr val="phClr"/>
+        </a:solidFill>
+        <a:gradFill rotWithShape="true">
+          <a:gsLst>
+            <a:gs pos="0">
+              <a:schemeClr val="phClr">
+                <a:lumMod val="110000"/>
+                <a:satMod val="105000"/>
+                <a:tint val="67000"/>
+              </a:schemeClr>
+            </a:gs>
+            <a:gs pos="50000">
+              <a:schemeClr val="phClr">
+                <a:lumMod val="105000"/>
+                <a:satMod val="103000"/>
+                <a:tint val="73000"/>
+              </a:schemeClr>
+            </a:gs>
+            <a:gs pos="100000">
+              <a:schemeClr val="phClr">
+                <a:lumMod val="105000"/>
+                <a:satMod val="109000"/>
+                <a:tint val="81000"/>
+              </a:schemeClr>
+            </a:gs>
+          </a:gsLst>
+          <a:lin ang="5400000" scaled="false"/>
+        </a:gradFill>
+        <a:gradFill rotWithShape="true">
+          <a:gsLst>
+            <a:gs pos="0">
+              <a:schemeClr val="phClr">
+                <a:satMod val="103000"/>
+                <a:lumMod val="102000"/>
+                <a:tint val="94000"/>
+              </a:schemeClr>
+            </a:gs>
+            <a:gs pos="50000">
+              <a:schemeClr val="phClr">
+                <a:satMod val="110000"/>
+                <a:lumMod val="100000"/>
+                <a:shade val="100000"/>
+              </a:schemeClr>
+            </a:gs>
+            <a:gs pos="100000">
+              <a:schemeClr val="phClr">
+                <a:lumMod val="99000"/>
+                <a:satMod val="120000"/>
+                <a:shade val="78000"/>
+              </a:schemeClr>
+            </a:gs>
+          </a:gsLst>
+          <a:lin ang="5400000" scaled="false"/>
+        </a:gradFill>
+      </a:fillStyleLst>
+      <a:lnStyleLst>
+        <a:ln w="6350" cap="flat" cmpd="sng" algn="ctr">
+          <a:solidFill>
+            <a:schemeClr val="phClr"/>
+          </a:solidFill>
+          <a:prstDash val="solid"/>
+          <a:miter lim="800000"/>
+        </a:ln>
+        <a:ln w="12700" cap="flat" cmpd="sng" algn="ctr">
+          <a:solidFill>
+            <a:schemeClr val="phClr"/>
+          </a:solidFill>
+          <a:prstDash val="solid"/>
+          <a:miter lim="800000"/>
+        </a:ln>
+        <a:ln w="19050" cap="flat" cmpd="sng" algn="ctr">
+          <a:solidFill>
+            <a:schemeClr val="phClr"/>
+          </a:solidFill>
+          <a:prstDash val="solid"/>
+          <a:miter lim="800000"/>
+        </a:ln>
+      </a:lnStyleLst>
+      <a:effectStyleLst>
+        <a:effectStyle>
+          <a:effectLst/>
+        </a:effectStyle>
+        <a:effectStyle>
+          <a:effectLst/>
+        </a:effectStyle>
+        <a:effectStyle>
+          <a:effectLst>
+            <a:outerShdw blurRad="57150" dist="19050" dir="5400000" algn="ctr" rotWithShape="false">
+              <a:srgbClr val="000000">
+                <a:alpha val="63000"/>
+              </a:srgbClr>
+            </a:outerShdw>
+          </a:effectLst>
+        </a:effectStyle>
+      </a:effectStyleLst>
+      <a:bgFillStyleLst>
+        <a:solidFill>
+          <a:schemeClr val="phClr"/>
+        </a:solidFill>
+        <a:solidFill>
+          <a:schemeClr val="phClr">
+            <a:tint val="95000"/>
+            <a:satMod val="170000"/>
+          </a:schemeClr>
+        </a:solidFill>
+        <a:gradFill rotWithShape="true">
+          <a:gsLst>
+            <a:gs pos="0">
+              <a:schemeClr val="phClr">
+                <a:tint val="93000"/>
+                <a:satMod val="150000"/>
+                <a:shade val="98000"/>
+                <a:lumMod val="102000"/>
+              </a:schemeClr>
+            </a:gs>
+            <a:gs pos="50000">
+              <a:schemeClr val="phClr">
+                <a:tint val="98000"/>
+                <a:satMod val="130000"/>
+                <a:shade val="90000"/>
+                <a:lumMod val="103000"/>
+              </a:schemeClr>
+            </a:gs>
+            <a:gs pos="100000">
+              <a:schemeClr val="phClr">
+                <a:shade val="63000"/>
+                <a:satMod val="120000"/>
+              </a:schemeClr>
+            </a:gs>
+          </a:gsLst>
+          <a:lin ang="5400000" scaled="false"/>
+        </a:gradFill>
+      </a:bgFillStyleLst>
+    </a:fmtScheme>
+  </a:themeElements>
+  <a:objectDefaults/>
+  <a:extraClrSchemeLst/>
+</a:theme>
 </file>
</xml_diff>

<commit_message>
docs(barrier): regenerate the Word report for the RED III URL and new sources
Co-Authored-By: Claude Opus 5.5 <noreply@anthropic.com>
Claude-Session: https://claude.ai/code/session_011c64i8dJvK17G4EiSpMNHy
</commit_message>
<xml_diff>
--- a/docs/transition_barrier/Transition_Barrier_Assessment_Report.docx
+++ b/docs/transition_barrier/Transition_Barrier_Assessment_Report.docx
@@ -116,7 +116,7 @@
           <w:sz w:val="20"/>
           <w:szCs w:val="20"/>
         </w:rPr>
-        <w:t xml:space="preserve">89 verified sources</w:t>
+        <w:t xml:space="preserve">94 verified sources</w:t>
       </w:r>
     </w:p>
     <w:p>
@@ -15347,7 +15347,7 @@
           <w:sz w:val="20"/>
           <w:szCs w:val="20"/>
         </w:rPr>
-        <w:t xml:space="preserve">The 89 sources</w:t>
+        <w:t xml:space="preserve">The 94 sources</w:t>
       </w:r>
     </w:p>
     <w:p>
@@ -15360,7 +15360,7 @@
           <w:sz w:val="20"/>
           <w:szCs w:val="20"/>
         </w:rPr>
-        <w:t xml:space="preserve">Grouped by access pattern — how the source can actually be retrieved, which determines whether re-verification can be automated. Only the 15 legal/regulatory sources are automated today; the other 74 require manual verification. A source marked Manual cannot be fetched as a document; the reason is given.</w:t>
+        <w:t xml:space="preserve">Grouped by access pattern — how the source can actually be retrieved, which determines whether re-verification can be automated. Only the 15 legal/regulatory sources are automated today; the other 79 require manual verification. A source marked Manual cannot be fetched as a document; the reason is given.</w:t>
       </w:r>
     </w:p>
     <w:p>
@@ -15572,7 +15572,7 @@
             <w:pPr>
               <w:spacing w:after="0"/>
             </w:pPr>
-            <w:hyperlink w:history="1" r:id="rId3tuy8yazniisfw-lzsw67">
+            <w:hyperlink w:history="1" r:id="rIdditzrifcb7b1yoxk43nft">
               <w:r>
                 <w:rPr>
                   <w:rFonts w:ascii="Calibri" w:cs="Calibri" w:eastAsia="Calibri" w:hAnsi="Calibri"/>
@@ -15698,7 +15698,7 @@
             <w:pPr>
               <w:spacing w:after="0"/>
             </w:pPr>
-            <w:hyperlink w:history="1" r:id="rIdikufqyzhudfbji1wv_sft">
+            <w:hyperlink w:history="1" r:id="rId11yc6ptr7m9nomj_fkdkm">
               <w:r>
                 <w:rPr>
                   <w:rFonts w:ascii="Calibri" w:cs="Calibri" w:eastAsia="Calibri" w:hAnsi="Calibri"/>
@@ -15824,7 +15824,7 @@
             <w:pPr>
               <w:spacing w:after="0"/>
             </w:pPr>
-            <w:hyperlink w:history="1" r:id="rIdutznhbqoygehhy4nzauit">
+            <w:hyperlink w:history="1" r:id="rIdcqa-mgt2mfeyusyslldfe">
               <w:r>
                 <w:rPr>
                   <w:rFonts w:ascii="Calibri" w:cs="Calibri" w:eastAsia="Calibri" w:hAnsi="Calibri"/>
@@ -15950,7 +15950,7 @@
             <w:pPr>
               <w:spacing w:after="0"/>
             </w:pPr>
-            <w:hyperlink w:history="1" r:id="rIdkh6q3ljblxyh5f8eafrw2">
+            <w:hyperlink w:history="1" r:id="rIdsznl8jqxi5syt04akm5zn">
               <w:r>
                 <w:rPr>
                   <w:rFonts w:ascii="Calibri" w:cs="Calibri" w:eastAsia="Calibri" w:hAnsi="Calibri"/>
@@ -16076,7 +16076,7 @@
             <w:pPr>
               <w:spacing w:after="0"/>
             </w:pPr>
-            <w:hyperlink w:history="1" r:id="rIdpr_v7evxvchecc3ylv_qd">
+            <w:hyperlink w:history="1" r:id="rIdurlbdo6tjvndk5s4lhu0_">
               <w:r>
                 <w:rPr>
                   <w:rFonts w:ascii="Calibri" w:cs="Calibri" w:eastAsia="Calibri" w:hAnsi="Calibri"/>
@@ -16202,7 +16202,7 @@
             <w:pPr>
               <w:spacing w:after="0"/>
             </w:pPr>
-            <w:hyperlink w:history="1" r:id="rIdlvprrl5lrvoh-iqhvsdev">
+            <w:hyperlink w:history="1" r:id="rIdpjgsznm51onjhtjsawskb">
               <w:r>
                 <w:rPr>
                   <w:rFonts w:ascii="Calibri" w:cs="Calibri" w:eastAsia="Calibri" w:hAnsi="Calibri"/>
@@ -16328,7 +16328,7 @@
             <w:pPr>
               <w:spacing w:after="0"/>
             </w:pPr>
-            <w:hyperlink w:history="1" r:id="rIdoefaggxfczd3sbix3rcux">
+            <w:hyperlink w:history="1" r:id="rIdccb4ks8anfx-kyfiy_typ">
               <w:r>
                 <w:rPr>
                   <w:rFonts w:ascii="Calibri" w:cs="Calibri" w:eastAsia="Calibri" w:hAnsi="Calibri"/>
@@ -16454,7 +16454,7 @@
             <w:pPr>
               <w:spacing w:after="0"/>
             </w:pPr>
-            <w:hyperlink w:history="1" r:id="rIdwpq1qq16bx8rrz9auiyqy">
+            <w:hyperlink w:history="1" r:id="rIdmykrx3npphzd1ymwxn3i_">
               <w:r>
                 <w:rPr>
                   <w:rFonts w:ascii="Calibri" w:cs="Calibri" w:eastAsia="Calibri" w:hAnsi="Calibri"/>
@@ -16580,7 +16580,7 @@
             <w:pPr>
               <w:spacing w:after="0"/>
             </w:pPr>
-            <w:hyperlink w:history="1" r:id="rId00olo48gxos8qai9k5gai">
+            <w:hyperlink w:history="1" r:id="rIdexwmn_ng3tcbzngsnmxvv">
               <w:r>
                 <w:rPr>
                   <w:rFonts w:ascii="Calibri" w:cs="Calibri" w:eastAsia="Calibri" w:hAnsi="Calibri"/>
@@ -16706,7 +16706,7 @@
             <w:pPr>
               <w:spacing w:after="0"/>
             </w:pPr>
-            <w:hyperlink w:history="1" r:id="rIdwg7yki1gbj7-36-fc5apu">
+            <w:hyperlink w:history="1" r:id="rId3pyimgd04rlhgyyd02vz2">
               <w:r>
                 <w:rPr>
                   <w:rFonts w:ascii="Calibri" w:cs="Calibri" w:eastAsia="Calibri" w:hAnsi="Calibri"/>
@@ -16832,7 +16832,7 @@
             <w:pPr>
               <w:spacing w:after="0"/>
             </w:pPr>
-            <w:hyperlink w:history="1" r:id="rIdebpt4e3eildeiydqtw7jh">
+            <w:hyperlink w:history="1" r:id="rId7j6nwsags7seeedn2posy">
               <w:r>
                 <w:rPr>
                   <w:rFonts w:ascii="Calibri" w:cs="Calibri" w:eastAsia="Calibri" w:hAnsi="Calibri"/>
@@ -16958,7 +16958,7 @@
             <w:pPr>
               <w:spacing w:after="0"/>
             </w:pPr>
-            <w:hyperlink w:history="1" r:id="rIdn6oqlqhra2pspbio1z21l">
+            <w:hyperlink w:history="1" r:id="rIdcisx9k_2_ylfy1uqcfcff">
               <w:r>
                 <w:rPr>
                   <w:rFonts w:ascii="Calibri" w:cs="Calibri" w:eastAsia="Calibri" w:hAnsi="Calibri"/>
@@ -17084,7 +17084,7 @@
             <w:pPr>
               <w:spacing w:after="0"/>
             </w:pPr>
-            <w:hyperlink w:history="1" r:id="rIdrasg_kmzzmtb7pwy7upbw">
+            <w:hyperlink w:history="1" r:id="rIdwi3sb9o98vgis4btink0t">
               <w:r>
                 <w:rPr>
                   <w:rFonts w:ascii="Calibri" w:cs="Calibri" w:eastAsia="Calibri" w:hAnsi="Calibri"/>
@@ -17210,7 +17210,7 @@
             <w:pPr>
               <w:spacing w:after="0"/>
             </w:pPr>
-            <w:hyperlink w:history="1" r:id="rIdy1kybwyrcwbzcrgiopt1j">
+            <w:hyperlink w:history="1" r:id="rId86il4x0-dilaii-hr9kqt">
               <w:r>
                 <w:rPr>
                   <w:rFonts w:ascii="Calibri" w:cs="Calibri" w:eastAsia="Calibri" w:hAnsi="Calibri"/>
@@ -17336,7 +17336,7 @@
             <w:pPr>
               <w:spacing w:after="0"/>
             </w:pPr>
-            <w:hyperlink w:history="1" r:id="rIdzaiucmbltawoliu5_44po">
+            <w:hyperlink w:history="1" r:id="rIdz6vchqkaajtc4xmi_p0yk">
               <w:r>
                 <w:rPr>
                   <w:rFonts w:ascii="Calibri" w:cs="Calibri" w:eastAsia="Calibri" w:hAnsi="Calibri"/>
@@ -17442,7 +17442,7 @@
                 <w:sz w:val="17"/>
                 <w:szCs w:val="17"/>
               </w:rPr>
-              <w:t xml:space="preserve">Directive (EU) 2023/2413 Article 1(2) replaces Article 3(1) of Directive (EU) 2018/2001: binding 2030 EU-wide renewable target of at least 42.5%, endeavour to reach 45%; permitting acceleration in the inserted Articles 15c (renewables acceleration areas), 16a and 16b (permit-granting inside and outside those areas)</w:t>
+              <w:t xml:space="preserve">Article 3(1), as amended by Directive (EU) 2023/2413: binding EU-wide renewable target of at least 42.5% by 2030, endeavour to reach 45%; permitting acceleration in Articles 15c (renewables acceleration areas), 16a and 16b (permit-granting inside and outside those areas), inserted by Directive (EU) 2023/2413</w:t>
             </w:r>
           </w:p>
         </w:tc>
@@ -17657,7 +17657,7 @@
             <w:pPr>
               <w:spacing w:after="0"/>
             </w:pPr>
-            <w:hyperlink w:history="1" r:id="rIdzm0mlgcq1vplrrrf2alcf">
+            <w:hyperlink w:history="1" r:id="rIdvmmx54ygkwmsl-xo34hrm">
               <w:r>
                 <w:rPr>
                   <w:rFonts w:ascii="Calibri" w:cs="Calibri" w:eastAsia="Calibri" w:hAnsi="Calibri"/>
@@ -17783,7 +17783,7 @@
             <w:pPr>
               <w:spacing w:after="0"/>
             </w:pPr>
-            <w:hyperlink w:history="1" r:id="rIdd5pkpjxmgln8okfxultnc">
+            <w:hyperlink w:history="1" r:id="rIdqwarmvwstegtqumsgpmhr">
               <w:r>
                 <w:rPr>
                   <w:rFonts w:ascii="Calibri" w:cs="Calibri" w:eastAsia="Calibri" w:hAnsi="Calibri"/>
@@ -17909,7 +17909,7 @@
             <w:pPr>
               <w:spacing w:after="0"/>
             </w:pPr>
-            <w:hyperlink w:history="1" r:id="rIdksa3uuanjgf8zqmdggphz">
+            <w:hyperlink w:history="1" r:id="rId6g40ehj1yn4phvz13sq9a">
               <w:r>
                 <w:rPr>
                   <w:rFonts w:ascii="Calibri" w:cs="Calibri" w:eastAsia="Calibri" w:hAnsi="Calibri"/>
@@ -18035,7 +18035,7 @@
             <w:pPr>
               <w:spacing w:after="0"/>
             </w:pPr>
-            <w:hyperlink w:history="1" r:id="rIdp-fntjr4ea5k_pr6d9yjv">
+            <w:hyperlink w:history="1" r:id="rId1s3iupzfhsoay4y4biaji">
               <w:r>
                 <w:rPr>
                   <w:rFonts w:ascii="Calibri" w:cs="Calibri" w:eastAsia="Calibri" w:hAnsi="Calibri"/>
@@ -18161,7 +18161,7 @@
             <w:pPr>
               <w:spacing w:after="0"/>
             </w:pPr>
-            <w:hyperlink w:history="1" r:id="rIdzstcp-3fanrmxboovaw4i">
+            <w:hyperlink w:history="1" r:id="rIdghnlklqea6s7vlfpbtmuj">
               <w:r>
                 <w:rPr>
                   <w:rFonts w:ascii="Calibri" w:cs="Calibri" w:eastAsia="Calibri" w:hAnsi="Calibri"/>
@@ -18287,7 +18287,7 @@
             <w:pPr>
               <w:spacing w:after="0"/>
             </w:pPr>
-            <w:hyperlink w:history="1" r:id="rId9hpt0mp900ljikt5wozkc">
+            <w:hyperlink w:history="1" r:id="rId5br9r_u5_ml-wqevriogp">
               <w:r>
                 <w:rPr>
                   <w:rFonts w:ascii="Calibri" w:cs="Calibri" w:eastAsia="Calibri" w:hAnsi="Calibri"/>
@@ -18608,7 +18608,7 @@
             <w:pPr>
               <w:spacing w:after="0"/>
             </w:pPr>
-            <w:hyperlink w:history="1" r:id="rIdqgge_nenaaew6prufngiw">
+            <w:hyperlink w:history="1" r:id="rIdtagncas47vos0fc2nkcen">
               <w:r>
                 <w:rPr>
                   <w:rFonts w:ascii="Calibri" w:cs="Calibri" w:eastAsia="Calibri" w:hAnsi="Calibri"/>
@@ -18734,7 +18734,7 @@
             <w:pPr>
               <w:spacing w:after="0"/>
             </w:pPr>
-            <w:hyperlink w:history="1" r:id="rIdggxyoxr9dnwu1wi_7lu3f">
+            <w:hyperlink w:history="1" r:id="rId5wjyzccmbj3f-jwhvtlck">
               <w:r>
                 <w:rPr>
                   <w:rFonts w:ascii="Calibri" w:cs="Calibri" w:eastAsia="Calibri" w:hAnsi="Calibri"/>
@@ -18860,7 +18860,7 @@
             <w:pPr>
               <w:spacing w:after="0"/>
             </w:pPr>
-            <w:hyperlink w:history="1" r:id="rIdodpyiyoyku1lx_qsek4xi">
+            <w:hyperlink w:history="1" r:id="rIdjl9d-zvffbfhijkuwpzia">
               <w:r>
                 <w:rPr>
                   <w:rFonts w:ascii="Calibri" w:cs="Calibri" w:eastAsia="Calibri" w:hAnsi="Calibri"/>
@@ -18986,7 +18986,7 @@
             <w:pPr>
               <w:spacing w:after="0"/>
             </w:pPr>
-            <w:hyperlink w:history="1" r:id="rIdjxefvoarduvvaxuiyrlnp">
+            <w:hyperlink w:history="1" r:id="rIdlrruqt009gp5iscnt2f0g">
               <w:r>
                 <w:rPr>
                   <w:rFonts w:ascii="Calibri" w:cs="Calibri" w:eastAsia="Calibri" w:hAnsi="Calibri"/>
@@ -19112,7 +19112,7 @@
             <w:pPr>
               <w:spacing w:after="0"/>
             </w:pPr>
-            <w:hyperlink w:history="1" r:id="rId01yarsccxu5g8hwsvxvdw">
+            <w:hyperlink w:history="1" r:id="rIdlegtfzh354motssmggmbn">
               <w:r>
                 <w:rPr>
                   <w:rFonts w:ascii="Calibri" w:cs="Calibri" w:eastAsia="Calibri" w:hAnsi="Calibri"/>
@@ -19238,7 +19238,7 @@
             <w:pPr>
               <w:spacing w:after="0"/>
             </w:pPr>
-            <w:hyperlink w:history="1" r:id="rIdzuaxm1wnercgvurghft41">
+            <w:hyperlink w:history="1" r:id="rIdsaspkyih8nlvdl7pnsh_5">
               <w:r>
                 <w:rPr>
                   <w:rFonts w:ascii="Calibri" w:cs="Calibri" w:eastAsia="Calibri" w:hAnsi="Calibri"/>
@@ -19364,7 +19364,7 @@
             <w:pPr>
               <w:spacing w:after="0"/>
             </w:pPr>
-            <w:hyperlink w:history="1" r:id="rIdxz4lrqmeu7e1zj7qmkd90">
+            <w:hyperlink w:history="1" r:id="rIdl2wj28lb8i_50-hije0xx">
               <w:r>
                 <w:rPr>
                   <w:rFonts w:ascii="Calibri" w:cs="Calibri" w:eastAsia="Calibri" w:hAnsi="Calibri"/>
@@ -19490,7 +19490,7 @@
             <w:pPr>
               <w:spacing w:after="0"/>
             </w:pPr>
-            <w:hyperlink w:history="1" r:id="rIdcncl-c-4thxuouhackibk">
+            <w:hyperlink w:history="1" r:id="rIdpiht7vypockstmjholk--">
               <w:r>
                 <w:rPr>
                   <w:rFonts w:ascii="Calibri" w:cs="Calibri" w:eastAsia="Calibri" w:hAnsi="Calibri"/>
@@ -19616,7 +19616,7 @@
             <w:pPr>
               <w:spacing w:after="0"/>
             </w:pPr>
-            <w:hyperlink w:history="1" r:id="rIdwlkahgixuxwaubfytzwh8">
+            <w:hyperlink w:history="1" r:id="rId-v5yzp7j-qt6vol-j0vck">
               <w:r>
                 <w:rPr>
                   <w:rFonts w:ascii="Calibri" w:cs="Calibri" w:eastAsia="Calibri" w:hAnsi="Calibri"/>
@@ -19742,7 +19742,7 @@
             <w:pPr>
               <w:spacing w:after="0"/>
             </w:pPr>
-            <w:hyperlink w:history="1" r:id="rIdhu6t-bvwagngcddf1hxt4">
+            <w:hyperlink w:history="1" r:id="rIddehrkrls_s6e0deij3afm">
               <w:r>
                 <w:rPr>
                   <w:rFonts w:ascii="Calibri" w:cs="Calibri" w:eastAsia="Calibri" w:hAnsi="Calibri"/>
@@ -19868,7 +19868,7 @@
             <w:pPr>
               <w:spacing w:after="0"/>
             </w:pPr>
-            <w:hyperlink w:history="1" r:id="rIdxxxj9oqjf2c7f0rfrycwe">
+            <w:hyperlink w:history="1" r:id="rIdebeowdwnyjhjb9glgey-g">
               <w:r>
                 <w:rPr>
                   <w:rFonts w:ascii="Calibri" w:cs="Calibri" w:eastAsia="Calibri" w:hAnsi="Calibri"/>
@@ -19991,7 +19991,7 @@
           <w:sz w:val="20"/>
           <w:szCs w:val="20"/>
         </w:rPr>
-        <w:t xml:space="preserve">Periodic PDF report (29)</w:t>
+        <w:t xml:space="preserve">Periodic PDF report (32)</w:t>
       </w:r>
     </w:p>
     <w:p>
@@ -20189,7 +20189,133 @@
             <w:pPr>
               <w:spacing w:after="0"/>
             </w:pPr>
-            <w:hyperlink w:history="1" r:id="rIdchzghmokwontfjnkcfqhu">
+            <w:hyperlink w:history="1" r:id="rIdjle2esc8_mwvonm0cfffh">
+              <w:r>
+                <w:rPr>
+                  <w:rFonts w:ascii="Calibri" w:cs="Calibri" w:eastAsia="Calibri" w:hAnsi="Calibri"/>
+                  <w:color w:val="2A4FB7"/>
+                  <w:sz w:val="17"/>
+                  <w:szCs w:val="17"/>
+                  <w:u w:val="single"/>
+                </w:rPr>
+                <w:t xml:space="preserve">Berkeley Lab Queued Up: Characteristics of Power Plants Seeking Transmission Interconnection (2026 edition)</w:t>
+              </w:r>
+            </w:hyperlink>
+          </w:p>
+        </w:tc>
+        <w:tc>
+          <w:tcPr>
+            <w:tcW w:type="dxa" w:w="2600"/>
+            <w:tcMar>
+              <w:top w:type="dxa" w:w="60"/>
+              <w:left w:type="dxa" w:w="90"/>
+              <w:bottom w:type="dxa" w:w="60"/>
+              <w:right w:type="dxa" w:w="90"/>
+            </w:tcMar>
+          </w:tcPr>
+          <w:p>
+            <w:pPr>
+              <w:spacing w:after="0"/>
+            </w:pPr>
+            <w:r>
+              <w:rPr>
+                <w:rFonts w:ascii="Calibri" w:cs="Calibri" w:eastAsia="Calibri" w:hAnsi="Calibri"/>
+                <w:sz w:val="17"/>
+                <w:szCs w:val="17"/>
+              </w:rPr>
+              <w:t xml:space="preserve">Lawrence Berkeley National Laboratory (LBNL)</w:t>
+            </w:r>
+          </w:p>
+        </w:tc>
+        <w:tc>
+          <w:tcPr>
+            <w:tcW w:type="dxa" w:w="1900"/>
+            <w:tcMar>
+              <w:top w:type="dxa" w:w="60"/>
+              <w:left w:type="dxa" w:w="90"/>
+              <w:bottom w:type="dxa" w:w="60"/>
+              <w:right w:type="dxa" w:w="90"/>
+            </w:tcMar>
+          </w:tcPr>
+          <w:p>
+            <w:pPr>
+              <w:spacing w:after="0"/>
+            </w:pPr>
+            <w:r>
+              <w:rPr>
+                <w:rFonts w:ascii="Calibri" w:cs="Calibri" w:eastAsia="Calibri" w:hAnsi="Calibri"/>
+                <w:sz w:val="17"/>
+                <w:szCs w:val="17"/>
+              </w:rPr>
+              <w:t xml:space="preserve">PWR-R2</w:t>
+            </w:r>
+          </w:p>
+        </w:tc>
+        <w:tc>
+          <w:tcPr>
+            <w:tcW w:type="dxa" w:w="2100"/>
+            <w:tcMar>
+              <w:top w:type="dxa" w:w="60"/>
+              <w:left w:type="dxa" w:w="90"/>
+              <w:bottom w:type="dxa" w:w="60"/>
+              <w:right w:type="dxa" w:w="90"/>
+            </w:tcMar>
+          </w:tcPr>
+          <w:p>
+            <w:pPr>
+              <w:spacing w:after="0"/>
+            </w:pPr>
+            <w:r>
+              <w:rPr>
+                <w:rFonts w:ascii="Calibri" w:cs="Calibri" w:eastAsia="Calibri" w:hAnsi="Calibri"/>
+                <w:sz w:val="17"/>
+                <w:szCs w:val="17"/>
+              </w:rPr>
+              <w:t xml:space="preserve">annual, slide deck and data file each spring (2026 edition May 2026); the latest edition is always linked from https://emp.lbl.gov/queues</w:t>
+            </w:r>
+          </w:p>
+        </w:tc>
+        <w:tc>
+          <w:tcPr>
+            <w:tcW w:type="dxa" w:w="5198"/>
+            <w:tcMar>
+              <w:top w:type="dxa" w:w="60"/>
+              <w:left w:type="dxa" w:w="90"/>
+              <w:bottom w:type="dxa" w:w="60"/>
+              <w:right w:type="dxa" w:w="90"/>
+            </w:tcMar>
+          </w:tcPr>
+          <w:p>
+            <w:pPr>
+              <w:spacing w:after="0"/>
+            </w:pPr>
+            <w:r>
+              <w:rPr>
+                <w:rFonts w:ascii="Calibri" w:cs="Calibri" w:eastAsia="Calibri" w:hAnsi="Calibri"/>
+                <w:sz w:val="17"/>
+                <w:szCs w:val="17"/>
+              </w:rPr>
+              <w:t xml:space="preserve">Duration trends, PDF pages 51-52: median time from interconnection request to commercial operation, 61 months for projects completed in 2025, by region</w:t>
+            </w:r>
+          </w:p>
+        </w:tc>
+      </w:tr>
+      <w:tr>
+        <w:tc>
+          <w:tcPr>
+            <w:tcW w:type="dxa" w:w="3600"/>
+            <w:tcMar>
+              <w:top w:type="dxa" w:w="60"/>
+              <w:left w:type="dxa" w:w="90"/>
+              <w:bottom w:type="dxa" w:w="60"/>
+              <w:right w:type="dxa" w:w="90"/>
+            </w:tcMar>
+          </w:tcPr>
+          <w:p>
+            <w:pPr>
+              <w:spacing w:after="0"/>
+            </w:pPr>
+            <w:hyperlink w:history="1" r:id="rIdqvs1n5vr4hca_sgarazue">
               <w:r>
                 <w:rPr>
                   <w:rFonts w:ascii="Calibri" w:cs="Calibri" w:eastAsia="Calibri" w:hAnsi="Calibri"/>
@@ -20315,7 +20441,7 @@
             <w:pPr>
               <w:spacing w:after="0"/>
             </w:pPr>
-            <w:hyperlink w:history="1" r:id="rIdp8v0emlsusyhl-rlrfuaw">
+            <w:hyperlink w:history="1" r:id="rIdhez5pr0jybfniqcrkq-um">
               <w:r>
                 <w:rPr>
                   <w:rFonts w:ascii="Calibri" w:cs="Calibri" w:eastAsia="Calibri" w:hAnsi="Calibri"/>
@@ -20441,7 +20567,7 @@
             <w:pPr>
               <w:spacing w:after="0"/>
             </w:pPr>
-            <w:hyperlink w:history="1" r:id="rId0u-v6_ab2-xqkraudx1ed">
+            <w:hyperlink w:history="1" r:id="rIdogpudrhcjvgzfe5srk-4s">
               <w:r>
                 <w:rPr>
                   <w:rFonts w:ascii="Calibri" w:cs="Calibri" w:eastAsia="Calibri" w:hAnsi="Calibri"/>
@@ -20567,7 +20693,7 @@
             <w:pPr>
               <w:spacing w:after="0"/>
             </w:pPr>
-            <w:hyperlink w:history="1" r:id="rIdml9zyr5j_60tpcrdgyjc8">
+            <w:hyperlink w:history="1" r:id="rIdzhylicrrshf6bohracdz2">
               <w:r>
                 <w:rPr>
                   <w:rFonts w:ascii="Calibri" w:cs="Calibri" w:eastAsia="Calibri" w:hAnsi="Calibri"/>
@@ -20693,7 +20819,133 @@
             <w:pPr>
               <w:spacing w:after="0"/>
             </w:pPr>
-            <w:hyperlink w:history="1" r:id="rIdlczy0y1tmpxefyqakkqbn">
+            <w:hyperlink w:history="1" r:id="rId_krruc86hmfuxixvlne-r">
+              <w:r>
+                <w:rPr>
+                  <w:rFonts w:ascii="Calibri" w:cs="Calibri" w:eastAsia="Calibri" w:hAnsi="Calibri"/>
+                  <w:color w:val="2A4FB7"/>
+                  <w:sz w:val="17"/>
+                  <w:szCs w:val="17"/>
+                  <w:u w:val="single"/>
+                </w:rPr>
+                <w:t xml:space="preserve">CRS R48906: Inflation Reduction Act Methane Emissions Charge: Overview and Considerations for Policymakers</w:t>
+              </w:r>
+            </w:hyperlink>
+          </w:p>
+        </w:tc>
+        <w:tc>
+          <w:tcPr>
+            <w:tcW w:type="dxa" w:w="2600"/>
+            <w:tcMar>
+              <w:top w:type="dxa" w:w="60"/>
+              <w:left w:type="dxa" w:w="90"/>
+              <w:bottom w:type="dxa" w:w="60"/>
+              <w:right w:type="dxa" w:w="90"/>
+            </w:tcMar>
+          </w:tcPr>
+          <w:p>
+            <w:pPr>
+              <w:spacing w:after="0"/>
+            </w:pPr>
+            <w:r>
+              <w:rPr>
+                <w:rFonts w:ascii="Calibri" w:cs="Calibri" w:eastAsia="Calibri" w:hAnsi="Calibri"/>
+                <w:sz w:val="17"/>
+                <w:szCs w:val="17"/>
+              </w:rPr>
+              <w:t xml:space="preserve">Congressional Research Service (CRS)</w:t>
+            </w:r>
+          </w:p>
+        </w:tc>
+        <w:tc>
+          <w:tcPr>
+            <w:tcW w:type="dxa" w:w="1900"/>
+            <w:tcMar>
+              <w:top w:type="dxa" w:w="60"/>
+              <w:left w:type="dxa" w:w="90"/>
+              <w:bottom w:type="dxa" w:w="60"/>
+              <w:right w:type="dxa" w:w="90"/>
+            </w:tcMar>
+          </w:tcPr>
+          <w:p>
+            <w:pPr>
+              <w:spacing w:after="0"/>
+            </w:pPr>
+            <w:r>
+              <w:rPr>
+                <w:rFonts w:ascii="Calibri" w:cs="Calibri" w:eastAsia="Calibri" w:hAnsi="Calibri"/>
+                <w:sz w:val="17"/>
+                <w:szCs w:val="17"/>
+              </w:rPr>
+              <w:t xml:space="preserve">OGU-R1</w:t>
+            </w:r>
+          </w:p>
+        </w:tc>
+        <w:tc>
+          <w:tcPr>
+            <w:tcW w:type="dxa" w:w="2100"/>
+            <w:tcMar>
+              <w:top w:type="dxa" w:w="60"/>
+              <w:left w:type="dxa" w:w="90"/>
+              <w:bottom w:type="dxa" w:w="60"/>
+              <w:right w:type="dxa" w:w="90"/>
+            </w:tcMar>
+          </w:tcPr>
+          <w:p>
+            <w:pPr>
+              <w:spacing w:after="0"/>
+            </w:pPr>
+            <w:r>
+              <w:rPr>
+                <w:rFonts w:ascii="Calibri" w:cs="Calibri" w:eastAsia="Calibri" w:hAnsi="Calibri"/>
+                <w:sz w:val="17"/>
+                <w:szCs w:val="17"/>
+              </w:rPr>
+              <w:t xml:space="preserve">one-off report (15 April 2026); CRS revises reports as events change</w:t>
+            </w:r>
+          </w:p>
+        </w:tc>
+        <w:tc>
+          <w:tcPr>
+            <w:tcW w:type="dxa" w:w="5198"/>
+            <w:tcMar>
+              <w:top w:type="dxa" w:w="60"/>
+              <w:left w:type="dxa" w:w="90"/>
+              <w:bottom w:type="dxa" w:w="60"/>
+              <w:right w:type="dxa" w:w="90"/>
+            </w:tcMar>
+          </w:tcPr>
+          <w:p>
+            <w:pPr>
+              <w:spacing w:after="0"/>
+            </w:pPr>
+            <w:r>
+              <w:rPr>
+                <w:rFonts w:ascii="Calibri" w:cs="Calibri" w:eastAsia="Calibri" w:hAnsi="Calibri"/>
+                <w:sz w:val="17"/>
+                <w:szCs w:val="17"/>
+              </w:rPr>
+              <w:t xml:space="preserve">Manual: congress.gov returns 403 to automated requests; fetch the page in a browser. Summary and 'Introduction and Recent Developments': the Congressional Review Act disapproval of EPA's WEC rule (H.J.Res. 35, signed 14 March 2025) and P.L. 119-21's change to the WEC start date</w:t>
+            </w:r>
+          </w:p>
+        </w:tc>
+      </w:tr>
+      <w:tr>
+        <w:tc>
+          <w:tcPr>
+            <w:tcW w:type="dxa" w:w="3600"/>
+            <w:tcMar>
+              <w:top w:type="dxa" w:w="60"/>
+              <w:left w:type="dxa" w:w="90"/>
+              <w:bottom w:type="dxa" w:w="60"/>
+              <w:right w:type="dxa" w:w="90"/>
+            </w:tcMar>
+          </w:tcPr>
+          <w:p>
+            <w:pPr>
+              <w:spacing w:after="0"/>
+            </w:pPr>
+            <w:hyperlink w:history="1" r:id="rIdm6w3l5uuw--4bsten30v6">
               <w:r>
                 <w:rPr>
                   <w:rFonts w:ascii="Calibri" w:cs="Calibri" w:eastAsia="Calibri" w:hAnsi="Calibri"/>
@@ -20819,7 +21071,7 @@
             <w:pPr>
               <w:spacing w:after="0"/>
             </w:pPr>
-            <w:hyperlink w:history="1" r:id="rIdk419mj8_qykoh_7c_1kqt">
+            <w:hyperlink w:history="1" r:id="rIdly42vxschrm-g3wnhcpbh">
               <w:r>
                 <w:rPr>
                   <w:rFonts w:ascii="Calibri" w:cs="Calibri" w:eastAsia="Calibri" w:hAnsi="Calibri"/>
@@ -20945,7 +21197,7 @@
             <w:pPr>
               <w:spacing w:after="0"/>
             </w:pPr>
-            <w:hyperlink w:history="1" r:id="rIdapnivkovsit__hewj3q9g">
+            <w:hyperlink w:history="1" r:id="rIdyswfjvzriioiqxe6iity0">
               <w:r>
                 <w:rPr>
                   <w:rFonts w:ascii="Calibri" w:cs="Calibri" w:eastAsia="Calibri" w:hAnsi="Calibri"/>
@@ -21071,7 +21323,7 @@
             <w:pPr>
               <w:spacing w:after="0"/>
             </w:pPr>
-            <w:hyperlink w:history="1" r:id="rIdlv4t78icbstztaogb9cnv">
+            <w:hyperlink w:history="1" r:id="rId1llt016zojhy1d9y3q4yk">
               <w:r>
                 <w:rPr>
                   <w:rFonts w:ascii="Calibri" w:cs="Calibri" w:eastAsia="Calibri" w:hAnsi="Calibri"/>
@@ -21197,7 +21449,7 @@
             <w:pPr>
               <w:spacing w:after="0"/>
             </w:pPr>
-            <w:hyperlink w:history="1" r:id="rIdrz9t6cxij5w6agla68o_4">
+            <w:hyperlink w:history="1" r:id="rIdtzctxblx7c8qnfvlimfgt">
               <w:r>
                 <w:rPr>
                   <w:rFonts w:ascii="Calibri" w:cs="Calibri" w:eastAsia="Calibri" w:hAnsi="Calibri"/>
@@ -21323,7 +21575,7 @@
             <w:pPr>
               <w:spacing w:after="0"/>
             </w:pPr>
-            <w:hyperlink w:history="1" r:id="rIdyeqa_bk0xyr0zaenpvp50">
+            <w:hyperlink w:history="1" r:id="rIdi7fr8m2fvwlk8nxlcqgtk">
               <w:r>
                 <w:rPr>
                   <w:rFonts w:ascii="Calibri" w:cs="Calibri" w:eastAsia="Calibri" w:hAnsi="Calibri"/>
@@ -21449,7 +21701,7 @@
             <w:pPr>
               <w:spacing w:after="0"/>
             </w:pPr>
-            <w:hyperlink w:history="1" r:id="rId1ggujetdlyiyyrxa5xa-a">
+            <w:hyperlink w:history="1" r:id="rIdg7mqdyqzrakym_xzhuyti">
               <w:r>
                 <w:rPr>
                   <w:rFonts w:ascii="Calibri" w:cs="Calibri" w:eastAsia="Calibri" w:hAnsi="Calibri"/>
@@ -21575,7 +21827,7 @@
             <w:pPr>
               <w:spacing w:after="0"/>
             </w:pPr>
-            <w:hyperlink w:history="1" r:id="rIdtneptcpo2t7xjtixkswh5">
+            <w:hyperlink w:history="1" r:id="rIdsakff5gyfmlhnooiskmfs">
               <w:r>
                 <w:rPr>
                   <w:rFonts w:ascii="Calibri" w:cs="Calibri" w:eastAsia="Calibri" w:hAnsi="Calibri"/>
@@ -21701,7 +21953,7 @@
             <w:pPr>
               <w:spacing w:after="0"/>
             </w:pPr>
-            <w:hyperlink w:history="1" r:id="rIddimk3ea9xohutyq4yzmt4">
+            <w:hyperlink w:history="1" r:id="rId8vn3lrb8drddgahnif_wh">
               <w:r>
                 <w:rPr>
                   <w:rFonts w:ascii="Calibri" w:cs="Calibri" w:eastAsia="Calibri" w:hAnsi="Calibri"/>
@@ -21827,7 +22079,7 @@
             <w:pPr>
               <w:spacing w:after="0"/>
             </w:pPr>
-            <w:hyperlink w:history="1" r:id="rId6ovjafm1ygdris2t6eiqp">
+            <w:hyperlink w:history="1" r:id="rIdqbthnav2vmai692pw32p3">
               <w:r>
                 <w:rPr>
                   <w:rFonts w:ascii="Calibri" w:cs="Calibri" w:eastAsia="Calibri" w:hAnsi="Calibri"/>
@@ -21953,7 +22205,7 @@
             <w:pPr>
               <w:spacing w:after="0"/>
             </w:pPr>
-            <w:hyperlink w:history="1" r:id="rIdlmuasm6l7ern3tr-ad9kf">
+            <w:hyperlink w:history="1" r:id="rIdaoh4kevnvjc24lt7mmvx1">
               <w:r>
                 <w:rPr>
                   <w:rFonts w:ascii="Calibri" w:cs="Calibri" w:eastAsia="Calibri" w:hAnsi="Calibri"/>
@@ -22079,7 +22331,7 @@
             <w:pPr>
               <w:spacing w:after="0"/>
             </w:pPr>
-            <w:hyperlink w:history="1" r:id="rId8tij5_nr7ise64f17lnqy">
+            <w:hyperlink w:history="1" r:id="rId7odzk_ldzifo4auesajw2">
               <w:r>
                 <w:rPr>
                   <w:rFonts w:ascii="Calibri" w:cs="Calibri" w:eastAsia="Calibri" w:hAnsi="Calibri"/>
@@ -22205,7 +22457,7 @@
             <w:pPr>
               <w:spacing w:after="0"/>
             </w:pPr>
-            <w:hyperlink w:history="1" r:id="rIdj6d9hw_xlugmvro4ldxho">
+            <w:hyperlink w:history="1" r:id="rIdk5bmivwgwd-tfofzm5f1m">
               <w:r>
                 <w:rPr>
                   <w:rFonts w:ascii="Calibri" w:cs="Calibri" w:eastAsia="Calibri" w:hAnsi="Calibri"/>
@@ -22331,7 +22583,7 @@
             <w:pPr>
               <w:spacing w:after="0"/>
             </w:pPr>
-            <w:hyperlink w:history="1" r:id="rIdkjfdqtdtdt6g0bz00034f">
+            <w:hyperlink w:history="1" r:id="rId_q9ndkmpevahihwonlaj0">
               <w:r>
                 <w:rPr>
                   <w:rFonts w:ascii="Calibri" w:cs="Calibri" w:eastAsia="Calibri" w:hAnsi="Calibri"/>
@@ -22457,7 +22709,7 @@
             <w:pPr>
               <w:spacing w:after="0"/>
             </w:pPr>
-            <w:hyperlink w:history="1" r:id="rIdoeqfskazzkgdgxrevognv">
+            <w:hyperlink w:history="1" r:id="rIdd_job9oklsibvtq4bgpnj">
               <w:r>
                 <w:rPr>
                   <w:rFonts w:ascii="Calibri" w:cs="Calibri" w:eastAsia="Calibri" w:hAnsi="Calibri"/>
@@ -22583,7 +22835,7 @@
             <w:pPr>
               <w:spacing w:after="0"/>
             </w:pPr>
-            <w:hyperlink w:history="1" r:id="rId-x5tynw9_tqnwgtk1w0z_">
+            <w:hyperlink w:history="1" r:id="rIdivnyraobpjw9f831pyqhk">
               <w:r>
                 <w:rPr>
                   <w:rFonts w:ascii="Calibri" w:cs="Calibri" w:eastAsia="Calibri" w:hAnsi="Calibri"/>
@@ -22709,7 +22961,7 @@
             <w:pPr>
               <w:spacing w:after="0"/>
             </w:pPr>
-            <w:hyperlink w:history="1" r:id="rId7s8licmbzutw5grkbuucf">
+            <w:hyperlink w:history="1" r:id="rIdfvsd9zklyzky3hcmkfexa">
               <w:r>
                 <w:rPr>
                   <w:rFonts w:ascii="Calibri" w:cs="Calibri" w:eastAsia="Calibri" w:hAnsi="Calibri"/>
@@ -22835,7 +23087,7 @@
             <w:pPr>
               <w:spacing w:after="0"/>
             </w:pPr>
-            <w:hyperlink w:history="1" r:id="rIdv0lr_e-a_skb15ayv6z5n">
+            <w:hyperlink w:history="1" r:id="rIdl34mqdrd5mktx-5zwq9cc">
               <w:r>
                 <w:rPr>
                   <w:rFonts w:ascii="Calibri" w:cs="Calibri" w:eastAsia="Calibri" w:hAnsi="Calibri"/>
@@ -22961,7 +23213,133 @@
             <w:pPr>
               <w:spacing w:after="0"/>
             </w:pPr>
-            <w:hyperlink w:history="1" r:id="rIdy6_uxylfd5qcnxqtpe27c">
+            <w:hyperlink w:history="1" r:id="rIdmg8dm3ao1noey_29fah6c">
+              <w:r>
+                <w:rPr>
+                  <w:rFonts w:ascii="Calibri" w:cs="Calibri" w:eastAsia="Calibri" w:hAnsi="Calibri"/>
+                  <w:color w:val="2A4FB7"/>
+                  <w:sz w:val="17"/>
+                  <w:szCs w:val="17"/>
+                  <w:u w:val="single"/>
+                </w:rPr>
+                <w:t xml:space="preserve">MEE Progress Report of China's National Carbon Market (2025)</w:t>
+              </w:r>
+            </w:hyperlink>
+          </w:p>
+        </w:tc>
+        <w:tc>
+          <w:tcPr>
+            <w:tcW w:type="dxa" w:w="2600"/>
+            <w:tcMar>
+              <w:top w:type="dxa" w:w="60"/>
+              <w:left w:type="dxa" w:w="90"/>
+              <w:bottom w:type="dxa" w:w="60"/>
+              <w:right w:type="dxa" w:w="90"/>
+            </w:tcMar>
+          </w:tcPr>
+          <w:p>
+            <w:pPr>
+              <w:spacing w:after="0"/>
+            </w:pPr>
+            <w:r>
+              <w:rPr>
+                <w:rFonts w:ascii="Calibri" w:cs="Calibri" w:eastAsia="Calibri" w:hAnsi="Calibri"/>
+                <w:sz w:val="17"/>
+                <w:szCs w:val="17"/>
+              </w:rPr>
+              <w:t xml:space="preserve">Ministry of Ecology and Environment of the People's Republic of China (MEE)</w:t>
+            </w:r>
+          </w:p>
+        </w:tc>
+        <w:tc>
+          <w:tcPr>
+            <w:tcW w:type="dxa" w:w="1900"/>
+            <w:tcMar>
+              <w:top w:type="dxa" w:w="60"/>
+              <w:left w:type="dxa" w:w="90"/>
+              <w:bottom w:type="dxa" w:w="60"/>
+              <w:right w:type="dxa" w:w="90"/>
+            </w:tcMar>
+          </w:tcPr>
+          <w:p>
+            <w:pPr>
+              <w:spacing w:after="0"/>
+            </w:pPr>
+            <w:r>
+              <w:rPr>
+                <w:rFonts w:ascii="Calibri" w:cs="Calibri" w:eastAsia="Calibri" w:hAnsi="Calibri"/>
+                <w:sz w:val="17"/>
+                <w:szCs w:val="17"/>
+              </w:rPr>
+              <w:t xml:space="preserve">PWR-R1</w:t>
+            </w:r>
+          </w:p>
+        </w:tc>
+        <w:tc>
+          <w:tcPr>
+            <w:tcW w:type="dxa" w:w="2100"/>
+            <w:tcMar>
+              <w:top w:type="dxa" w:w="60"/>
+              <w:left w:type="dxa" w:w="90"/>
+              <w:bottom w:type="dxa" w:w="60"/>
+              <w:right w:type="dxa" w:w="90"/>
+            </w:tcMar>
+          </w:tcPr>
+          <w:p>
+            <w:pPr>
+              <w:spacing w:after="0"/>
+            </w:pPr>
+            <w:r>
+              <w:rPr>
+                <w:rFonts w:ascii="Calibri" w:cs="Calibri" w:eastAsia="Calibri" w:hAnsi="Calibri"/>
+                <w:sz w:val="17"/>
+                <w:szCs w:val="17"/>
+              </w:rPr>
+              <w:t xml:space="preserve">annual, released at the China Carbon Market Conference in September (the 2026 edition followed in September 2026)</w:t>
+            </w:r>
+          </w:p>
+        </w:tc>
+        <w:tc>
+          <w:tcPr>
+            <w:tcW w:type="dxa" w:w="5198"/>
+            <w:tcMar>
+              <w:top w:type="dxa" w:w="60"/>
+              <w:left w:type="dxa" w:w="90"/>
+              <w:bottom w:type="dxa" w:w="60"/>
+              <w:right w:type="dxa" w:w="90"/>
+            </w:tcMar>
+          </w:tcPr>
+          <w:p>
+            <w:pPr>
+              <w:spacing w:after="0"/>
+            </w:pPr>
+            <w:r>
+              <w:rPr>
+                <w:rFonts w:ascii="Calibri" w:cs="Calibri" w:eastAsia="Calibri" w:hAnsi="Calibri"/>
+                <w:sz w:val="17"/>
+                <w:szCs w:val="17"/>
+              </w:rPr>
+              <w:t xml:space="preserve">Chapter 4 (market vibrancy of the national ETS), part (2) 'Trading prices reflected supply and demand interaction', PDF page 24: the 2024 composite closing price ranged from 69 to 106 yuan/tonne, year-end 97.49 yuan/tonne</w:t>
+            </w:r>
+          </w:p>
+        </w:tc>
+      </w:tr>
+      <w:tr>
+        <w:tc>
+          <w:tcPr>
+            <w:tcW w:type="dxa" w:w="3600"/>
+            <w:tcMar>
+              <w:top w:type="dxa" w:w="60"/>
+              <w:left w:type="dxa" w:w="90"/>
+              <w:bottom w:type="dxa" w:w="60"/>
+              <w:right w:type="dxa" w:w="90"/>
+            </w:tcMar>
+          </w:tcPr>
+          <w:p>
+            <w:pPr>
+              <w:spacing w:after="0"/>
+            </w:pPr>
+            <w:hyperlink w:history="1" r:id="rIdjg1nftzv8xb4d8p1hsqmq">
               <w:r>
                 <w:rPr>
                   <w:rFonts w:ascii="Calibri" w:cs="Calibri" w:eastAsia="Calibri" w:hAnsi="Calibri"/>
@@ -23087,7 +23465,7 @@
             <w:pPr>
               <w:spacing w:after="0"/>
             </w:pPr>
-            <w:hyperlink w:history="1" r:id="rId4j1edmcl-mhhqdxev20j6">
+            <w:hyperlink w:history="1" r:id="rId2q0xemne8updqssl6b03w">
               <w:r>
                 <w:rPr>
                   <w:rFonts w:ascii="Calibri" w:cs="Calibri" w:eastAsia="Calibri" w:hAnsi="Calibri"/>
@@ -23213,7 +23591,7 @@
             <w:pPr>
               <w:spacing w:after="0"/>
             </w:pPr>
-            <w:hyperlink w:history="1" r:id="rId3w7_yhpydt0j_jtqtvvo8">
+            <w:hyperlink w:history="1" r:id="rIdjl3fw-s_ulmxm2neun_hv">
               <w:r>
                 <w:rPr>
                   <w:rFonts w:ascii="Calibri" w:cs="Calibri" w:eastAsia="Calibri" w:hAnsi="Calibri"/>
@@ -23339,7 +23717,7 @@
             <w:pPr>
               <w:spacing w:after="0"/>
             </w:pPr>
-            <w:hyperlink w:history="1" r:id="rIdg0vxl9gqxav3dtgdeq29q">
+            <w:hyperlink w:history="1" r:id="rIdmrio5qp4veybzbwz9tump">
               <w:r>
                 <w:rPr>
                   <w:rFonts w:ascii="Calibri" w:cs="Calibri" w:eastAsia="Calibri" w:hAnsi="Calibri"/>
@@ -23465,7 +23843,7 @@
             <w:pPr>
               <w:spacing w:after="0"/>
             </w:pPr>
-            <w:hyperlink w:history="1" r:id="rIdfqprbp7abhllruj0srytf">
+            <w:hyperlink w:history="1" r:id="rIdbhbasmg2rasgzmn52-6l1">
               <w:r>
                 <w:rPr>
                   <w:rFonts w:ascii="Calibri" w:cs="Calibri" w:eastAsia="Calibri" w:hAnsi="Calibri"/>
@@ -23591,7 +23969,7 @@
             <w:pPr>
               <w:spacing w:after="0"/>
             </w:pPr>
-            <w:hyperlink w:history="1" r:id="rIdquwwecxxcenhiuw9pymr3">
+            <w:hyperlink w:history="1" r:id="rIdqgqc1h1gkv9vayckm6esb">
               <w:r>
                 <w:rPr>
                   <w:rFonts w:ascii="Calibri" w:cs="Calibri" w:eastAsia="Calibri" w:hAnsi="Calibri"/>
@@ -23717,7 +24095,7 @@
             <w:pPr>
               <w:spacing w:after="0"/>
             </w:pPr>
-            <w:hyperlink w:history="1" r:id="rIde2t87kanfutnoltooij4l">
+            <w:hyperlink w:history="1" r:id="rIdyne5wgh31abcborpul5fu">
               <w:r>
                 <w:rPr>
                   <w:rFonts w:ascii="Calibri" w:cs="Calibri" w:eastAsia="Calibri" w:hAnsi="Calibri"/>
@@ -23840,7 +24218,7 @@
           <w:sz w:val="20"/>
           <w:szCs w:val="20"/>
         </w:rPr>
-        <w:t xml:space="preserve">Government agency publication (21)</w:t>
+        <w:t xml:space="preserve">Government agency publication (23)</w:t>
       </w:r>
     </w:p>
     <w:p>
@@ -24038,7 +24416,7 @@
             <w:pPr>
               <w:spacing w:after="0"/>
             </w:pPr>
-            <w:hyperlink w:history="1" r:id="rIdilzs3ix28kukd_bughlio">
+            <w:hyperlink w:history="1" r:id="rId3ke1muhkh7mk2bgach_fk">
               <w:r>
                 <w:rPr>
                   <w:rFonts w:ascii="Calibri" w:cs="Calibri" w:eastAsia="Calibri" w:hAnsi="Calibri"/>
@@ -24164,7 +24542,7 @@
             <w:pPr>
               <w:spacing w:after="0"/>
             </w:pPr>
-            <w:hyperlink w:history="1" r:id="rIdyrzmamkrsarxkh3lzmvxn">
+            <w:hyperlink w:history="1" r:id="rIdywqcxgvpnx-xz8gn7vt0b">
               <w:r>
                 <w:rPr>
                   <w:rFonts w:ascii="Calibri" w:cs="Calibri" w:eastAsia="Calibri" w:hAnsi="Calibri"/>
@@ -24290,7 +24668,7 @@
             <w:pPr>
               <w:spacing w:after="0"/>
             </w:pPr>
-            <w:hyperlink w:history="1" r:id="rIdj_6kburz-dzunblwn5mc5">
+            <w:hyperlink w:history="1" r:id="rIdvzox5ybbkxip9x19njc4y">
               <w:r>
                 <w:rPr>
                   <w:rFonts w:ascii="Calibri" w:cs="Calibri" w:eastAsia="Calibri" w:hAnsi="Calibri"/>
@@ -24416,7 +24794,7 @@
             <w:pPr>
               <w:spacing w:after="0"/>
             </w:pPr>
-            <w:hyperlink w:history="1" r:id="rIdni0kygqg44au3ikf9khrs">
+            <w:hyperlink w:history="1" r:id="rIdtxwqdf66-7lmi3iuzn4r6">
               <w:r>
                 <w:rPr>
                   <w:rFonts w:ascii="Calibri" w:cs="Calibri" w:eastAsia="Calibri" w:hAnsi="Calibri"/>
@@ -24542,7 +24920,7 @@
             <w:pPr>
               <w:spacing w:after="0"/>
             </w:pPr>
-            <w:hyperlink w:history="1" r:id="rId8gkgnic6fplc9sttyhkic">
+            <w:hyperlink w:history="1" r:id="rIdsjw7jlsy8x9m0unpdg12-">
               <w:r>
                 <w:rPr>
                   <w:rFonts w:ascii="Calibri" w:cs="Calibri" w:eastAsia="Calibri" w:hAnsi="Calibri"/>
@@ -24668,7 +25046,7 @@
             <w:pPr>
               <w:spacing w:after="0"/>
             </w:pPr>
-            <w:hyperlink w:history="1" r:id="rIdxbd-s1da57tz6psdi2psp">
+            <w:hyperlink w:history="1" r:id="rIdirxpkj1g02d7jljp7lrfm">
               <w:r>
                 <w:rPr>
                   <w:rFonts w:ascii="Calibri" w:cs="Calibri" w:eastAsia="Calibri" w:hAnsi="Calibri"/>
@@ -24794,7 +25172,7 @@
             <w:pPr>
               <w:spacing w:after="0"/>
             </w:pPr>
-            <w:hyperlink w:history="1" r:id="rIdrjmolqtnmdfucd2kh_baj">
+            <w:hyperlink w:history="1" r:id="rIdusgfxo0q1n5vo6armabqa">
               <w:r>
                 <w:rPr>
                   <w:rFonts w:ascii="Calibri" w:cs="Calibri" w:eastAsia="Calibri" w:hAnsi="Calibri"/>
@@ -24920,7 +25298,7 @@
             <w:pPr>
               <w:spacing w:after="0"/>
             </w:pPr>
-            <w:hyperlink w:history="1" r:id="rId7xx3fy9r1kivhqw-hbdbu">
+            <w:hyperlink w:history="1" r:id="rIdivmw09rfu25xzfifsjdki">
               <w:r>
                 <w:rPr>
                   <w:rFonts w:ascii="Calibri" w:cs="Calibri" w:eastAsia="Calibri" w:hAnsi="Calibri"/>
@@ -25046,7 +25424,7 @@
             <w:pPr>
               <w:spacing w:after="0"/>
             </w:pPr>
-            <w:hyperlink w:history="1" r:id="rIdjog2vqawwhkmckjfmnj8r">
+            <w:hyperlink w:history="1" r:id="rIdfq_fxr0ydpnc_wnwcsbz5">
               <w:r>
                 <w:rPr>
                   <w:rFonts w:ascii="Calibri" w:cs="Calibri" w:eastAsia="Calibri" w:hAnsi="Calibri"/>
@@ -25172,7 +25550,7 @@
             <w:pPr>
               <w:spacing w:after="0"/>
             </w:pPr>
-            <w:hyperlink w:history="1" r:id="rIdcjx-yh_gmwxz9ahuipytz">
+            <w:hyperlink w:history="1" r:id="rIdbo4hl25snoicrgcmkvewf">
               <w:r>
                 <w:rPr>
                   <w:rFonts w:ascii="Calibri" w:cs="Calibri" w:eastAsia="Calibri" w:hAnsi="Calibri"/>
@@ -25298,7 +25676,7 @@
             <w:pPr>
               <w:spacing w:after="0"/>
             </w:pPr>
-            <w:hyperlink w:history="1" r:id="rIdahrk-oqwunxcauinp6m9b">
+            <w:hyperlink w:history="1" r:id="rId4zlm__9xfjtucxw_z_2ic">
               <w:r>
                 <w:rPr>
                   <w:rFonts w:ascii="Calibri" w:cs="Calibri" w:eastAsia="Calibri" w:hAnsi="Calibri"/>
@@ -25424,7 +25802,7 @@
             <w:pPr>
               <w:spacing w:after="0"/>
             </w:pPr>
-            <w:hyperlink w:history="1" r:id="rIdb8-iku_8ofaa5azakeb9l">
+            <w:hyperlink w:history="1" r:id="rIdtnvy-at5p83-dohrmezqp">
               <w:r>
                 <w:rPr>
                   <w:rFonts w:ascii="Calibri" w:cs="Calibri" w:eastAsia="Calibri" w:hAnsi="Calibri"/>
@@ -25550,7 +25928,7 @@
             <w:pPr>
               <w:spacing w:after="0"/>
             </w:pPr>
-            <w:hyperlink w:history="1" r:id="rIdmxrboelxamnkrs5d0g4wv">
+            <w:hyperlink w:history="1" r:id="rIdrnashuta3dhf3e8methbt">
               <w:r>
                 <w:rPr>
                   <w:rFonts w:ascii="Calibri" w:cs="Calibri" w:eastAsia="Calibri" w:hAnsi="Calibri"/>
@@ -25676,7 +26054,133 @@
             <w:pPr>
               <w:spacing w:after="0"/>
             </w:pPr>
-            <w:hyperlink w:history="1" r:id="rId4k3efwg-dljkogeoiyezs">
+            <w:hyperlink w:history="1" r:id="rIdpsjtduznwwbmlials3m8y">
+              <w:r>
+                <w:rPr>
+                  <w:rFonts w:ascii="Calibri" w:cs="Calibri" w:eastAsia="Calibri" w:hAnsi="Calibri"/>
+                  <w:color w:val="2A4FB7"/>
+                  <w:sz w:val="17"/>
+                  <w:szCs w:val="17"/>
+                  <w:u w:val="single"/>
+                </w:rPr>
+                <w:t xml:space="preserve">MOFCOM announcements on export controls of critical-mineral items</w:t>
+              </w:r>
+            </w:hyperlink>
+          </w:p>
+        </w:tc>
+        <w:tc>
+          <w:tcPr>
+            <w:tcW w:type="dxa" w:w="2600"/>
+            <w:tcMar>
+              <w:top w:type="dxa" w:w="60"/>
+              <w:left w:type="dxa" w:w="90"/>
+              <w:bottom w:type="dxa" w:w="60"/>
+              <w:right w:type="dxa" w:w="90"/>
+            </w:tcMar>
+          </w:tcPr>
+          <w:p>
+            <w:pPr>
+              <w:spacing w:after="0"/>
+            </w:pPr>
+            <w:r>
+              <w:rPr>
+                <w:rFonts w:ascii="Calibri" w:cs="Calibri" w:eastAsia="Calibri" w:hAnsi="Calibri"/>
+                <w:sz w:val="17"/>
+                <w:szCs w:val="17"/>
+              </w:rPr>
+              <w:t xml:space="preserve">Ministry of Commerce of the People's Republic of China (MOFCOM), with the General Administration of Customs</w:t>
+            </w:r>
+          </w:p>
+        </w:tc>
+        <w:tc>
+          <w:tcPr>
+            <w:tcW w:type="dxa" w:w="1900"/>
+            <w:tcMar>
+              <w:top w:type="dxa" w:w="60"/>
+              <w:left w:type="dxa" w:w="90"/>
+              <w:bottom w:type="dxa" w:w="60"/>
+              <w:right w:type="dxa" w:w="90"/>
+            </w:tcMar>
+          </w:tcPr>
+          <w:p>
+            <w:pPr>
+              <w:spacing w:after="0"/>
+            </w:pPr>
+            <w:r>
+              <w:rPr>
+                <w:rFonts w:ascii="Calibri" w:cs="Calibri" w:eastAsia="Calibri" w:hAnsi="Calibri"/>
+                <w:sz w:val="17"/>
+                <w:szCs w:val="17"/>
+              </w:rPr>
+              <w:t xml:space="preserve">MIN-R2</w:t>
+            </w:r>
+          </w:p>
+        </w:tc>
+        <w:tc>
+          <w:tcPr>
+            <w:tcW w:type="dxa" w:w="2100"/>
+            <w:tcMar>
+              <w:top w:type="dxa" w:w="60"/>
+              <w:left w:type="dxa" w:w="90"/>
+              <w:bottom w:type="dxa" w:w="60"/>
+              <w:right w:type="dxa" w:w="90"/>
+            </w:tcMar>
+          </w:tcPr>
+          <w:p>
+            <w:pPr>
+              <w:spacing w:after="0"/>
+            </w:pPr>
+            <w:r>
+              <w:rPr>
+                <w:rFonts w:ascii="Calibri" w:cs="Calibri" w:eastAsia="Calibri" w:hAnsi="Calibri"/>
+                <w:sz w:val="17"/>
+                <w:szCs w:val="17"/>
+              </w:rPr>
+              <w:t xml:space="preserve">irregular, announcements are issued as decided; MOFCOM keeps one announcement list per year (/zcfb/blgg/gg/&lt;year&gt;/index.html)</w:t>
+            </w:r>
+          </w:p>
+        </w:tc>
+        <w:tc>
+          <w:tcPr>
+            <w:tcW w:type="dxa" w:w="5198"/>
+            <w:tcMar>
+              <w:top w:type="dxa" w:w="60"/>
+              <w:left w:type="dxa" w:w="90"/>
+              <w:bottom w:type="dxa" w:w="60"/>
+              <w:right w:type="dxa" w:w="90"/>
+            </w:tcMar>
+          </w:tcPr>
+          <w:p>
+            <w:pPr>
+              <w:spacing w:after="0"/>
+            </w:pPr>
+            <w:r>
+              <w:rPr>
+                <w:rFonts w:ascii="Calibri" w:cs="Calibri" w:eastAsia="Calibri" w:hAnsi="Calibri"/>
+                <w:sz w:val="17"/>
+                <w:szCs w:val="17"/>
+              </w:rPr>
+              <w:t xml:space="preserve">2025 announcement list (in Chinese): MOFCOM/GAC No. 10 (tungsten, tellurium, bismuth, molybdenum, indium) and No. 18 (medium and heavy rare earths); MOFCOM/GAC Nos. 55 to 58 and MOFCOM Nos. 61 and 62 (October 2025) were suspended by MOFCOM/GAC No. 70</w:t>
+            </w:r>
+          </w:p>
+        </w:tc>
+      </w:tr>
+      <w:tr>
+        <w:tc>
+          <w:tcPr>
+            <w:tcW w:type="dxa" w:w="3600"/>
+            <w:tcMar>
+              <w:top w:type="dxa" w:w="60"/>
+              <w:left w:type="dxa" w:w="90"/>
+              <w:bottom w:type="dxa" w:w="60"/>
+              <w:right w:type="dxa" w:w="90"/>
+            </w:tcMar>
+          </w:tcPr>
+          <w:p>
+            <w:pPr>
+              <w:spacing w:after="0"/>
+            </w:pPr>
+            <w:hyperlink w:history="1" r:id="rIdxixfthei0aipc1grnpumv">
               <w:r>
                 <w:rPr>
                   <w:rFonts w:ascii="Calibri" w:cs="Calibri" w:eastAsia="Calibri" w:hAnsi="Calibri"/>
@@ -25802,7 +26306,7 @@
             <w:pPr>
               <w:spacing w:after="0"/>
             </w:pPr>
-            <w:hyperlink w:history="1" r:id="rIdmlqn3_amh5q8-bvpbcl1n">
+            <w:hyperlink w:history="1" r:id="rIdwmoqtxetes4uq6j6mfvo4">
               <w:r>
                 <w:rPr>
                   <w:rFonts w:ascii="Calibri" w:cs="Calibri" w:eastAsia="Calibri" w:hAnsi="Calibri"/>
@@ -25928,7 +26432,7 @@
             <w:pPr>
               <w:spacing w:after="0"/>
             </w:pPr>
-            <w:hyperlink w:history="1" r:id="rIdopdoeaijqgdfatsrz3jtd">
+            <w:hyperlink w:history="1" r:id="rIdw9cj9akzrycovtkkttys1">
               <w:r>
                 <w:rPr>
                   <w:rFonts w:ascii="Calibri" w:cs="Calibri" w:eastAsia="Calibri" w:hAnsi="Calibri"/>
@@ -26054,7 +26558,7 @@
             <w:pPr>
               <w:spacing w:after="0"/>
             </w:pPr>
-            <w:hyperlink w:history="1" r:id="rIdj7k-yhtjz8dmldngsyozq">
+            <w:hyperlink w:history="1" r:id="rIdh5pupm84e1oi31g7khe6q">
               <w:r>
                 <w:rPr>
                   <w:rFonts w:ascii="Calibri" w:cs="Calibri" w:eastAsia="Calibri" w:hAnsi="Calibri"/>
@@ -26180,7 +26684,7 @@
             <w:pPr>
               <w:spacing w:after="0"/>
             </w:pPr>
-            <w:hyperlink w:history="1" r:id="rIdkowvurxifxqiuokpkugui">
+            <w:hyperlink w:history="1" r:id="rIdc7smamxjqvycty5jfwxev">
               <w:r>
                 <w:rPr>
                   <w:rFonts w:ascii="Calibri" w:cs="Calibri" w:eastAsia="Calibri" w:hAnsi="Calibri"/>
@@ -26306,7 +26810,7 @@
             <w:pPr>
               <w:spacing w:after="0"/>
             </w:pPr>
-            <w:hyperlink w:history="1" r:id="rIdg2jn12saiggec5vi80zyz">
+            <w:hyperlink w:history="1" r:id="rIdyddbsrw_xb3urmxq1hdqu">
               <w:r>
                 <w:rPr>
                   <w:rFonts w:ascii="Calibri" w:cs="Calibri" w:eastAsia="Calibri" w:hAnsi="Calibri"/>
@@ -26432,7 +26936,7 @@
             <w:pPr>
               <w:spacing w:after="0"/>
             </w:pPr>
-            <w:hyperlink w:history="1" r:id="rIdakkf9pg8gvqoynlentdew">
+            <w:hyperlink w:history="1" r:id="rIdaol-3qwyytbv5armim3l0">
               <w:r>
                 <w:rPr>
                   <w:rFonts w:ascii="Calibri" w:cs="Calibri" w:eastAsia="Calibri" w:hAnsi="Calibri"/>
@@ -26558,7 +27062,7 @@
             <w:pPr>
               <w:spacing w:after="0"/>
             </w:pPr>
-            <w:hyperlink w:history="1" r:id="rIduirswryd429mfdyl362_p">
+            <w:hyperlink w:history="1" r:id="rIda0mkgnic7uuquamtrzie2">
               <w:r>
                 <w:rPr>
                   <w:rFonts w:ascii="Calibri" w:cs="Calibri" w:eastAsia="Calibri" w:hAnsi="Calibri"/>
@@ -26665,6 +27169,132 @@
                 <w:szCs w:val="17"/>
               </w:rPr>
               <w:t xml:space="preserve">SAF Grand Challenge Roadmap (DOE, September 2022): the goals of 3 billion gallons of SAF per year by 2030 and 35 billion by 2050, a volume goal rather than a blending mandate. The IRA section 40B SAF credit is Treasury/IRS guidance and is not in this document.</w:t>
+            </w:r>
+          </w:p>
+        </w:tc>
+      </w:tr>
+      <w:tr>
+        <w:tc>
+          <w:tcPr>
+            <w:tcW w:type="dxa" w:w="3600"/>
+            <w:tcMar>
+              <w:top w:type="dxa" w:w="60"/>
+              <w:left w:type="dxa" w:w="90"/>
+              <w:bottom w:type="dxa" w:w="60"/>
+              <w:right w:type="dxa" w:w="90"/>
+            </w:tcMar>
+          </w:tcPr>
+          <w:p>
+            <w:pPr>
+              <w:spacing w:after="0"/>
+            </w:pPr>
+            <w:hyperlink w:history="1" r:id="rIdu9zpd9eoj0gzuuutqccdu">
+              <w:r>
+                <w:rPr>
+                  <w:rFonts w:ascii="Calibri" w:cs="Calibri" w:eastAsia="Calibri" w:hAnsi="Calibri"/>
+                  <w:color w:val="2A4FB7"/>
+                  <w:sz w:val="17"/>
+                  <w:szCs w:val="17"/>
+                  <w:u w:val="single"/>
+                </w:rPr>
+                <w:t xml:space="preserve">US Treasury/IRS Section 45V final regulations (TD 10023)</w:t>
+              </w:r>
+            </w:hyperlink>
+          </w:p>
+        </w:tc>
+        <w:tc>
+          <w:tcPr>
+            <w:tcW w:type="dxa" w:w="2600"/>
+            <w:tcMar>
+              <w:top w:type="dxa" w:w="60"/>
+              <w:left w:type="dxa" w:w="90"/>
+              <w:bottom w:type="dxa" w:w="60"/>
+              <w:right w:type="dxa" w:w="90"/>
+            </w:tcMar>
+          </w:tcPr>
+          <w:p>
+            <w:pPr>
+              <w:spacing w:after="0"/>
+            </w:pPr>
+            <w:r>
+              <w:rPr>
+                <w:rFonts w:ascii="Calibri" w:cs="Calibri" w:eastAsia="Calibri" w:hAnsi="Calibri"/>
+                <w:sz w:val="17"/>
+                <w:szCs w:val="17"/>
+              </w:rPr>
+              <w:t xml:space="preserve">US Department of the Treasury, Internal Revenue Service</w:t>
+            </w:r>
+          </w:p>
+        </w:tc>
+        <w:tc>
+          <w:tcPr>
+            <w:tcW w:type="dxa" w:w="1900"/>
+            <w:tcMar>
+              <w:top w:type="dxa" w:w="60"/>
+              <w:left w:type="dxa" w:w="90"/>
+              <w:bottom w:type="dxa" w:w="60"/>
+              <w:right w:type="dxa" w:w="90"/>
+            </w:tcMar>
+          </w:tcPr>
+          <w:p>
+            <w:pPr>
+              <w:spacing w:after="0"/>
+            </w:pPr>
+            <w:r>
+              <w:rPr>
+                <w:rFonts w:ascii="Calibri" w:cs="Calibri" w:eastAsia="Calibri" w:hAnsi="Calibri"/>
+                <w:sz w:val="17"/>
+                <w:szCs w:val="17"/>
+              </w:rPr>
+              <w:t xml:space="preserve">CHM-T1, STL-T1</w:t>
+            </w:r>
+          </w:p>
+        </w:tc>
+        <w:tc>
+          <w:tcPr>
+            <w:tcW w:type="dxa" w:w="2100"/>
+            <w:tcMar>
+              <w:top w:type="dxa" w:w="60"/>
+              <w:left w:type="dxa" w:w="90"/>
+              <w:bottom w:type="dxa" w:w="60"/>
+              <w:right w:type="dxa" w:w="90"/>
+            </w:tcMar>
+          </w:tcPr>
+          <w:p>
+            <w:pPr>
+              <w:spacing w:after="0"/>
+            </w:pPr>
+            <w:r>
+              <w:rPr>
+                <w:rFonts w:ascii="Calibri" w:cs="Calibri" w:eastAsia="Calibri" w:hAnsi="Calibri"/>
+                <w:sz w:val="17"/>
+                <w:szCs w:val="17"/>
+              </w:rPr>
+              <w:t xml:space="preserve">one-off final rule (90 FR 2224, 10 January 2025); later changes to the credit come by statute or a new rulemaking</w:t>
+            </w:r>
+          </w:p>
+        </w:tc>
+        <w:tc>
+          <w:tcPr>
+            <w:tcW w:type="dxa" w:w="5198"/>
+            <w:tcMar>
+              <w:top w:type="dxa" w:w="60"/>
+              <w:left w:type="dxa" w:w="90"/>
+              <w:bottom w:type="dxa" w:w="60"/>
+              <w:right w:type="dxa" w:w="90"/>
+            </w:tcMar>
+          </w:tcPr>
+          <w:p>
+            <w:pPr>
+              <w:spacing w:after="0"/>
+            </w:pPr>
+            <w:r>
+              <w:rPr>
+                <w:rFonts w:ascii="Calibri" w:cs="Calibri" w:eastAsia="Calibri" w:hAnsi="Calibri"/>
+                <w:sz w:val="17"/>
+                <w:szCs w:val="17"/>
+              </w:rPr>
+              <w:t xml:space="preserve">§ 1.45V-1(b) amount of credit; § 1.45V-4 lifecycle GHG emissions rate (45VH2-GREET), with § 1.45V-4(d) (from 90 FR 2316) on energy attribute certificates: incrementality, temporal matching, deliverability</w:t>
             </w:r>
           </w:p>
         </w:tc>
@@ -27769,7 +28399,7 @@
           <w:sz w:val="20"/>
           <w:szCs w:val="20"/>
         </w:rPr>
-        <w:t xml:space="preserve">102 criterion-source links dedupe to 89 registry entries. The registry keeps per-criterion duplicates for company disclosures rather than sharing one key.</w:t>
+        <w:t xml:space="preserve">108 criterion-source links dedupe to 94 registry entries. The registry keeps per-criterion duplicates for company disclosures rather than sharing one key.</w:t>
       </w:r>
     </w:p>
     <w:p>
@@ -27832,7 +28462,7 @@
           <w:sz w:val="20"/>
           <w:szCs w:val="20"/>
         </w:rPr>
-        <w:t xml:space="preserve">7 of 102 source entries carry no URL. These are the company_disclosure entries, which correctly record a retrieval methodology instead.</w:t>
+        <w:t xml:space="preserve">7 of 108 source entries carry no URL. These are the company_disclosure entries, which correctly record a retrieval methodology instead.</w:t>
       </w:r>
     </w:p>
     <w:sectPr>

</xml_diff>

<commit_message>
feat(barrier): owner decisions on rule book v1; sign as version 2
- PWR-R1 p_material 15 -> 33.92 (the OECD EUR 30 line STL-R1, CEM-R1
  and CHM-R1 already use), so every criterion uses one 'material'
  carbon price. Moves no cell.
- OGU-R1 (reading a), net of free allocation, the 16 other
  rubric-sourced thresholds and the judgement calls stay as written.
- Signed as version 2, approved_by kutschersteffen-cmd; re-rendered
  RULE_BOOK.md, impact table records the decisions, Word report
  regenerated.

Co-Authored-By: Claude Opus 5.5 <noreply@anthropic.com>
Claude-Session: https://claude.ai/code/session_011c64i8dJvK17G4EiSpMNHy
</commit_message>
<xml_diff>
--- a/docs/transition_barrier/Transition_Barrier_Assessment_Report.docx
+++ b/docs/transition_barrier/Transition_Barrier_Assessment_Report.docx
@@ -2335,7 +2335,7 @@
                 <w:sz w:val="17"/>
                 <w:szCs w:val="17"/>
               </w:rPr>
-              <w:t xml:space="preserve">Effective carbon price on power &gt;= 15 USD/tCO2 or Clean generation mandate = other_target</w:t>
+              <w:t xml:space="preserve">Effective carbon price on power &gt;= 33.92 USD/tCO2 or Clean generation mandate = other_target</w:t>
             </w:r>
           </w:p>
         </w:tc>
@@ -15572,7 +15572,7 @@
             <w:pPr>
               <w:spacing w:after="0"/>
             </w:pPr>
-            <w:hyperlink w:history="1" r:id="rIdditzrifcb7b1yoxk43nft">
+            <w:hyperlink w:history="1" r:id="rIdqecwjezwhbiqisaz3zamp">
               <w:r>
                 <w:rPr>
                   <w:rFonts w:ascii="Calibri" w:cs="Calibri" w:eastAsia="Calibri" w:hAnsi="Calibri"/>
@@ -15698,7 +15698,7 @@
             <w:pPr>
               <w:spacing w:after="0"/>
             </w:pPr>
-            <w:hyperlink w:history="1" r:id="rId11yc6ptr7m9nomj_fkdkm">
+            <w:hyperlink w:history="1" r:id="rIdcenepmyozndlcji3srpdu">
               <w:r>
                 <w:rPr>
                   <w:rFonts w:ascii="Calibri" w:cs="Calibri" w:eastAsia="Calibri" w:hAnsi="Calibri"/>
@@ -15824,7 +15824,7 @@
             <w:pPr>
               <w:spacing w:after="0"/>
             </w:pPr>
-            <w:hyperlink w:history="1" r:id="rIdcqa-mgt2mfeyusyslldfe">
+            <w:hyperlink w:history="1" r:id="rIdloyipsdwokbqaenmym1n0">
               <w:r>
                 <w:rPr>
                   <w:rFonts w:ascii="Calibri" w:cs="Calibri" w:eastAsia="Calibri" w:hAnsi="Calibri"/>
@@ -15950,7 +15950,7 @@
             <w:pPr>
               <w:spacing w:after="0"/>
             </w:pPr>
-            <w:hyperlink w:history="1" r:id="rIdsznl8jqxi5syt04akm5zn">
+            <w:hyperlink w:history="1" r:id="rIdazo4exqcdff96hpog7u9l">
               <w:r>
                 <w:rPr>
                   <w:rFonts w:ascii="Calibri" w:cs="Calibri" w:eastAsia="Calibri" w:hAnsi="Calibri"/>
@@ -16076,7 +16076,7 @@
             <w:pPr>
               <w:spacing w:after="0"/>
             </w:pPr>
-            <w:hyperlink w:history="1" r:id="rIdurlbdo6tjvndk5s4lhu0_">
+            <w:hyperlink w:history="1" r:id="rIdfcbfzgkz9mrjvgck0jv8t">
               <w:r>
                 <w:rPr>
                   <w:rFonts w:ascii="Calibri" w:cs="Calibri" w:eastAsia="Calibri" w:hAnsi="Calibri"/>
@@ -16202,7 +16202,7 @@
             <w:pPr>
               <w:spacing w:after="0"/>
             </w:pPr>
-            <w:hyperlink w:history="1" r:id="rIdpjgsznm51onjhtjsawskb">
+            <w:hyperlink w:history="1" r:id="rIdwxvvorxbxrkb-ok05xx9z">
               <w:r>
                 <w:rPr>
                   <w:rFonts w:ascii="Calibri" w:cs="Calibri" w:eastAsia="Calibri" w:hAnsi="Calibri"/>
@@ -16328,7 +16328,7 @@
             <w:pPr>
               <w:spacing w:after="0"/>
             </w:pPr>
-            <w:hyperlink w:history="1" r:id="rIdccb4ks8anfx-kyfiy_typ">
+            <w:hyperlink w:history="1" r:id="rIdibo1bian3u4ozepxlxdna">
               <w:r>
                 <w:rPr>
                   <w:rFonts w:ascii="Calibri" w:cs="Calibri" w:eastAsia="Calibri" w:hAnsi="Calibri"/>
@@ -16454,7 +16454,7 @@
             <w:pPr>
               <w:spacing w:after="0"/>
             </w:pPr>
-            <w:hyperlink w:history="1" r:id="rIdmykrx3npphzd1ymwxn3i_">
+            <w:hyperlink w:history="1" r:id="rId9nwsxqymu_nsnyldtgjfm">
               <w:r>
                 <w:rPr>
                   <w:rFonts w:ascii="Calibri" w:cs="Calibri" w:eastAsia="Calibri" w:hAnsi="Calibri"/>
@@ -16580,7 +16580,7 @@
             <w:pPr>
               <w:spacing w:after="0"/>
             </w:pPr>
-            <w:hyperlink w:history="1" r:id="rIdexwmn_ng3tcbzngsnmxvv">
+            <w:hyperlink w:history="1" r:id="rIdz0cgg8m5xmkjb8gtuzghi">
               <w:r>
                 <w:rPr>
                   <w:rFonts w:ascii="Calibri" w:cs="Calibri" w:eastAsia="Calibri" w:hAnsi="Calibri"/>
@@ -16706,7 +16706,7 @@
             <w:pPr>
               <w:spacing w:after="0"/>
             </w:pPr>
-            <w:hyperlink w:history="1" r:id="rId3pyimgd04rlhgyyd02vz2">
+            <w:hyperlink w:history="1" r:id="rIdp9qin5xee_i3kjwhtixjz">
               <w:r>
                 <w:rPr>
                   <w:rFonts w:ascii="Calibri" w:cs="Calibri" w:eastAsia="Calibri" w:hAnsi="Calibri"/>
@@ -16832,7 +16832,7 @@
             <w:pPr>
               <w:spacing w:after="0"/>
             </w:pPr>
-            <w:hyperlink w:history="1" r:id="rId7j6nwsags7seeedn2posy">
+            <w:hyperlink w:history="1" r:id="rIdzkovwhxkqbcpmdtzrlemy">
               <w:r>
                 <w:rPr>
                   <w:rFonts w:ascii="Calibri" w:cs="Calibri" w:eastAsia="Calibri" w:hAnsi="Calibri"/>
@@ -16958,7 +16958,7 @@
             <w:pPr>
               <w:spacing w:after="0"/>
             </w:pPr>
-            <w:hyperlink w:history="1" r:id="rIdcisx9k_2_ylfy1uqcfcff">
+            <w:hyperlink w:history="1" r:id="rId9e2yhadyrggxgpks8hysd">
               <w:r>
                 <w:rPr>
                   <w:rFonts w:ascii="Calibri" w:cs="Calibri" w:eastAsia="Calibri" w:hAnsi="Calibri"/>
@@ -17084,7 +17084,7 @@
             <w:pPr>
               <w:spacing w:after="0"/>
             </w:pPr>
-            <w:hyperlink w:history="1" r:id="rIdwi3sb9o98vgis4btink0t">
+            <w:hyperlink w:history="1" r:id="rIdxk-h-zmgsfrwmbmgo4bex">
               <w:r>
                 <w:rPr>
                   <w:rFonts w:ascii="Calibri" w:cs="Calibri" w:eastAsia="Calibri" w:hAnsi="Calibri"/>
@@ -17210,7 +17210,7 @@
             <w:pPr>
               <w:spacing w:after="0"/>
             </w:pPr>
-            <w:hyperlink w:history="1" r:id="rId86il4x0-dilaii-hr9kqt">
+            <w:hyperlink w:history="1" r:id="rId25avrtr7-ecwlhre9ormz">
               <w:r>
                 <w:rPr>
                   <w:rFonts w:ascii="Calibri" w:cs="Calibri" w:eastAsia="Calibri" w:hAnsi="Calibri"/>
@@ -17336,7 +17336,7 @@
             <w:pPr>
               <w:spacing w:after="0"/>
             </w:pPr>
-            <w:hyperlink w:history="1" r:id="rIdz6vchqkaajtc4xmi_p0yk">
+            <w:hyperlink w:history="1" r:id="rIdnzm_u94xew55xgaphckic">
               <w:r>
                 <w:rPr>
                   <w:rFonts w:ascii="Calibri" w:cs="Calibri" w:eastAsia="Calibri" w:hAnsi="Calibri"/>
@@ -17657,7 +17657,7 @@
             <w:pPr>
               <w:spacing w:after="0"/>
             </w:pPr>
-            <w:hyperlink w:history="1" r:id="rIdvmmx54ygkwmsl-xo34hrm">
+            <w:hyperlink w:history="1" r:id="rId0wdkppk4vcuw7r89u_c0z">
               <w:r>
                 <w:rPr>
                   <w:rFonts w:ascii="Calibri" w:cs="Calibri" w:eastAsia="Calibri" w:hAnsi="Calibri"/>
@@ -17783,7 +17783,7 @@
             <w:pPr>
               <w:spacing w:after="0"/>
             </w:pPr>
-            <w:hyperlink w:history="1" r:id="rIdqwarmvwstegtqumsgpmhr">
+            <w:hyperlink w:history="1" r:id="rIdr1hnms54jmxz-d2ve8msi">
               <w:r>
                 <w:rPr>
                   <w:rFonts w:ascii="Calibri" w:cs="Calibri" w:eastAsia="Calibri" w:hAnsi="Calibri"/>
@@ -17909,7 +17909,7 @@
             <w:pPr>
               <w:spacing w:after="0"/>
             </w:pPr>
-            <w:hyperlink w:history="1" r:id="rId6g40ehj1yn4phvz13sq9a">
+            <w:hyperlink w:history="1" r:id="rIdptkv-ffguh49ybi39h1wd">
               <w:r>
                 <w:rPr>
                   <w:rFonts w:ascii="Calibri" w:cs="Calibri" w:eastAsia="Calibri" w:hAnsi="Calibri"/>
@@ -18035,7 +18035,7 @@
             <w:pPr>
               <w:spacing w:after="0"/>
             </w:pPr>
-            <w:hyperlink w:history="1" r:id="rId1s3iupzfhsoay4y4biaji">
+            <w:hyperlink w:history="1" r:id="rIdviu75oyjn7d_9mdyjwnwp">
               <w:r>
                 <w:rPr>
                   <w:rFonts w:ascii="Calibri" w:cs="Calibri" w:eastAsia="Calibri" w:hAnsi="Calibri"/>
@@ -18161,7 +18161,7 @@
             <w:pPr>
               <w:spacing w:after="0"/>
             </w:pPr>
-            <w:hyperlink w:history="1" r:id="rIdghnlklqea6s7vlfpbtmuj">
+            <w:hyperlink w:history="1" r:id="rIdpawanpjdjnbagpx5ca58a">
               <w:r>
                 <w:rPr>
                   <w:rFonts w:ascii="Calibri" w:cs="Calibri" w:eastAsia="Calibri" w:hAnsi="Calibri"/>
@@ -18287,7 +18287,7 @@
             <w:pPr>
               <w:spacing w:after="0"/>
             </w:pPr>
-            <w:hyperlink w:history="1" r:id="rId5br9r_u5_ml-wqevriogp">
+            <w:hyperlink w:history="1" r:id="rIdsjcrz9ldy3rdsxgnhl2zm">
               <w:r>
                 <w:rPr>
                   <w:rFonts w:ascii="Calibri" w:cs="Calibri" w:eastAsia="Calibri" w:hAnsi="Calibri"/>
@@ -18608,7 +18608,7 @@
             <w:pPr>
               <w:spacing w:after="0"/>
             </w:pPr>
-            <w:hyperlink w:history="1" r:id="rIdtagncas47vos0fc2nkcen">
+            <w:hyperlink w:history="1" r:id="rIdwilwip6zrjpamacgrzqzs">
               <w:r>
                 <w:rPr>
                   <w:rFonts w:ascii="Calibri" w:cs="Calibri" w:eastAsia="Calibri" w:hAnsi="Calibri"/>
@@ -18734,7 +18734,7 @@
             <w:pPr>
               <w:spacing w:after="0"/>
             </w:pPr>
-            <w:hyperlink w:history="1" r:id="rId5wjyzccmbj3f-jwhvtlck">
+            <w:hyperlink w:history="1" r:id="rIdqe4npnv7ns9xxawjj4jem">
               <w:r>
                 <w:rPr>
                   <w:rFonts w:ascii="Calibri" w:cs="Calibri" w:eastAsia="Calibri" w:hAnsi="Calibri"/>
@@ -18860,7 +18860,7 @@
             <w:pPr>
               <w:spacing w:after="0"/>
             </w:pPr>
-            <w:hyperlink w:history="1" r:id="rIdjl9d-zvffbfhijkuwpzia">
+            <w:hyperlink w:history="1" r:id="rIdbadnw8hxniqcut_jq_op8">
               <w:r>
                 <w:rPr>
                   <w:rFonts w:ascii="Calibri" w:cs="Calibri" w:eastAsia="Calibri" w:hAnsi="Calibri"/>
@@ -18986,7 +18986,7 @@
             <w:pPr>
               <w:spacing w:after="0"/>
             </w:pPr>
-            <w:hyperlink w:history="1" r:id="rIdlrruqt009gp5iscnt2f0g">
+            <w:hyperlink w:history="1" r:id="rIdtrkhp1xtt-9rbojsmusg4">
               <w:r>
                 <w:rPr>
                   <w:rFonts w:ascii="Calibri" w:cs="Calibri" w:eastAsia="Calibri" w:hAnsi="Calibri"/>
@@ -19112,7 +19112,7 @@
             <w:pPr>
               <w:spacing w:after="0"/>
             </w:pPr>
-            <w:hyperlink w:history="1" r:id="rIdlegtfzh354motssmggmbn">
+            <w:hyperlink w:history="1" r:id="rIdgoeiwsvrcau90hzxaqkyv">
               <w:r>
                 <w:rPr>
                   <w:rFonts w:ascii="Calibri" w:cs="Calibri" w:eastAsia="Calibri" w:hAnsi="Calibri"/>
@@ -19238,7 +19238,7 @@
             <w:pPr>
               <w:spacing w:after="0"/>
             </w:pPr>
-            <w:hyperlink w:history="1" r:id="rIdsaspkyih8nlvdl7pnsh_5">
+            <w:hyperlink w:history="1" r:id="rIdyjgqcjin6bdugczh0x1oq">
               <w:r>
                 <w:rPr>
                   <w:rFonts w:ascii="Calibri" w:cs="Calibri" w:eastAsia="Calibri" w:hAnsi="Calibri"/>
@@ -19364,7 +19364,7 @@
             <w:pPr>
               <w:spacing w:after="0"/>
             </w:pPr>
-            <w:hyperlink w:history="1" r:id="rIdl2wj28lb8i_50-hije0xx">
+            <w:hyperlink w:history="1" r:id="rIdxh4qr-2d04zw8s1vjfopq">
               <w:r>
                 <w:rPr>
                   <w:rFonts w:ascii="Calibri" w:cs="Calibri" w:eastAsia="Calibri" w:hAnsi="Calibri"/>
@@ -19490,7 +19490,7 @@
             <w:pPr>
               <w:spacing w:after="0"/>
             </w:pPr>
-            <w:hyperlink w:history="1" r:id="rIdpiht7vypockstmjholk--">
+            <w:hyperlink w:history="1" r:id="rIddytfctqowxb8hmkaybxv1">
               <w:r>
                 <w:rPr>
                   <w:rFonts w:ascii="Calibri" w:cs="Calibri" w:eastAsia="Calibri" w:hAnsi="Calibri"/>
@@ -19616,7 +19616,7 @@
             <w:pPr>
               <w:spacing w:after="0"/>
             </w:pPr>
-            <w:hyperlink w:history="1" r:id="rId-v5yzp7j-qt6vol-j0vck">
+            <w:hyperlink w:history="1" r:id="rIdzlztjrznun0nvjymda2ep">
               <w:r>
                 <w:rPr>
                   <w:rFonts w:ascii="Calibri" w:cs="Calibri" w:eastAsia="Calibri" w:hAnsi="Calibri"/>
@@ -19742,7 +19742,7 @@
             <w:pPr>
               <w:spacing w:after="0"/>
             </w:pPr>
-            <w:hyperlink w:history="1" r:id="rIddehrkrls_s6e0deij3afm">
+            <w:hyperlink w:history="1" r:id="rIdncnewyoodu4oew_axbr62">
               <w:r>
                 <w:rPr>
                   <w:rFonts w:ascii="Calibri" w:cs="Calibri" w:eastAsia="Calibri" w:hAnsi="Calibri"/>
@@ -19868,7 +19868,7 @@
             <w:pPr>
               <w:spacing w:after="0"/>
             </w:pPr>
-            <w:hyperlink w:history="1" r:id="rIdebeowdwnyjhjb9glgey-g">
+            <w:hyperlink w:history="1" r:id="rId7vw3afszvb5x2e3d_csj6">
               <w:r>
                 <w:rPr>
                   <w:rFonts w:ascii="Calibri" w:cs="Calibri" w:eastAsia="Calibri" w:hAnsi="Calibri"/>
@@ -20189,7 +20189,7 @@
             <w:pPr>
               <w:spacing w:after="0"/>
             </w:pPr>
-            <w:hyperlink w:history="1" r:id="rIdjle2esc8_mwvonm0cfffh">
+            <w:hyperlink w:history="1" r:id="rId0eyixh2sldpjn23pqh9wc">
               <w:r>
                 <w:rPr>
                   <w:rFonts w:ascii="Calibri" w:cs="Calibri" w:eastAsia="Calibri" w:hAnsi="Calibri"/>
@@ -20315,7 +20315,7 @@
             <w:pPr>
               <w:spacing w:after="0"/>
             </w:pPr>
-            <w:hyperlink w:history="1" r:id="rIdqvs1n5vr4hca_sgarazue">
+            <w:hyperlink w:history="1" r:id="rIdprhhoaga5p8knmu5eiwaf">
               <w:r>
                 <w:rPr>
                   <w:rFonts w:ascii="Calibri" w:cs="Calibri" w:eastAsia="Calibri" w:hAnsi="Calibri"/>
@@ -20441,7 +20441,7 @@
             <w:pPr>
               <w:spacing w:after="0"/>
             </w:pPr>
-            <w:hyperlink w:history="1" r:id="rIdhez5pr0jybfniqcrkq-um">
+            <w:hyperlink w:history="1" r:id="rIduhlxj-zt2bl-44skdr_hg">
               <w:r>
                 <w:rPr>
                   <w:rFonts w:ascii="Calibri" w:cs="Calibri" w:eastAsia="Calibri" w:hAnsi="Calibri"/>
@@ -20567,7 +20567,7 @@
             <w:pPr>
               <w:spacing w:after="0"/>
             </w:pPr>
-            <w:hyperlink w:history="1" r:id="rIdogpudrhcjvgzfe5srk-4s">
+            <w:hyperlink w:history="1" r:id="rIdewcdjsla9hziabn-ewrh-">
               <w:r>
                 <w:rPr>
                   <w:rFonts w:ascii="Calibri" w:cs="Calibri" w:eastAsia="Calibri" w:hAnsi="Calibri"/>
@@ -20693,7 +20693,7 @@
             <w:pPr>
               <w:spacing w:after="0"/>
             </w:pPr>
-            <w:hyperlink w:history="1" r:id="rIdzhylicrrshf6bohracdz2">
+            <w:hyperlink w:history="1" r:id="rIdqwzqdwsdwaqqeasqlubiv">
               <w:r>
                 <w:rPr>
                   <w:rFonts w:ascii="Calibri" w:cs="Calibri" w:eastAsia="Calibri" w:hAnsi="Calibri"/>
@@ -20819,7 +20819,7 @@
             <w:pPr>
               <w:spacing w:after="0"/>
             </w:pPr>
-            <w:hyperlink w:history="1" r:id="rId_krruc86hmfuxixvlne-r">
+            <w:hyperlink w:history="1" r:id="rIdvkbamfawevcbt9shablba">
               <w:r>
                 <w:rPr>
                   <w:rFonts w:ascii="Calibri" w:cs="Calibri" w:eastAsia="Calibri" w:hAnsi="Calibri"/>
@@ -20945,7 +20945,7 @@
             <w:pPr>
               <w:spacing w:after="0"/>
             </w:pPr>
-            <w:hyperlink w:history="1" r:id="rIdm6w3l5uuw--4bsten30v6">
+            <w:hyperlink w:history="1" r:id="rIdaw46o8hudzaicq8c9kl9l">
               <w:r>
                 <w:rPr>
                   <w:rFonts w:ascii="Calibri" w:cs="Calibri" w:eastAsia="Calibri" w:hAnsi="Calibri"/>
@@ -21071,7 +21071,7 @@
             <w:pPr>
               <w:spacing w:after="0"/>
             </w:pPr>
-            <w:hyperlink w:history="1" r:id="rIdly42vxschrm-g3wnhcpbh">
+            <w:hyperlink w:history="1" r:id="rIdhty5nj48xut1zy-q2dgt4">
               <w:r>
                 <w:rPr>
                   <w:rFonts w:ascii="Calibri" w:cs="Calibri" w:eastAsia="Calibri" w:hAnsi="Calibri"/>
@@ -21197,7 +21197,7 @@
             <w:pPr>
               <w:spacing w:after="0"/>
             </w:pPr>
-            <w:hyperlink w:history="1" r:id="rIdyswfjvzriioiqxe6iity0">
+            <w:hyperlink w:history="1" r:id="rIdzompauvbelp06gsfbxlsl">
               <w:r>
                 <w:rPr>
                   <w:rFonts w:ascii="Calibri" w:cs="Calibri" w:eastAsia="Calibri" w:hAnsi="Calibri"/>
@@ -21323,7 +21323,7 @@
             <w:pPr>
               <w:spacing w:after="0"/>
             </w:pPr>
-            <w:hyperlink w:history="1" r:id="rId1llt016zojhy1d9y3q4yk">
+            <w:hyperlink w:history="1" r:id="rIdle_f0jzu1o8qo2tymwksm">
               <w:r>
                 <w:rPr>
                   <w:rFonts w:ascii="Calibri" w:cs="Calibri" w:eastAsia="Calibri" w:hAnsi="Calibri"/>
@@ -21449,7 +21449,7 @@
             <w:pPr>
               <w:spacing w:after="0"/>
             </w:pPr>
-            <w:hyperlink w:history="1" r:id="rIdtzctxblx7c8qnfvlimfgt">
+            <w:hyperlink w:history="1" r:id="rIdm8a2p_ee6q5nwtlix1-z4">
               <w:r>
                 <w:rPr>
                   <w:rFonts w:ascii="Calibri" w:cs="Calibri" w:eastAsia="Calibri" w:hAnsi="Calibri"/>
@@ -21575,7 +21575,7 @@
             <w:pPr>
               <w:spacing w:after="0"/>
             </w:pPr>
-            <w:hyperlink w:history="1" r:id="rIdi7fr8m2fvwlk8nxlcqgtk">
+            <w:hyperlink w:history="1" r:id="rIdsjc8mfa3zdiuthbngfbsb">
               <w:r>
                 <w:rPr>
                   <w:rFonts w:ascii="Calibri" w:cs="Calibri" w:eastAsia="Calibri" w:hAnsi="Calibri"/>
@@ -21701,7 +21701,7 @@
             <w:pPr>
               <w:spacing w:after="0"/>
             </w:pPr>
-            <w:hyperlink w:history="1" r:id="rIdg7mqdyqzrakym_xzhuyti">
+            <w:hyperlink w:history="1" r:id="rIdlsxismhuuog5hmvtkaxo5">
               <w:r>
                 <w:rPr>
                   <w:rFonts w:ascii="Calibri" w:cs="Calibri" w:eastAsia="Calibri" w:hAnsi="Calibri"/>
@@ -21827,7 +21827,7 @@
             <w:pPr>
               <w:spacing w:after="0"/>
             </w:pPr>
-            <w:hyperlink w:history="1" r:id="rIdsakff5gyfmlhnooiskmfs">
+            <w:hyperlink w:history="1" r:id="rIdaw4ahuvry6mqhy68mx_ib">
               <w:r>
                 <w:rPr>
                   <w:rFonts w:ascii="Calibri" w:cs="Calibri" w:eastAsia="Calibri" w:hAnsi="Calibri"/>
@@ -21953,7 +21953,7 @@
             <w:pPr>
               <w:spacing w:after="0"/>
             </w:pPr>
-            <w:hyperlink w:history="1" r:id="rId8vn3lrb8drddgahnif_wh">
+            <w:hyperlink w:history="1" r:id="rIdxhzqijtquz53s0e3ggcsu">
               <w:r>
                 <w:rPr>
                   <w:rFonts w:ascii="Calibri" w:cs="Calibri" w:eastAsia="Calibri" w:hAnsi="Calibri"/>
@@ -22079,7 +22079,7 @@
             <w:pPr>
               <w:spacing w:after="0"/>
             </w:pPr>
-            <w:hyperlink w:history="1" r:id="rIdqbthnav2vmai692pw32p3">
+            <w:hyperlink w:history="1" r:id="rIdhtkcgd4kwtrxsqgcasr2u">
               <w:r>
                 <w:rPr>
                   <w:rFonts w:ascii="Calibri" w:cs="Calibri" w:eastAsia="Calibri" w:hAnsi="Calibri"/>
@@ -22205,7 +22205,7 @@
             <w:pPr>
               <w:spacing w:after="0"/>
             </w:pPr>
-            <w:hyperlink w:history="1" r:id="rIdaoh4kevnvjc24lt7mmvx1">
+            <w:hyperlink w:history="1" r:id="rIdfdprkfihi2rxahgpw1rok">
               <w:r>
                 <w:rPr>
                   <w:rFonts w:ascii="Calibri" w:cs="Calibri" w:eastAsia="Calibri" w:hAnsi="Calibri"/>
@@ -22331,7 +22331,7 @@
             <w:pPr>
               <w:spacing w:after="0"/>
             </w:pPr>
-            <w:hyperlink w:history="1" r:id="rId7odzk_ldzifo4auesajw2">
+            <w:hyperlink w:history="1" r:id="rIdslb3xv3ih3rwpjpcbg2m9">
               <w:r>
                 <w:rPr>
                   <w:rFonts w:ascii="Calibri" w:cs="Calibri" w:eastAsia="Calibri" w:hAnsi="Calibri"/>
@@ -22457,7 +22457,7 @@
             <w:pPr>
               <w:spacing w:after="0"/>
             </w:pPr>
-            <w:hyperlink w:history="1" r:id="rIdk5bmivwgwd-tfofzm5f1m">
+            <w:hyperlink w:history="1" r:id="rIdligduuixw298ldixgvsvh">
               <w:r>
                 <w:rPr>
                   <w:rFonts w:ascii="Calibri" w:cs="Calibri" w:eastAsia="Calibri" w:hAnsi="Calibri"/>
@@ -22583,7 +22583,7 @@
             <w:pPr>
               <w:spacing w:after="0"/>
             </w:pPr>
-            <w:hyperlink w:history="1" r:id="rId_q9ndkmpevahihwonlaj0">
+            <w:hyperlink w:history="1" r:id="rIdfbaus0qktxngnahu9dbjh">
               <w:r>
                 <w:rPr>
                   <w:rFonts w:ascii="Calibri" w:cs="Calibri" w:eastAsia="Calibri" w:hAnsi="Calibri"/>
@@ -22709,7 +22709,7 @@
             <w:pPr>
               <w:spacing w:after="0"/>
             </w:pPr>
-            <w:hyperlink w:history="1" r:id="rIdd_job9oklsibvtq4bgpnj">
+            <w:hyperlink w:history="1" r:id="rId903uflf7nninx1fs0boyr">
               <w:r>
                 <w:rPr>
                   <w:rFonts w:ascii="Calibri" w:cs="Calibri" w:eastAsia="Calibri" w:hAnsi="Calibri"/>
@@ -22835,7 +22835,7 @@
             <w:pPr>
               <w:spacing w:after="0"/>
             </w:pPr>
-            <w:hyperlink w:history="1" r:id="rIdivnyraobpjw9f831pyqhk">
+            <w:hyperlink w:history="1" r:id="rIda5pltwzfcohr1nbcxwhh5">
               <w:r>
                 <w:rPr>
                   <w:rFonts w:ascii="Calibri" w:cs="Calibri" w:eastAsia="Calibri" w:hAnsi="Calibri"/>
@@ -22961,7 +22961,7 @@
             <w:pPr>
               <w:spacing w:after="0"/>
             </w:pPr>
-            <w:hyperlink w:history="1" r:id="rIdfvsd9zklyzky3hcmkfexa">
+            <w:hyperlink w:history="1" r:id="rId9mlbqmxqi1moiohn2y8rx">
               <w:r>
                 <w:rPr>
                   <w:rFonts w:ascii="Calibri" w:cs="Calibri" w:eastAsia="Calibri" w:hAnsi="Calibri"/>
@@ -23087,7 +23087,7 @@
             <w:pPr>
               <w:spacing w:after="0"/>
             </w:pPr>
-            <w:hyperlink w:history="1" r:id="rIdl34mqdrd5mktx-5zwq9cc">
+            <w:hyperlink w:history="1" r:id="rIdmtggvsoudksd-l004thuq">
               <w:r>
                 <w:rPr>
                   <w:rFonts w:ascii="Calibri" w:cs="Calibri" w:eastAsia="Calibri" w:hAnsi="Calibri"/>
@@ -23213,7 +23213,7 @@
             <w:pPr>
               <w:spacing w:after="0"/>
             </w:pPr>
-            <w:hyperlink w:history="1" r:id="rIdmg8dm3ao1noey_29fah6c">
+            <w:hyperlink w:history="1" r:id="rIdtfgonnxz1bauko-ycjeki">
               <w:r>
                 <w:rPr>
                   <w:rFonts w:ascii="Calibri" w:cs="Calibri" w:eastAsia="Calibri" w:hAnsi="Calibri"/>
@@ -23339,7 +23339,7 @@
             <w:pPr>
               <w:spacing w:after="0"/>
             </w:pPr>
-            <w:hyperlink w:history="1" r:id="rIdjg1nftzv8xb4d8p1hsqmq">
+            <w:hyperlink w:history="1" r:id="rIdyzazamzq7uuvnvuznbd8b">
               <w:r>
                 <w:rPr>
                   <w:rFonts w:ascii="Calibri" w:cs="Calibri" w:eastAsia="Calibri" w:hAnsi="Calibri"/>
@@ -23465,7 +23465,7 @@
             <w:pPr>
               <w:spacing w:after="0"/>
             </w:pPr>
-            <w:hyperlink w:history="1" r:id="rId2q0xemne8updqssl6b03w">
+            <w:hyperlink w:history="1" r:id="rIdkaig9atzr4z9ilq3wwa4b">
               <w:r>
                 <w:rPr>
                   <w:rFonts w:ascii="Calibri" w:cs="Calibri" w:eastAsia="Calibri" w:hAnsi="Calibri"/>
@@ -23591,7 +23591,7 @@
             <w:pPr>
               <w:spacing w:after="0"/>
             </w:pPr>
-            <w:hyperlink w:history="1" r:id="rIdjl3fw-s_ulmxm2neun_hv">
+            <w:hyperlink w:history="1" r:id="rIde0uz_4x1_jbwlbqypyzge">
               <w:r>
                 <w:rPr>
                   <w:rFonts w:ascii="Calibri" w:cs="Calibri" w:eastAsia="Calibri" w:hAnsi="Calibri"/>
@@ -23717,7 +23717,7 @@
             <w:pPr>
               <w:spacing w:after="0"/>
             </w:pPr>
-            <w:hyperlink w:history="1" r:id="rIdmrio5qp4veybzbwz9tump">
+            <w:hyperlink w:history="1" r:id="rIdn2-4mhqey3hkyiv3r7mq1">
               <w:r>
                 <w:rPr>
                   <w:rFonts w:ascii="Calibri" w:cs="Calibri" w:eastAsia="Calibri" w:hAnsi="Calibri"/>
@@ -23843,7 +23843,7 @@
             <w:pPr>
               <w:spacing w:after="0"/>
             </w:pPr>
-            <w:hyperlink w:history="1" r:id="rIdbhbasmg2rasgzmn52-6l1">
+            <w:hyperlink w:history="1" r:id="rId7cejssi87m_qwgvr35p_h">
               <w:r>
                 <w:rPr>
                   <w:rFonts w:ascii="Calibri" w:cs="Calibri" w:eastAsia="Calibri" w:hAnsi="Calibri"/>
@@ -23969,7 +23969,7 @@
             <w:pPr>
               <w:spacing w:after="0"/>
             </w:pPr>
-            <w:hyperlink w:history="1" r:id="rIdqgqc1h1gkv9vayckm6esb">
+            <w:hyperlink w:history="1" r:id="rIdsgxtfjmdvsmw4vjvx2opd">
               <w:r>
                 <w:rPr>
                   <w:rFonts w:ascii="Calibri" w:cs="Calibri" w:eastAsia="Calibri" w:hAnsi="Calibri"/>
@@ -24095,7 +24095,7 @@
             <w:pPr>
               <w:spacing w:after="0"/>
             </w:pPr>
-            <w:hyperlink w:history="1" r:id="rIdyne5wgh31abcborpul5fu">
+            <w:hyperlink w:history="1" r:id="rId0novmu-xxoolajhq9yvly">
               <w:r>
                 <w:rPr>
                   <w:rFonts w:ascii="Calibri" w:cs="Calibri" w:eastAsia="Calibri" w:hAnsi="Calibri"/>
@@ -24416,7 +24416,7 @@
             <w:pPr>
               <w:spacing w:after="0"/>
             </w:pPr>
-            <w:hyperlink w:history="1" r:id="rId3ke1muhkh7mk2bgach_fk">
+            <w:hyperlink w:history="1" r:id="rIdsccrkjrf1gjmbmu61n_7u">
               <w:r>
                 <w:rPr>
                   <w:rFonts w:ascii="Calibri" w:cs="Calibri" w:eastAsia="Calibri" w:hAnsi="Calibri"/>
@@ -24542,7 +24542,7 @@
             <w:pPr>
               <w:spacing w:after="0"/>
             </w:pPr>
-            <w:hyperlink w:history="1" r:id="rIdywqcxgvpnx-xz8gn7vt0b">
+            <w:hyperlink w:history="1" r:id="rIdll2egnm_aasltb0wa3nsl">
               <w:r>
                 <w:rPr>
                   <w:rFonts w:ascii="Calibri" w:cs="Calibri" w:eastAsia="Calibri" w:hAnsi="Calibri"/>
@@ -24668,7 +24668,7 @@
             <w:pPr>
               <w:spacing w:after="0"/>
             </w:pPr>
-            <w:hyperlink w:history="1" r:id="rIdvzox5ybbkxip9x19njc4y">
+            <w:hyperlink w:history="1" r:id="rIdzhlxddydwja04mo4bax-y">
               <w:r>
                 <w:rPr>
                   <w:rFonts w:ascii="Calibri" w:cs="Calibri" w:eastAsia="Calibri" w:hAnsi="Calibri"/>
@@ -24794,7 +24794,7 @@
             <w:pPr>
               <w:spacing w:after="0"/>
             </w:pPr>
-            <w:hyperlink w:history="1" r:id="rIdtxwqdf66-7lmi3iuzn4r6">
+            <w:hyperlink w:history="1" r:id="rId0xcbs4ysaaucjm88vsltf">
               <w:r>
                 <w:rPr>
                   <w:rFonts w:ascii="Calibri" w:cs="Calibri" w:eastAsia="Calibri" w:hAnsi="Calibri"/>
@@ -24920,7 +24920,7 @@
             <w:pPr>
               <w:spacing w:after="0"/>
             </w:pPr>
-            <w:hyperlink w:history="1" r:id="rIdsjw7jlsy8x9m0unpdg12-">
+            <w:hyperlink w:history="1" r:id="rIdokmwqwzpgdvvn87n8ksyq">
               <w:r>
                 <w:rPr>
                   <w:rFonts w:ascii="Calibri" w:cs="Calibri" w:eastAsia="Calibri" w:hAnsi="Calibri"/>
@@ -25046,7 +25046,7 @@
             <w:pPr>
               <w:spacing w:after="0"/>
             </w:pPr>
-            <w:hyperlink w:history="1" r:id="rIdirxpkj1g02d7jljp7lrfm">
+            <w:hyperlink w:history="1" r:id="rId6co24ad-pxsatrhzqzemo">
               <w:r>
                 <w:rPr>
                   <w:rFonts w:ascii="Calibri" w:cs="Calibri" w:eastAsia="Calibri" w:hAnsi="Calibri"/>
@@ -25172,7 +25172,7 @@
             <w:pPr>
               <w:spacing w:after="0"/>
             </w:pPr>
-            <w:hyperlink w:history="1" r:id="rIdusgfxo0q1n5vo6armabqa">
+            <w:hyperlink w:history="1" r:id="rIdabrsaj9mjn-08wuafmt7-">
               <w:r>
                 <w:rPr>
                   <w:rFonts w:ascii="Calibri" w:cs="Calibri" w:eastAsia="Calibri" w:hAnsi="Calibri"/>
@@ -25298,7 +25298,7 @@
             <w:pPr>
               <w:spacing w:after="0"/>
             </w:pPr>
-            <w:hyperlink w:history="1" r:id="rIdivmw09rfu25xzfifsjdki">
+            <w:hyperlink w:history="1" r:id="rIdwhsh91hpay6_oodaxfoyu">
               <w:r>
                 <w:rPr>
                   <w:rFonts w:ascii="Calibri" w:cs="Calibri" w:eastAsia="Calibri" w:hAnsi="Calibri"/>
@@ -25424,7 +25424,7 @@
             <w:pPr>
               <w:spacing w:after="0"/>
             </w:pPr>
-            <w:hyperlink w:history="1" r:id="rIdfq_fxr0ydpnc_wnwcsbz5">
+            <w:hyperlink w:history="1" r:id="rIdrfvdvg1nazr5xpxaf-hmv">
               <w:r>
                 <w:rPr>
                   <w:rFonts w:ascii="Calibri" w:cs="Calibri" w:eastAsia="Calibri" w:hAnsi="Calibri"/>
@@ -25550,7 +25550,7 @@
             <w:pPr>
               <w:spacing w:after="0"/>
             </w:pPr>
-            <w:hyperlink w:history="1" r:id="rIdbo4hl25snoicrgcmkvewf">
+            <w:hyperlink w:history="1" r:id="rIdycrugdtszuqjzqg-4zerh">
               <w:r>
                 <w:rPr>
                   <w:rFonts w:ascii="Calibri" w:cs="Calibri" w:eastAsia="Calibri" w:hAnsi="Calibri"/>
@@ -25676,7 +25676,7 @@
             <w:pPr>
               <w:spacing w:after="0"/>
             </w:pPr>
-            <w:hyperlink w:history="1" r:id="rId4zlm__9xfjtucxw_z_2ic">
+            <w:hyperlink w:history="1" r:id="rIdcqmgcgjn2pawuxlwbeynx">
               <w:r>
                 <w:rPr>
                   <w:rFonts w:ascii="Calibri" w:cs="Calibri" w:eastAsia="Calibri" w:hAnsi="Calibri"/>
@@ -25802,7 +25802,7 @@
             <w:pPr>
               <w:spacing w:after="0"/>
             </w:pPr>
-            <w:hyperlink w:history="1" r:id="rIdtnvy-at5p83-dohrmezqp">
+            <w:hyperlink w:history="1" r:id="rIdxryzumbjotgbwszixhzxi">
               <w:r>
                 <w:rPr>
                   <w:rFonts w:ascii="Calibri" w:cs="Calibri" w:eastAsia="Calibri" w:hAnsi="Calibri"/>
@@ -25928,7 +25928,7 @@
             <w:pPr>
               <w:spacing w:after="0"/>
             </w:pPr>
-            <w:hyperlink w:history="1" r:id="rIdrnashuta3dhf3e8methbt">
+            <w:hyperlink w:history="1" r:id="rIdurahweyag4rmdkr9ympv_">
               <w:r>
                 <w:rPr>
                   <w:rFonts w:ascii="Calibri" w:cs="Calibri" w:eastAsia="Calibri" w:hAnsi="Calibri"/>
@@ -26054,7 +26054,7 @@
             <w:pPr>
               <w:spacing w:after="0"/>
             </w:pPr>
-            <w:hyperlink w:history="1" r:id="rIdpsjtduznwwbmlials3m8y">
+            <w:hyperlink w:history="1" r:id="rIdw6tc5jysmmsvzqowdsqge">
               <w:r>
                 <w:rPr>
                   <w:rFonts w:ascii="Calibri" w:cs="Calibri" w:eastAsia="Calibri" w:hAnsi="Calibri"/>
@@ -26180,7 +26180,7 @@
             <w:pPr>
               <w:spacing w:after="0"/>
             </w:pPr>
-            <w:hyperlink w:history="1" r:id="rIdxixfthei0aipc1grnpumv">
+            <w:hyperlink w:history="1" r:id="rId-hlrfv_aphjllttha5adk">
               <w:r>
                 <w:rPr>
                   <w:rFonts w:ascii="Calibri" w:cs="Calibri" w:eastAsia="Calibri" w:hAnsi="Calibri"/>
@@ -26306,7 +26306,7 @@
             <w:pPr>
               <w:spacing w:after="0"/>
             </w:pPr>
-            <w:hyperlink w:history="1" r:id="rIdwmoqtxetes4uq6j6mfvo4">
+            <w:hyperlink w:history="1" r:id="rIdll9nyiohvc_oj8a0ziapn">
               <w:r>
                 <w:rPr>
                   <w:rFonts w:ascii="Calibri" w:cs="Calibri" w:eastAsia="Calibri" w:hAnsi="Calibri"/>
@@ -26432,7 +26432,7 @@
             <w:pPr>
               <w:spacing w:after="0"/>
             </w:pPr>
-            <w:hyperlink w:history="1" r:id="rIdw9cj9akzrycovtkkttys1">
+            <w:hyperlink w:history="1" r:id="rIduaxpoywbflvzoxnbu9y19">
               <w:r>
                 <w:rPr>
                   <w:rFonts w:ascii="Calibri" w:cs="Calibri" w:eastAsia="Calibri" w:hAnsi="Calibri"/>
@@ -26558,7 +26558,7 @@
             <w:pPr>
               <w:spacing w:after="0"/>
             </w:pPr>
-            <w:hyperlink w:history="1" r:id="rIdh5pupm84e1oi31g7khe6q">
+            <w:hyperlink w:history="1" r:id="rIdcocjne2gdkejdse6qlqat">
               <w:r>
                 <w:rPr>
                   <w:rFonts w:ascii="Calibri" w:cs="Calibri" w:eastAsia="Calibri" w:hAnsi="Calibri"/>
@@ -26684,7 +26684,7 @@
             <w:pPr>
               <w:spacing w:after="0"/>
             </w:pPr>
-            <w:hyperlink w:history="1" r:id="rIdc7smamxjqvycty5jfwxev">
+            <w:hyperlink w:history="1" r:id="rIdvfuhxb3x26s77mut-9uij">
               <w:r>
                 <w:rPr>
                   <w:rFonts w:ascii="Calibri" w:cs="Calibri" w:eastAsia="Calibri" w:hAnsi="Calibri"/>
@@ -26810,7 +26810,7 @@
             <w:pPr>
               <w:spacing w:after="0"/>
             </w:pPr>
-            <w:hyperlink w:history="1" r:id="rIdyddbsrw_xb3urmxq1hdqu">
+            <w:hyperlink w:history="1" r:id="rIdci-syco6h36u_m6lfbmxw">
               <w:r>
                 <w:rPr>
                   <w:rFonts w:ascii="Calibri" w:cs="Calibri" w:eastAsia="Calibri" w:hAnsi="Calibri"/>
@@ -26936,7 +26936,7 @@
             <w:pPr>
               <w:spacing w:after="0"/>
             </w:pPr>
-            <w:hyperlink w:history="1" r:id="rIdaol-3qwyytbv5armim3l0">
+            <w:hyperlink w:history="1" r:id="rIdu86nbwjsj_7qd9ot1q93d">
               <w:r>
                 <w:rPr>
                   <w:rFonts w:ascii="Calibri" w:cs="Calibri" w:eastAsia="Calibri" w:hAnsi="Calibri"/>
@@ -27062,7 +27062,7 @@
             <w:pPr>
               <w:spacing w:after="0"/>
             </w:pPr>
-            <w:hyperlink w:history="1" r:id="rIda0mkgnic7uuquamtrzie2">
+            <w:hyperlink w:history="1" r:id="rIdiutw5irurvlplglvrv-ag">
               <w:r>
                 <w:rPr>
                   <w:rFonts w:ascii="Calibri" w:cs="Calibri" w:eastAsia="Calibri" w:hAnsi="Calibri"/>
@@ -27188,7 +27188,7 @@
             <w:pPr>
               <w:spacing w:after="0"/>
             </w:pPr>
-            <w:hyperlink w:history="1" r:id="rIdu9zpd9eoj0gzuuutqccdu">
+            <w:hyperlink w:history="1" r:id="rIdymwjnfu9pftzd2naexqlw">
               <w:r>
                 <w:rPr>
                   <w:rFonts w:ascii="Calibri" w:cs="Calibri" w:eastAsia="Calibri" w:hAnsi="Calibri"/>

</xml_diff>